<commit_message>
Add controlled architecture and learning-rate comparisons to Q3 paper
</commit_message>
<xml_diff>
--- a/问题三/paper/问题三_不确定性融合论文.docx
+++ b/问题三/paper/问题三_不确定性融合论文.docx
@@ -43,7 +43,7 @@
     </w:p>
     <w:p>
       <w:r>
-        <w:t>在结果检验方面，附件二验证集准确率为65.11%、Macro-F1为0.6323、强度MAE为0.5397；测试集相应为68.64%、0.6493和0.6006。与SELF-MM和TETFN的比赛适配基线比较，主模型在测试分类指标与原生解释能力之间取得较好的折中，但并非所有指标均占优。验证集主要错误集中在中性与正向之间，说明弱情感边界仍是模型改进重点。</w:t>
+        <w:t>在结果检验方面，附件二验证集准确率为65.11%、Macro-F1为0.6323、强度MAE为0.5397；测试集相应为68.64%、0.6493和0.6006。与SELF-MM和TETFN的比赛适配基线比较，主模型在测试分类指标与原生解释能力之间取得较好的折中，但并非所有指标均占优。补充原生结构对照和学习率成组试验表明，组合模块和增大学习率未必改善验证结果。验证集主要错误集中在中性与正向之间，说明弱情感边界仍是模型改进重点。</w:t>
       </w:r>
     </w:p>
     <w:p>
@@ -8451,7 +8451,2208 @@
         <w:pStyle w:val="Heading2"/>
       </w:pPr>
       <w:r>
-        <w:t>6.3 验证集错误归因</w:t>
+        <w:t>6.3 原生结构对照与性能取舍</w:t>
+      </w:r>
+    </w:p>
+    <w:p>
+      <w:r>
+        <w:t>在开源基线之外，补充原生骨干上“有序分类头”和“不确定性融合”两个模块的四格对照。四种设置均采用种子17、最多20轮、早停耐心4轮，以及相同的BERT学习率、其他层学习率、模态丢弃率和联合监督基础权重；各自按验证Macro-F1选择轮次和决策策略。有序分类头指可学习的累计阈值输出，与四种设置均保留的强度有序辅助损失不同。</w:t>
+      </w:r>
+    </w:p>
+    <w:p>
+      <w:pPr>
+        <w:pStyle w:val="Caption"/>
+        <w:keepNext/>
+      </w:pPr>
+      <w:r>
+        <w:t>表8　原生骨干的四种结构设置在验证集上的对照</w:t>
+      </w:r>
+    </w:p>
+    <w:tbl>
+      <w:tblPr>
+        <w:tblW w:type="auto" w:w="0"/>
+        <w:jc w:val="center"/>
+        <w:tblLayout w:type="fixed"/>
+        <w:tblLook w:firstColumn="1" w:firstRow="1" w:lastColumn="0" w:lastRow="0" w:noHBand="0" w:noVBand="1" w:val="04A0"/>
+        <w:tblBorders>
+          <w:top w:val="single" w:sz="10" w:color="000000"/>
+          <w:left w:val="nil" w:sz="10" w:color="000000"/>
+          <w:bottom w:val="single" w:sz="10" w:color="000000"/>
+          <w:right w:val="nil" w:sz="10" w:color="000000"/>
+          <w:insideH w:val="nil" w:sz="10" w:color="000000"/>
+          <w:insideV w:val="nil" w:sz="10" w:color="000000"/>
+        </w:tblBorders>
+      </w:tblPr>
+      <w:tblGrid>
+        <w:gridCol w:w="2353"/>
+        <w:gridCol w:w="918"/>
+        <w:gridCol w:w="1090"/>
+        <w:gridCol w:w="803"/>
+        <w:gridCol w:w="1263"/>
+        <w:gridCol w:w="1607"/>
+        <w:gridCol w:w="1263"/>
+      </w:tblGrid>
+      <w:tr>
+        <w:trPr>
+          <w:tblHeader/>
+          <w:cantSplit/>
+        </w:trPr>
+        <w:tc>
+          <w:tcPr>
+            <w:tcW w:type="dxa" w:w="2353"/>
+            <w:vAlign w:val="center"/>
+            <w:tcBorders>
+              <w:bottom w:val="single" w:sz="6"/>
+            </w:tcBorders>
+          </w:tcPr>
+          <w:p>
+            <w:pPr>
+              <w:keepNext/>
+              <w:spacing w:after="60" w:before="60" w:line="240" w:lineRule="auto"/>
+              <w:ind w:firstLine="0"/>
+              <w:jc w:val="center"/>
+            </w:pPr>
+            <w:r>
+              <w:rPr>
+                <w:b/>
+                <w:sz w:val="21"/>
+              </w:rPr>
+              <w:t>结构设置</w:t>
+            </w:r>
+          </w:p>
+        </w:tc>
+        <w:tc>
+          <w:tcPr>
+            <w:tcW w:type="dxa" w:w="918"/>
+            <w:vAlign w:val="center"/>
+            <w:tcBorders>
+              <w:bottom w:val="single" w:sz="6"/>
+            </w:tcBorders>
+          </w:tcPr>
+          <w:p>
+            <w:pPr>
+              <w:keepNext/>
+              <w:spacing w:after="60" w:before="60" w:line="240" w:lineRule="auto"/>
+              <w:ind w:firstLine="0"/>
+              <w:jc w:val="center"/>
+            </w:pPr>
+            <w:r>
+              <w:rPr>
+                <w:b/>
+                <w:sz w:val="21"/>
+              </w:rPr>
+              <w:t>有序头</w:t>
+            </w:r>
+          </w:p>
+        </w:tc>
+        <w:tc>
+          <w:tcPr>
+            <w:tcW w:type="dxa" w:w="1090"/>
+            <w:vAlign w:val="center"/>
+            <w:tcBorders>
+              <w:bottom w:val="single" w:sz="6"/>
+            </w:tcBorders>
+          </w:tcPr>
+          <w:p>
+            <w:pPr>
+              <w:keepNext/>
+              <w:spacing w:after="60" w:before="60" w:line="240" w:lineRule="auto"/>
+              <w:ind w:firstLine="0"/>
+              <w:jc w:val="center"/>
+            </w:pPr>
+            <w:r>
+              <w:rPr>
+                <w:b/>
+                <w:sz w:val="21"/>
+              </w:rPr>
+              <w:t>不确定性</w:t>
+            </w:r>
+          </w:p>
+        </w:tc>
+        <w:tc>
+          <w:tcPr>
+            <w:tcW w:type="dxa" w:w="803"/>
+            <w:vAlign w:val="center"/>
+            <w:tcBorders>
+              <w:bottom w:val="single" w:sz="6"/>
+            </w:tcBorders>
+          </w:tcPr>
+          <w:p>
+            <w:pPr>
+              <w:keepNext/>
+              <w:spacing w:after="60" w:before="60" w:line="240" w:lineRule="auto"/>
+              <w:ind w:firstLine="0"/>
+              <w:jc w:val="center"/>
+            </w:pPr>
+            <w:r>
+              <w:rPr>
+                <w:b/>
+                <w:sz w:val="21"/>
+              </w:rPr>
+              <w:t>轮次</w:t>
+            </w:r>
+          </w:p>
+        </w:tc>
+        <w:tc>
+          <w:tcPr>
+            <w:tcW w:type="dxa" w:w="1263"/>
+            <w:vAlign w:val="center"/>
+            <w:tcBorders>
+              <w:bottom w:val="single" w:sz="6"/>
+            </w:tcBorders>
+          </w:tcPr>
+          <w:p>
+            <w:pPr>
+              <w:keepNext/>
+              <w:spacing w:after="60" w:before="60" w:line="240" w:lineRule="auto"/>
+              <w:ind w:firstLine="0"/>
+              <w:jc w:val="center"/>
+            </w:pPr>
+            <w:r>
+              <w:rPr>
+                <w:b/>
+                <w:sz w:val="21"/>
+              </w:rPr>
+              <w:t>Acc(%)</w:t>
+            </w:r>
+          </w:p>
+        </w:tc>
+        <w:tc>
+          <w:tcPr>
+            <w:tcW w:type="dxa" w:w="1607"/>
+            <w:vAlign w:val="center"/>
+            <w:tcBorders>
+              <w:bottom w:val="single" w:sz="6"/>
+            </w:tcBorders>
+          </w:tcPr>
+          <w:p>
+            <w:pPr>
+              <w:keepNext/>
+              <w:spacing w:after="60" w:before="60" w:line="240" w:lineRule="auto"/>
+              <w:ind w:firstLine="0"/>
+              <w:jc w:val="center"/>
+            </w:pPr>
+            <w:r>
+              <w:rPr>
+                <w:b/>
+                <w:sz w:val="21"/>
+              </w:rPr>
+              <w:t>Macro-F1</w:t>
+            </w:r>
+          </w:p>
+        </w:tc>
+        <w:tc>
+          <w:tcPr>
+            <w:tcW w:type="dxa" w:w="1263"/>
+            <w:vAlign w:val="center"/>
+            <w:tcBorders>
+              <w:bottom w:val="single" w:sz="6"/>
+            </w:tcBorders>
+          </w:tcPr>
+          <w:p>
+            <w:pPr>
+              <w:keepNext/>
+              <w:spacing w:after="60" w:before="60" w:line="240" w:lineRule="auto"/>
+              <w:ind w:firstLine="0"/>
+              <w:jc w:val="center"/>
+            </w:pPr>
+            <w:r>
+              <w:rPr>
+                <w:b/>
+                <w:sz w:val="21"/>
+              </w:rPr>
+              <w:t>MAE</w:t>
+            </w:r>
+          </w:p>
+        </w:tc>
+      </w:tr>
+      <w:tr>
+        <w:trPr>
+          <w:cantSplit/>
+        </w:trPr>
+        <w:tc>
+          <w:tcPr>
+            <w:tcW w:type="dxa" w:w="2353"/>
+            <w:vAlign w:val="center"/>
+          </w:tcPr>
+          <w:p>
+            <w:pPr>
+              <w:keepNext/>
+              <w:spacing w:after="60" w:before="60" w:line="240" w:lineRule="auto"/>
+              <w:ind w:firstLine="0"/>
+              <w:jc w:val="center"/>
+            </w:pPr>
+            <w:r>
+              <w:rPr>
+                <w:b w:val="0"/>
+                <w:sz w:val="21"/>
+              </w:rPr>
+              <w:t>联合监督基础</w:t>
+            </w:r>
+          </w:p>
+        </w:tc>
+        <w:tc>
+          <w:tcPr>
+            <w:tcW w:type="dxa" w:w="918"/>
+            <w:vAlign w:val="center"/>
+          </w:tcPr>
+          <w:p>
+            <w:pPr>
+              <w:keepNext/>
+              <w:spacing w:after="60" w:before="60" w:line="240" w:lineRule="auto"/>
+              <w:ind w:firstLine="0"/>
+              <w:jc w:val="center"/>
+            </w:pPr>
+            <w:r>
+              <w:rPr>
+                <w:b w:val="0"/>
+                <w:sz w:val="21"/>
+              </w:rPr>
+              <w:t>关</w:t>
+            </w:r>
+          </w:p>
+        </w:tc>
+        <w:tc>
+          <w:tcPr>
+            <w:tcW w:type="dxa" w:w="1090"/>
+            <w:vAlign w:val="center"/>
+          </w:tcPr>
+          <w:p>
+            <w:pPr>
+              <w:keepNext/>
+              <w:spacing w:after="60" w:before="60" w:line="240" w:lineRule="auto"/>
+              <w:ind w:firstLine="0"/>
+              <w:jc w:val="center"/>
+            </w:pPr>
+            <w:r>
+              <w:rPr>
+                <w:b w:val="0"/>
+                <w:sz w:val="21"/>
+              </w:rPr>
+              <w:t>关</w:t>
+            </w:r>
+          </w:p>
+        </w:tc>
+        <w:tc>
+          <w:tcPr>
+            <w:tcW w:type="dxa" w:w="803"/>
+            <w:vAlign w:val="center"/>
+          </w:tcPr>
+          <w:p>
+            <w:pPr>
+              <w:keepNext/>
+              <w:spacing w:after="60" w:before="60" w:line="240" w:lineRule="auto"/>
+              <w:ind w:firstLine="0"/>
+              <w:jc w:val="center"/>
+            </w:pPr>
+            <w:r>
+              <w:rPr>
+                <w:b w:val="0"/>
+                <w:sz w:val="21"/>
+              </w:rPr>
+              <w:t>11</w:t>
+            </w:r>
+          </w:p>
+        </w:tc>
+        <w:tc>
+          <w:tcPr>
+            <w:tcW w:type="dxa" w:w="1263"/>
+            <w:vAlign w:val="center"/>
+          </w:tcPr>
+          <w:p>
+            <w:pPr>
+              <w:keepNext/>
+              <w:spacing w:after="60" w:before="60" w:line="240" w:lineRule="auto"/>
+              <w:ind w:firstLine="0"/>
+              <w:jc w:val="center"/>
+            </w:pPr>
+            <w:r>
+              <w:rPr>
+                <w:b w:val="0"/>
+                <w:sz w:val="21"/>
+              </w:rPr>
+              <w:t>65.25</w:t>
+            </w:r>
+          </w:p>
+        </w:tc>
+        <w:tc>
+          <w:tcPr>
+            <w:tcW w:type="dxa" w:w="1607"/>
+            <w:vAlign w:val="center"/>
+          </w:tcPr>
+          <w:p>
+            <w:pPr>
+              <w:keepNext/>
+              <w:spacing w:after="60" w:before="60" w:line="240" w:lineRule="auto"/>
+              <w:ind w:firstLine="0"/>
+              <w:jc w:val="center"/>
+            </w:pPr>
+            <w:r>
+              <w:rPr>
+                <w:b w:val="0"/>
+                <w:sz w:val="21"/>
+              </w:rPr>
+              <w:t>0.6412</w:t>
+            </w:r>
+          </w:p>
+        </w:tc>
+        <w:tc>
+          <w:tcPr>
+            <w:tcW w:type="dxa" w:w="1263"/>
+            <w:vAlign w:val="center"/>
+          </w:tcPr>
+          <w:p>
+            <w:pPr>
+              <w:keepNext/>
+              <w:spacing w:after="60" w:before="60" w:line="240" w:lineRule="auto"/>
+              <w:ind w:firstLine="0"/>
+              <w:jc w:val="center"/>
+            </w:pPr>
+            <w:r>
+              <w:rPr>
+                <w:b w:val="0"/>
+                <w:sz w:val="21"/>
+              </w:rPr>
+              <w:t>0.5578</w:t>
+            </w:r>
+          </w:p>
+        </w:tc>
+      </w:tr>
+      <w:tr>
+        <w:trPr>
+          <w:cantSplit/>
+        </w:trPr>
+        <w:tc>
+          <w:tcPr>
+            <w:tcW w:type="dxa" w:w="2353"/>
+            <w:vAlign w:val="center"/>
+          </w:tcPr>
+          <w:p>
+            <w:pPr>
+              <w:keepNext/>
+              <w:spacing w:after="60" w:before="60" w:line="240" w:lineRule="auto"/>
+              <w:ind w:firstLine="0"/>
+              <w:jc w:val="center"/>
+            </w:pPr>
+            <w:r>
+              <w:rPr>
+                <w:b w:val="0"/>
+                <w:sz w:val="21"/>
+              </w:rPr>
+              <w:t>仅有序分类头</w:t>
+            </w:r>
+          </w:p>
+        </w:tc>
+        <w:tc>
+          <w:tcPr>
+            <w:tcW w:type="dxa" w:w="918"/>
+            <w:vAlign w:val="center"/>
+          </w:tcPr>
+          <w:p>
+            <w:pPr>
+              <w:keepNext/>
+              <w:spacing w:after="60" w:before="60" w:line="240" w:lineRule="auto"/>
+              <w:ind w:firstLine="0"/>
+              <w:jc w:val="center"/>
+            </w:pPr>
+            <w:r>
+              <w:rPr>
+                <w:b w:val="0"/>
+                <w:sz w:val="21"/>
+              </w:rPr>
+              <w:t>开</w:t>
+            </w:r>
+          </w:p>
+        </w:tc>
+        <w:tc>
+          <w:tcPr>
+            <w:tcW w:type="dxa" w:w="1090"/>
+            <w:vAlign w:val="center"/>
+          </w:tcPr>
+          <w:p>
+            <w:pPr>
+              <w:keepNext/>
+              <w:spacing w:after="60" w:before="60" w:line="240" w:lineRule="auto"/>
+              <w:ind w:firstLine="0"/>
+              <w:jc w:val="center"/>
+            </w:pPr>
+            <w:r>
+              <w:rPr>
+                <w:b w:val="0"/>
+                <w:sz w:val="21"/>
+              </w:rPr>
+              <w:t>关</w:t>
+            </w:r>
+          </w:p>
+        </w:tc>
+        <w:tc>
+          <w:tcPr>
+            <w:tcW w:type="dxa" w:w="803"/>
+            <w:vAlign w:val="center"/>
+          </w:tcPr>
+          <w:p>
+            <w:pPr>
+              <w:keepNext/>
+              <w:spacing w:after="60" w:before="60" w:line="240" w:lineRule="auto"/>
+              <w:ind w:firstLine="0"/>
+              <w:jc w:val="center"/>
+            </w:pPr>
+            <w:r>
+              <w:rPr>
+                <w:b w:val="0"/>
+                <w:sz w:val="21"/>
+              </w:rPr>
+              <w:t>1</w:t>
+            </w:r>
+          </w:p>
+        </w:tc>
+        <w:tc>
+          <w:tcPr>
+            <w:tcW w:type="dxa" w:w="1263"/>
+            <w:vAlign w:val="center"/>
+          </w:tcPr>
+          <w:p>
+            <w:pPr>
+              <w:keepNext/>
+              <w:spacing w:after="60" w:before="60" w:line="240" w:lineRule="auto"/>
+              <w:ind w:firstLine="0"/>
+              <w:jc w:val="center"/>
+            </w:pPr>
+            <w:r>
+              <w:rPr>
+                <w:b w:val="0"/>
+                <w:sz w:val="21"/>
+              </w:rPr>
+              <w:t>63.46</w:t>
+            </w:r>
+          </w:p>
+        </w:tc>
+        <w:tc>
+          <w:tcPr>
+            <w:tcW w:type="dxa" w:w="1607"/>
+            <w:vAlign w:val="center"/>
+          </w:tcPr>
+          <w:p>
+            <w:pPr>
+              <w:keepNext/>
+              <w:spacing w:after="60" w:before="60" w:line="240" w:lineRule="auto"/>
+              <w:ind w:firstLine="0"/>
+              <w:jc w:val="center"/>
+            </w:pPr>
+            <w:r>
+              <w:rPr>
+                <w:b w:val="0"/>
+                <w:sz w:val="21"/>
+              </w:rPr>
+              <w:t>0.6230</w:t>
+            </w:r>
+          </w:p>
+        </w:tc>
+        <w:tc>
+          <w:tcPr>
+            <w:tcW w:type="dxa" w:w="1263"/>
+            <w:vAlign w:val="center"/>
+          </w:tcPr>
+          <w:p>
+            <w:pPr>
+              <w:keepNext/>
+              <w:spacing w:after="60" w:before="60" w:line="240" w:lineRule="auto"/>
+              <w:ind w:firstLine="0"/>
+              <w:jc w:val="center"/>
+            </w:pPr>
+            <w:r>
+              <w:rPr>
+                <w:b w:val="0"/>
+                <w:sz w:val="21"/>
+              </w:rPr>
+              <w:t>0.5706</w:t>
+            </w:r>
+          </w:p>
+        </w:tc>
+      </w:tr>
+      <w:tr>
+        <w:trPr>
+          <w:cantSplit/>
+        </w:trPr>
+        <w:tc>
+          <w:tcPr>
+            <w:tcW w:type="dxa" w:w="2353"/>
+            <w:vAlign w:val="center"/>
+          </w:tcPr>
+          <w:p>
+            <w:pPr>
+              <w:keepNext/>
+              <w:spacing w:after="60" w:before="60" w:line="240" w:lineRule="auto"/>
+              <w:ind w:firstLine="0"/>
+              <w:jc w:val="center"/>
+            </w:pPr>
+            <w:r>
+              <w:rPr>
+                <w:b w:val="0"/>
+                <w:sz w:val="21"/>
+              </w:rPr>
+              <w:t>有序头＋不确定性</w:t>
+            </w:r>
+          </w:p>
+        </w:tc>
+        <w:tc>
+          <w:tcPr>
+            <w:tcW w:type="dxa" w:w="918"/>
+            <w:vAlign w:val="center"/>
+          </w:tcPr>
+          <w:p>
+            <w:pPr>
+              <w:keepNext/>
+              <w:spacing w:after="60" w:before="60" w:line="240" w:lineRule="auto"/>
+              <w:ind w:firstLine="0"/>
+              <w:jc w:val="center"/>
+            </w:pPr>
+            <w:r>
+              <w:rPr>
+                <w:b w:val="0"/>
+                <w:sz w:val="21"/>
+              </w:rPr>
+              <w:t>开</w:t>
+            </w:r>
+          </w:p>
+        </w:tc>
+        <w:tc>
+          <w:tcPr>
+            <w:tcW w:type="dxa" w:w="1090"/>
+            <w:vAlign w:val="center"/>
+          </w:tcPr>
+          <w:p>
+            <w:pPr>
+              <w:keepNext/>
+              <w:spacing w:after="60" w:before="60" w:line="240" w:lineRule="auto"/>
+              <w:ind w:firstLine="0"/>
+              <w:jc w:val="center"/>
+            </w:pPr>
+            <w:r>
+              <w:rPr>
+                <w:b w:val="0"/>
+                <w:sz w:val="21"/>
+              </w:rPr>
+              <w:t>开</w:t>
+            </w:r>
+          </w:p>
+        </w:tc>
+        <w:tc>
+          <w:tcPr>
+            <w:tcW w:type="dxa" w:w="803"/>
+            <w:vAlign w:val="center"/>
+          </w:tcPr>
+          <w:p>
+            <w:pPr>
+              <w:keepNext/>
+              <w:spacing w:after="60" w:before="60" w:line="240" w:lineRule="auto"/>
+              <w:ind w:firstLine="0"/>
+              <w:jc w:val="center"/>
+            </w:pPr>
+            <w:r>
+              <w:rPr>
+                <w:b w:val="0"/>
+                <w:sz w:val="21"/>
+              </w:rPr>
+              <w:t>3</w:t>
+            </w:r>
+          </w:p>
+        </w:tc>
+        <w:tc>
+          <w:tcPr>
+            <w:tcW w:type="dxa" w:w="1263"/>
+            <w:vAlign w:val="center"/>
+          </w:tcPr>
+          <w:p>
+            <w:pPr>
+              <w:keepNext/>
+              <w:spacing w:after="60" w:before="60" w:line="240" w:lineRule="auto"/>
+              <w:ind w:firstLine="0"/>
+              <w:jc w:val="center"/>
+            </w:pPr>
+            <w:r>
+              <w:rPr>
+                <w:b w:val="0"/>
+                <w:sz w:val="21"/>
+              </w:rPr>
+              <w:t>63.74</w:t>
+            </w:r>
+          </w:p>
+        </w:tc>
+        <w:tc>
+          <w:tcPr>
+            <w:tcW w:type="dxa" w:w="1607"/>
+            <w:vAlign w:val="center"/>
+          </w:tcPr>
+          <w:p>
+            <w:pPr>
+              <w:keepNext/>
+              <w:spacing w:after="60" w:before="60" w:line="240" w:lineRule="auto"/>
+              <w:ind w:firstLine="0"/>
+              <w:jc w:val="center"/>
+            </w:pPr>
+            <w:r>
+              <w:rPr>
+                <w:b w:val="0"/>
+                <w:sz w:val="21"/>
+              </w:rPr>
+              <w:t>0.6165</w:t>
+            </w:r>
+          </w:p>
+        </w:tc>
+        <w:tc>
+          <w:tcPr>
+            <w:tcW w:type="dxa" w:w="1263"/>
+            <w:vAlign w:val="center"/>
+          </w:tcPr>
+          <w:p>
+            <w:pPr>
+              <w:keepNext/>
+              <w:spacing w:after="60" w:before="60" w:line="240" w:lineRule="auto"/>
+              <w:ind w:firstLine="0"/>
+              <w:jc w:val="center"/>
+            </w:pPr>
+            <w:r>
+              <w:rPr>
+                <w:b w:val="0"/>
+                <w:sz w:val="21"/>
+              </w:rPr>
+              <w:t>0.5688</w:t>
+            </w:r>
+          </w:p>
+        </w:tc>
+      </w:tr>
+      <w:tr>
+        <w:trPr>
+          <w:cantSplit/>
+        </w:trPr>
+        <w:tc>
+          <w:tcPr>
+            <w:tcW w:type="dxa" w:w="2353"/>
+            <w:vAlign w:val="center"/>
+          </w:tcPr>
+          <w:p>
+            <w:pPr>
+              <w:keepNext w:val="0"/>
+              <w:spacing w:after="60" w:before="60" w:line="240" w:lineRule="auto"/>
+              <w:ind w:firstLine="0"/>
+              <w:jc w:val="center"/>
+            </w:pPr>
+            <w:r>
+              <w:rPr>
+                <w:b w:val="0"/>
+                <w:sz w:val="21"/>
+              </w:rPr>
+              <w:t>不确定性融合（主）</w:t>
+            </w:r>
+          </w:p>
+        </w:tc>
+        <w:tc>
+          <w:tcPr>
+            <w:tcW w:type="dxa" w:w="918"/>
+            <w:vAlign w:val="center"/>
+          </w:tcPr>
+          <w:p>
+            <w:pPr>
+              <w:keepNext w:val="0"/>
+              <w:spacing w:after="60" w:before="60" w:line="240" w:lineRule="auto"/>
+              <w:ind w:firstLine="0"/>
+              <w:jc w:val="center"/>
+            </w:pPr>
+            <w:r>
+              <w:rPr>
+                <w:b w:val="0"/>
+                <w:sz w:val="21"/>
+              </w:rPr>
+              <w:t>关</w:t>
+            </w:r>
+          </w:p>
+        </w:tc>
+        <w:tc>
+          <w:tcPr>
+            <w:tcW w:type="dxa" w:w="1090"/>
+            <w:vAlign w:val="center"/>
+          </w:tcPr>
+          <w:p>
+            <w:pPr>
+              <w:keepNext w:val="0"/>
+              <w:spacing w:after="60" w:before="60" w:line="240" w:lineRule="auto"/>
+              <w:ind w:firstLine="0"/>
+              <w:jc w:val="center"/>
+            </w:pPr>
+            <w:r>
+              <w:rPr>
+                <w:b w:val="0"/>
+                <w:sz w:val="21"/>
+              </w:rPr>
+              <w:t>开</w:t>
+            </w:r>
+          </w:p>
+        </w:tc>
+        <w:tc>
+          <w:tcPr>
+            <w:tcW w:type="dxa" w:w="803"/>
+            <w:vAlign w:val="center"/>
+          </w:tcPr>
+          <w:p>
+            <w:pPr>
+              <w:keepNext w:val="0"/>
+              <w:spacing w:after="60" w:before="60" w:line="240" w:lineRule="auto"/>
+              <w:ind w:firstLine="0"/>
+              <w:jc w:val="center"/>
+            </w:pPr>
+            <w:r>
+              <w:rPr>
+                <w:b w:val="0"/>
+                <w:sz w:val="21"/>
+              </w:rPr>
+              <w:t>5</w:t>
+            </w:r>
+          </w:p>
+        </w:tc>
+        <w:tc>
+          <w:tcPr>
+            <w:tcW w:type="dxa" w:w="1263"/>
+            <w:vAlign w:val="center"/>
+          </w:tcPr>
+          <w:p>
+            <w:pPr>
+              <w:keepNext w:val="0"/>
+              <w:spacing w:after="60" w:before="60" w:line="240" w:lineRule="auto"/>
+              <w:ind w:firstLine="0"/>
+              <w:jc w:val="center"/>
+            </w:pPr>
+            <w:r>
+              <w:rPr>
+                <w:b w:val="0"/>
+                <w:sz w:val="21"/>
+              </w:rPr>
+              <w:t>65.11</w:t>
+            </w:r>
+          </w:p>
+        </w:tc>
+        <w:tc>
+          <w:tcPr>
+            <w:tcW w:type="dxa" w:w="1607"/>
+            <w:vAlign w:val="center"/>
+          </w:tcPr>
+          <w:p>
+            <w:pPr>
+              <w:keepNext w:val="0"/>
+              <w:spacing w:after="60" w:before="60" w:line="240" w:lineRule="auto"/>
+              <w:ind w:firstLine="0"/>
+              <w:jc w:val="center"/>
+            </w:pPr>
+            <w:r>
+              <w:rPr>
+                <w:b w:val="0"/>
+                <w:sz w:val="21"/>
+              </w:rPr>
+              <w:t>0.6323</w:t>
+            </w:r>
+          </w:p>
+        </w:tc>
+        <w:tc>
+          <w:tcPr>
+            <w:tcW w:type="dxa" w:w="1263"/>
+            <w:vAlign w:val="center"/>
+          </w:tcPr>
+          <w:p>
+            <w:pPr>
+              <w:keepNext w:val="0"/>
+              <w:spacing w:after="60" w:before="60" w:line="240" w:lineRule="auto"/>
+              <w:ind w:firstLine="0"/>
+              <w:jc w:val="center"/>
+            </w:pPr>
+            <w:r>
+              <w:rPr>
+                <w:b w:val="0"/>
+                <w:sz w:val="21"/>
+              </w:rPr>
+              <w:t>0.5397</w:t>
+            </w:r>
+          </w:p>
+        </w:tc>
+      </w:tr>
+    </w:tbl>
+    <w:p>
+      <w:r>
+        <w:t>仅加入有序分类头时，验证Macro-F1为0.6230、MAE为0.5706；同时加入有序头与不确定性时，相应为0.6165和0.5688，均弱于本文主模型的0.6323和0.5397。对应的既有冻结测试结果中，两种有序设置的准确率均为66.02%，Macro-F1分别为0.6342和0.6212，MAE分别为0.6210和0.6184，也未优于主模型。由此可见，更强的输出约束或更多融合模块并不自动带来更好的分类与回归表现。</w:t>
+      </w:r>
+    </w:p>
+    <w:p>
+      <w:r>
+        <w:t>联合监督基础设置在验证集的Macro-F1为0.6412，高于主模型；主模型的MAE则降低约0.0181。因此，四格对照支持不同结构之间存在性能取舍，不能据其中两个较弱设置宣称不确定性模块对所有指标均有增益。各设置使用各自验证最优策略，比较包含训练与策略选择的共同影响；单种子结果也不构成稳定提升的证据。</w:t>
+      </w:r>
+    </w:p>
+    <w:p>
+      <w:pPr>
+        <w:pStyle w:val="Heading2"/>
+      </w:pPr>
+      <w:r>
+        <w:t>6.4 学习率成组对照与较弱配置分析</w:t>
+      </w:r>
+    </w:p>
+    <w:p>
+      <w:r>
+        <w:t>进一步从既有不确定性模型搜索中，提取两组完整的0.5倍、1倍、2倍学习率试验。A组采用本文主模型的监督权重与模态丢弃率；B组采用较强分类监督，分类、中性、极性、不确定性损失权重依次为4、1、2、1，模态丢弃率为0.05。两组单模态损失权重均为0.1。在每组内部，仅同时缩放BERT与其他层学习率，其余模型与训练参数保持一致；种子均为17、上限20轮、早停耐心6轮，每行仍取该配置自己的验证Macro-F1最优记录。</w:t>
+      </w:r>
+    </w:p>
+    <w:p>
+      <w:pPr>
+        <w:pStyle w:val="Caption"/>
+        <w:keepNext/>
+      </w:pPr>
+      <w:r>
+        <w:t>表9　不确定性模型的成组学习率对照（验证集）</w:t>
+      </w:r>
+    </w:p>
+    <w:tbl>
+      <w:tblPr>
+        <w:tblW w:type="auto" w:w="0"/>
+        <w:jc w:val="center"/>
+        <w:tblLayout w:type="fixed"/>
+        <w:tblLook w:firstColumn="1" w:firstRow="1" w:lastColumn="0" w:lastRow="0" w:noHBand="0" w:noVBand="1" w:val="04A0"/>
+        <w:tblBorders>
+          <w:top w:val="single" w:sz="10" w:color="000000"/>
+          <w:left w:val="nil" w:sz="10" w:color="000000"/>
+          <w:bottom w:val="single" w:sz="10" w:color="000000"/>
+          <w:right w:val="nil" w:sz="10" w:color="000000"/>
+          <w:insideH w:val="nil" w:sz="10" w:color="000000"/>
+          <w:insideV w:val="nil" w:sz="10" w:color="000000"/>
+        </w:tblBorders>
+      </w:tblPr>
+      <w:tblGrid>
+        <w:gridCol w:w="706"/>
+        <w:gridCol w:w="706"/>
+        <w:gridCol w:w="1471"/>
+        <w:gridCol w:w="1471"/>
+        <w:gridCol w:w="647"/>
+        <w:gridCol w:w="1295"/>
+        <w:gridCol w:w="1648"/>
+        <w:gridCol w:w="1353"/>
+      </w:tblGrid>
+      <w:tr>
+        <w:trPr>
+          <w:tblHeader/>
+          <w:cantSplit/>
+        </w:trPr>
+        <w:tc>
+          <w:tcPr>
+            <w:tcW w:type="dxa" w:w="706"/>
+            <w:vAlign w:val="center"/>
+            <w:tcBorders>
+              <w:bottom w:val="single" w:sz="6"/>
+            </w:tcBorders>
+          </w:tcPr>
+          <w:p>
+            <w:pPr>
+              <w:keepNext/>
+              <w:spacing w:after="60" w:before="60" w:line="240" w:lineRule="auto"/>
+              <w:ind w:firstLine="0"/>
+              <w:jc w:val="center"/>
+            </w:pPr>
+            <w:r>
+              <w:rPr>
+                <w:b/>
+                <w:sz w:val="21"/>
+              </w:rPr>
+              <w:t>组别</w:t>
+            </w:r>
+          </w:p>
+        </w:tc>
+        <w:tc>
+          <w:tcPr>
+            <w:tcW w:type="dxa" w:w="706"/>
+            <w:vAlign w:val="center"/>
+            <w:tcBorders>
+              <w:bottom w:val="single" w:sz="6"/>
+            </w:tcBorders>
+          </w:tcPr>
+          <w:p>
+            <w:pPr>
+              <w:keepNext/>
+              <w:spacing w:after="60" w:before="60" w:line="240" w:lineRule="auto"/>
+              <w:ind w:firstLine="0"/>
+              <w:jc w:val="center"/>
+            </w:pPr>
+            <w:r>
+              <w:rPr>
+                <w:b/>
+                <w:sz w:val="21"/>
+              </w:rPr>
+              <w:t>倍率</w:t>
+            </w:r>
+          </w:p>
+        </w:tc>
+        <w:tc>
+          <w:tcPr>
+            <w:tcW w:type="dxa" w:w="1471"/>
+            <w:vAlign w:val="center"/>
+            <w:tcBorders>
+              <w:bottom w:val="single" w:sz="6"/>
+            </w:tcBorders>
+          </w:tcPr>
+          <w:p>
+            <w:pPr>
+              <w:keepNext/>
+              <w:spacing w:after="60" w:before="60" w:line="240" w:lineRule="auto"/>
+              <w:ind w:firstLine="0"/>
+              <w:jc w:val="center"/>
+            </w:pPr>
+            <w:r>
+              <w:rPr>
+                <w:b/>
+                <w:sz w:val="21"/>
+              </w:rPr>
+              <w:t>BERT LR</w:t>
+            </w:r>
+          </w:p>
+        </w:tc>
+        <w:tc>
+          <w:tcPr>
+            <w:tcW w:type="dxa" w:w="1471"/>
+            <w:vAlign w:val="center"/>
+            <w:tcBorders>
+              <w:bottom w:val="single" w:sz="6"/>
+            </w:tcBorders>
+          </w:tcPr>
+          <w:p>
+            <w:pPr>
+              <w:keepNext/>
+              <w:spacing w:after="60" w:before="60" w:line="240" w:lineRule="auto"/>
+              <w:ind w:firstLine="0"/>
+              <w:jc w:val="center"/>
+            </w:pPr>
+            <w:r>
+              <w:rPr>
+                <w:b/>
+                <w:sz w:val="21"/>
+              </w:rPr>
+              <w:t>其他层LR</w:t>
+            </w:r>
+          </w:p>
+        </w:tc>
+        <w:tc>
+          <w:tcPr>
+            <w:tcW w:type="dxa" w:w="647"/>
+            <w:vAlign w:val="center"/>
+            <w:tcBorders>
+              <w:bottom w:val="single" w:sz="6"/>
+            </w:tcBorders>
+          </w:tcPr>
+          <w:p>
+            <w:pPr>
+              <w:keepNext/>
+              <w:spacing w:after="60" w:before="60" w:line="240" w:lineRule="auto"/>
+              <w:ind w:firstLine="0"/>
+              <w:jc w:val="center"/>
+            </w:pPr>
+            <w:r>
+              <w:rPr>
+                <w:b/>
+                <w:sz w:val="21"/>
+              </w:rPr>
+              <w:t>轮次</w:t>
+            </w:r>
+          </w:p>
+        </w:tc>
+        <w:tc>
+          <w:tcPr>
+            <w:tcW w:type="dxa" w:w="1295"/>
+            <w:vAlign w:val="center"/>
+            <w:tcBorders>
+              <w:bottom w:val="single" w:sz="6"/>
+            </w:tcBorders>
+          </w:tcPr>
+          <w:p>
+            <w:pPr>
+              <w:keepNext/>
+              <w:spacing w:after="60" w:before="60" w:line="240" w:lineRule="auto"/>
+              <w:ind w:firstLine="0"/>
+              <w:jc w:val="center"/>
+            </w:pPr>
+            <w:r>
+              <w:rPr>
+                <w:b/>
+                <w:sz w:val="21"/>
+              </w:rPr>
+              <w:t>Acc(%)</w:t>
+            </w:r>
+          </w:p>
+        </w:tc>
+        <w:tc>
+          <w:tcPr>
+            <w:tcW w:type="dxa" w:w="1648"/>
+            <w:vAlign w:val="center"/>
+            <w:tcBorders>
+              <w:bottom w:val="single" w:sz="6"/>
+            </w:tcBorders>
+          </w:tcPr>
+          <w:p>
+            <w:pPr>
+              <w:keepNext/>
+              <w:spacing w:after="60" w:before="60" w:line="240" w:lineRule="auto"/>
+              <w:ind w:firstLine="0"/>
+              <w:jc w:val="center"/>
+            </w:pPr>
+            <w:r>
+              <w:rPr>
+                <w:b/>
+                <w:sz w:val="21"/>
+              </w:rPr>
+              <w:t>Macro-F1</w:t>
+            </w:r>
+          </w:p>
+        </w:tc>
+        <w:tc>
+          <w:tcPr>
+            <w:tcW w:type="dxa" w:w="1353"/>
+            <w:vAlign w:val="center"/>
+            <w:tcBorders>
+              <w:bottom w:val="single" w:sz="6"/>
+            </w:tcBorders>
+          </w:tcPr>
+          <w:p>
+            <w:pPr>
+              <w:keepNext/>
+              <w:spacing w:after="60" w:before="60" w:line="240" w:lineRule="auto"/>
+              <w:ind w:firstLine="0"/>
+              <w:jc w:val="center"/>
+            </w:pPr>
+            <w:r>
+              <w:rPr>
+                <w:b/>
+                <w:sz w:val="21"/>
+              </w:rPr>
+              <w:t>MAE</w:t>
+            </w:r>
+          </w:p>
+        </w:tc>
+      </w:tr>
+      <w:tr>
+        <w:trPr>
+          <w:cantSplit/>
+        </w:trPr>
+        <w:tc>
+          <w:tcPr>
+            <w:tcW w:type="dxa" w:w="706"/>
+            <w:vAlign w:val="center"/>
+          </w:tcPr>
+          <w:p>
+            <w:pPr>
+              <w:keepNext/>
+              <w:spacing w:after="60" w:before="60" w:line="240" w:lineRule="auto"/>
+              <w:ind w:firstLine="0"/>
+              <w:jc w:val="center"/>
+            </w:pPr>
+            <w:r>
+              <w:rPr>
+                <w:b w:val="0"/>
+                <w:sz w:val="21"/>
+              </w:rPr>
+              <w:t>A</w:t>
+            </w:r>
+          </w:p>
+        </w:tc>
+        <w:tc>
+          <w:tcPr>
+            <w:tcW w:type="dxa" w:w="706"/>
+            <w:vAlign w:val="center"/>
+          </w:tcPr>
+          <w:p>
+            <w:pPr>
+              <w:keepNext/>
+              <w:spacing w:after="60" w:before="60" w:line="240" w:lineRule="auto"/>
+              <w:ind w:firstLine="0"/>
+              <w:jc w:val="center"/>
+            </w:pPr>
+            <w:r>
+              <w:rPr>
+                <w:b w:val="0"/>
+                <w:sz w:val="21"/>
+              </w:rPr>
+              <w:t>0.5</w:t>
+            </w:r>
+          </w:p>
+        </w:tc>
+        <w:tc>
+          <w:tcPr>
+            <w:tcW w:type="dxa" w:w="1471"/>
+            <w:vAlign w:val="center"/>
+          </w:tcPr>
+          <w:p>
+            <w:pPr>
+              <w:keepNext/>
+              <w:spacing w:after="60" w:before="60" w:line="240" w:lineRule="auto"/>
+              <w:ind w:firstLine="0"/>
+              <w:jc w:val="center"/>
+            </w:pPr>
+            <w:r>
+              <w:rPr>
+                <w:b w:val="0"/>
+                <w:sz w:val="21"/>
+              </w:rPr>
+              <w:t>1.0e-05</w:t>
+            </w:r>
+          </w:p>
+        </w:tc>
+        <w:tc>
+          <w:tcPr>
+            <w:tcW w:type="dxa" w:w="1471"/>
+            <w:vAlign w:val="center"/>
+          </w:tcPr>
+          <w:p>
+            <w:pPr>
+              <w:keepNext/>
+              <w:spacing w:after="60" w:before="60" w:line="240" w:lineRule="auto"/>
+              <w:ind w:firstLine="0"/>
+              <w:jc w:val="center"/>
+            </w:pPr>
+            <w:r>
+              <w:rPr>
+                <w:b w:val="0"/>
+                <w:sz w:val="21"/>
+              </w:rPr>
+              <w:t>1.5e-04</w:t>
+            </w:r>
+          </w:p>
+        </w:tc>
+        <w:tc>
+          <w:tcPr>
+            <w:tcW w:type="dxa" w:w="647"/>
+            <w:vAlign w:val="center"/>
+          </w:tcPr>
+          <w:p>
+            <w:pPr>
+              <w:keepNext/>
+              <w:spacing w:after="60" w:before="60" w:line="240" w:lineRule="auto"/>
+              <w:ind w:firstLine="0"/>
+              <w:jc w:val="center"/>
+            </w:pPr>
+            <w:r>
+              <w:rPr>
+                <w:b w:val="0"/>
+                <w:sz w:val="21"/>
+              </w:rPr>
+              <w:t>5</w:t>
+            </w:r>
+          </w:p>
+        </w:tc>
+        <w:tc>
+          <w:tcPr>
+            <w:tcW w:type="dxa" w:w="1295"/>
+            <w:vAlign w:val="center"/>
+          </w:tcPr>
+          <w:p>
+            <w:pPr>
+              <w:keepNext/>
+              <w:spacing w:after="60" w:before="60" w:line="240" w:lineRule="auto"/>
+              <w:ind w:firstLine="0"/>
+              <w:jc w:val="center"/>
+            </w:pPr>
+            <w:r>
+              <w:rPr>
+                <w:b w:val="0"/>
+                <w:sz w:val="21"/>
+              </w:rPr>
+              <w:t>64.29</w:t>
+            </w:r>
+          </w:p>
+        </w:tc>
+        <w:tc>
+          <w:tcPr>
+            <w:tcW w:type="dxa" w:w="1648"/>
+            <w:vAlign w:val="center"/>
+          </w:tcPr>
+          <w:p>
+            <w:pPr>
+              <w:keepNext/>
+              <w:spacing w:after="60" w:before="60" w:line="240" w:lineRule="auto"/>
+              <w:ind w:firstLine="0"/>
+              <w:jc w:val="center"/>
+            </w:pPr>
+            <w:r>
+              <w:rPr>
+                <w:b w:val="0"/>
+                <w:sz w:val="21"/>
+              </w:rPr>
+              <w:t>0.6239</w:t>
+            </w:r>
+          </w:p>
+        </w:tc>
+        <w:tc>
+          <w:tcPr>
+            <w:tcW w:type="dxa" w:w="1353"/>
+            <w:vAlign w:val="center"/>
+          </w:tcPr>
+          <w:p>
+            <w:pPr>
+              <w:keepNext/>
+              <w:spacing w:after="60" w:before="60" w:line="240" w:lineRule="auto"/>
+              <w:ind w:firstLine="0"/>
+              <w:jc w:val="center"/>
+            </w:pPr>
+            <w:r>
+              <w:rPr>
+                <w:b w:val="0"/>
+                <w:sz w:val="21"/>
+              </w:rPr>
+              <w:t>0.5636</w:t>
+            </w:r>
+          </w:p>
+        </w:tc>
+      </w:tr>
+      <w:tr>
+        <w:trPr>
+          <w:cantSplit/>
+        </w:trPr>
+        <w:tc>
+          <w:tcPr>
+            <w:tcW w:type="dxa" w:w="706"/>
+            <w:vAlign w:val="center"/>
+          </w:tcPr>
+          <w:p>
+            <w:pPr>
+              <w:keepNext/>
+              <w:spacing w:after="60" w:before="60" w:line="240" w:lineRule="auto"/>
+              <w:ind w:firstLine="0"/>
+              <w:jc w:val="center"/>
+            </w:pPr>
+            <w:r>
+              <w:rPr>
+                <w:b w:val="0"/>
+                <w:sz w:val="21"/>
+              </w:rPr>
+              <w:t>A</w:t>
+            </w:r>
+          </w:p>
+        </w:tc>
+        <w:tc>
+          <w:tcPr>
+            <w:tcW w:type="dxa" w:w="706"/>
+            <w:vAlign w:val="center"/>
+          </w:tcPr>
+          <w:p>
+            <w:pPr>
+              <w:keepNext/>
+              <w:spacing w:after="60" w:before="60" w:line="240" w:lineRule="auto"/>
+              <w:ind w:firstLine="0"/>
+              <w:jc w:val="center"/>
+            </w:pPr>
+            <w:r>
+              <w:rPr>
+                <w:b w:val="0"/>
+                <w:sz w:val="21"/>
+              </w:rPr>
+              <w:t>1</w:t>
+            </w:r>
+          </w:p>
+        </w:tc>
+        <w:tc>
+          <w:tcPr>
+            <w:tcW w:type="dxa" w:w="1471"/>
+            <w:vAlign w:val="center"/>
+          </w:tcPr>
+          <w:p>
+            <w:pPr>
+              <w:keepNext/>
+              <w:spacing w:after="60" w:before="60" w:line="240" w:lineRule="auto"/>
+              <w:ind w:firstLine="0"/>
+              <w:jc w:val="center"/>
+            </w:pPr>
+            <w:r>
+              <w:rPr>
+                <w:b w:val="0"/>
+                <w:sz w:val="21"/>
+              </w:rPr>
+              <w:t>2.0e-05</w:t>
+            </w:r>
+          </w:p>
+        </w:tc>
+        <w:tc>
+          <w:tcPr>
+            <w:tcW w:type="dxa" w:w="1471"/>
+            <w:vAlign w:val="center"/>
+          </w:tcPr>
+          <w:p>
+            <w:pPr>
+              <w:keepNext/>
+              <w:spacing w:after="60" w:before="60" w:line="240" w:lineRule="auto"/>
+              <w:ind w:firstLine="0"/>
+              <w:jc w:val="center"/>
+            </w:pPr>
+            <w:r>
+              <w:rPr>
+                <w:b w:val="0"/>
+                <w:sz w:val="21"/>
+              </w:rPr>
+              <w:t>3.0e-04</w:t>
+            </w:r>
+          </w:p>
+        </w:tc>
+        <w:tc>
+          <w:tcPr>
+            <w:tcW w:type="dxa" w:w="647"/>
+            <w:vAlign w:val="center"/>
+          </w:tcPr>
+          <w:p>
+            <w:pPr>
+              <w:keepNext/>
+              <w:spacing w:after="60" w:before="60" w:line="240" w:lineRule="auto"/>
+              <w:ind w:firstLine="0"/>
+              <w:jc w:val="center"/>
+            </w:pPr>
+            <w:r>
+              <w:rPr>
+                <w:b w:val="0"/>
+                <w:sz w:val="21"/>
+              </w:rPr>
+              <w:t>5</w:t>
+            </w:r>
+          </w:p>
+        </w:tc>
+        <w:tc>
+          <w:tcPr>
+            <w:tcW w:type="dxa" w:w="1295"/>
+            <w:vAlign w:val="center"/>
+          </w:tcPr>
+          <w:p>
+            <w:pPr>
+              <w:keepNext/>
+              <w:spacing w:after="60" w:before="60" w:line="240" w:lineRule="auto"/>
+              <w:ind w:firstLine="0"/>
+              <w:jc w:val="center"/>
+            </w:pPr>
+            <w:r>
+              <w:rPr>
+                <w:b w:val="0"/>
+                <w:sz w:val="21"/>
+              </w:rPr>
+              <w:t>65.11</w:t>
+            </w:r>
+          </w:p>
+        </w:tc>
+        <w:tc>
+          <w:tcPr>
+            <w:tcW w:type="dxa" w:w="1648"/>
+            <w:vAlign w:val="center"/>
+          </w:tcPr>
+          <w:p>
+            <w:pPr>
+              <w:keepNext/>
+              <w:spacing w:after="60" w:before="60" w:line="240" w:lineRule="auto"/>
+              <w:ind w:firstLine="0"/>
+              <w:jc w:val="center"/>
+            </w:pPr>
+            <w:r>
+              <w:rPr>
+                <w:b w:val="0"/>
+                <w:sz w:val="21"/>
+              </w:rPr>
+              <w:t>0.6323</w:t>
+            </w:r>
+          </w:p>
+        </w:tc>
+        <w:tc>
+          <w:tcPr>
+            <w:tcW w:type="dxa" w:w="1353"/>
+            <w:vAlign w:val="center"/>
+          </w:tcPr>
+          <w:p>
+            <w:pPr>
+              <w:keepNext/>
+              <w:spacing w:after="60" w:before="60" w:line="240" w:lineRule="auto"/>
+              <w:ind w:firstLine="0"/>
+              <w:jc w:val="center"/>
+            </w:pPr>
+            <w:r>
+              <w:rPr>
+                <w:b w:val="0"/>
+                <w:sz w:val="21"/>
+              </w:rPr>
+              <w:t>0.5397</w:t>
+            </w:r>
+          </w:p>
+        </w:tc>
+      </w:tr>
+      <w:tr>
+        <w:trPr>
+          <w:cantSplit/>
+        </w:trPr>
+        <w:tc>
+          <w:tcPr>
+            <w:tcW w:type="dxa" w:w="706"/>
+            <w:vAlign w:val="center"/>
+          </w:tcPr>
+          <w:p>
+            <w:pPr>
+              <w:keepNext/>
+              <w:spacing w:after="60" w:before="60" w:line="240" w:lineRule="auto"/>
+              <w:ind w:firstLine="0"/>
+              <w:jc w:val="center"/>
+            </w:pPr>
+            <w:r>
+              <w:rPr>
+                <w:b w:val="0"/>
+                <w:sz w:val="21"/>
+              </w:rPr>
+              <w:t>A</w:t>
+            </w:r>
+          </w:p>
+        </w:tc>
+        <w:tc>
+          <w:tcPr>
+            <w:tcW w:type="dxa" w:w="706"/>
+            <w:vAlign w:val="center"/>
+          </w:tcPr>
+          <w:p>
+            <w:pPr>
+              <w:keepNext/>
+              <w:spacing w:after="60" w:before="60" w:line="240" w:lineRule="auto"/>
+              <w:ind w:firstLine="0"/>
+              <w:jc w:val="center"/>
+            </w:pPr>
+            <w:r>
+              <w:rPr>
+                <w:b w:val="0"/>
+                <w:sz w:val="21"/>
+              </w:rPr>
+              <w:t>2</w:t>
+            </w:r>
+          </w:p>
+        </w:tc>
+        <w:tc>
+          <w:tcPr>
+            <w:tcW w:type="dxa" w:w="1471"/>
+            <w:vAlign w:val="center"/>
+          </w:tcPr>
+          <w:p>
+            <w:pPr>
+              <w:keepNext/>
+              <w:spacing w:after="60" w:before="60" w:line="240" w:lineRule="auto"/>
+              <w:ind w:firstLine="0"/>
+              <w:jc w:val="center"/>
+            </w:pPr>
+            <w:r>
+              <w:rPr>
+                <w:b w:val="0"/>
+                <w:sz w:val="21"/>
+              </w:rPr>
+              <w:t>4.0e-05</w:t>
+            </w:r>
+          </w:p>
+        </w:tc>
+        <w:tc>
+          <w:tcPr>
+            <w:tcW w:type="dxa" w:w="1471"/>
+            <w:vAlign w:val="center"/>
+          </w:tcPr>
+          <w:p>
+            <w:pPr>
+              <w:keepNext/>
+              <w:spacing w:after="60" w:before="60" w:line="240" w:lineRule="auto"/>
+              <w:ind w:firstLine="0"/>
+              <w:jc w:val="center"/>
+            </w:pPr>
+            <w:r>
+              <w:rPr>
+                <w:b w:val="0"/>
+                <w:sz w:val="21"/>
+              </w:rPr>
+              <w:t>6.0e-04</w:t>
+            </w:r>
+          </w:p>
+        </w:tc>
+        <w:tc>
+          <w:tcPr>
+            <w:tcW w:type="dxa" w:w="647"/>
+            <w:vAlign w:val="center"/>
+          </w:tcPr>
+          <w:p>
+            <w:pPr>
+              <w:keepNext/>
+              <w:spacing w:after="60" w:before="60" w:line="240" w:lineRule="auto"/>
+              <w:ind w:firstLine="0"/>
+              <w:jc w:val="center"/>
+            </w:pPr>
+            <w:r>
+              <w:rPr>
+                <w:b w:val="0"/>
+                <w:sz w:val="21"/>
+              </w:rPr>
+              <w:t>4</w:t>
+            </w:r>
+          </w:p>
+        </w:tc>
+        <w:tc>
+          <w:tcPr>
+            <w:tcW w:type="dxa" w:w="1295"/>
+            <w:vAlign w:val="center"/>
+          </w:tcPr>
+          <w:p>
+            <w:pPr>
+              <w:keepNext/>
+              <w:spacing w:after="60" w:before="60" w:line="240" w:lineRule="auto"/>
+              <w:ind w:firstLine="0"/>
+              <w:jc w:val="center"/>
+            </w:pPr>
+            <w:r>
+              <w:rPr>
+                <w:b w:val="0"/>
+                <w:sz w:val="21"/>
+              </w:rPr>
+              <w:t>62.50</w:t>
+            </w:r>
+          </w:p>
+        </w:tc>
+        <w:tc>
+          <w:tcPr>
+            <w:tcW w:type="dxa" w:w="1648"/>
+            <w:vAlign w:val="center"/>
+          </w:tcPr>
+          <w:p>
+            <w:pPr>
+              <w:keepNext/>
+              <w:spacing w:after="60" w:before="60" w:line="240" w:lineRule="auto"/>
+              <w:ind w:firstLine="0"/>
+              <w:jc w:val="center"/>
+            </w:pPr>
+            <w:r>
+              <w:rPr>
+                <w:b w:val="0"/>
+                <w:sz w:val="21"/>
+              </w:rPr>
+              <w:t>0.6241</w:t>
+            </w:r>
+          </w:p>
+        </w:tc>
+        <w:tc>
+          <w:tcPr>
+            <w:tcW w:type="dxa" w:w="1353"/>
+            <w:vAlign w:val="center"/>
+          </w:tcPr>
+          <w:p>
+            <w:pPr>
+              <w:keepNext/>
+              <w:spacing w:after="60" w:before="60" w:line="240" w:lineRule="auto"/>
+              <w:ind w:firstLine="0"/>
+              <w:jc w:val="center"/>
+            </w:pPr>
+            <w:r>
+              <w:rPr>
+                <w:b w:val="0"/>
+                <w:sz w:val="21"/>
+              </w:rPr>
+              <w:t>0.5471</w:t>
+            </w:r>
+          </w:p>
+        </w:tc>
+      </w:tr>
+      <w:tr>
+        <w:trPr>
+          <w:cantSplit/>
+        </w:trPr>
+        <w:tc>
+          <w:tcPr>
+            <w:tcW w:type="dxa" w:w="706"/>
+            <w:vAlign w:val="center"/>
+          </w:tcPr>
+          <w:p>
+            <w:pPr>
+              <w:keepNext/>
+              <w:spacing w:after="60" w:before="60" w:line="240" w:lineRule="auto"/>
+              <w:ind w:firstLine="0"/>
+              <w:jc w:val="center"/>
+            </w:pPr>
+            <w:r>
+              <w:rPr>
+                <w:b w:val="0"/>
+                <w:sz w:val="21"/>
+              </w:rPr>
+              <w:t>B</w:t>
+            </w:r>
+          </w:p>
+        </w:tc>
+        <w:tc>
+          <w:tcPr>
+            <w:tcW w:type="dxa" w:w="706"/>
+            <w:vAlign w:val="center"/>
+          </w:tcPr>
+          <w:p>
+            <w:pPr>
+              <w:keepNext/>
+              <w:spacing w:after="60" w:before="60" w:line="240" w:lineRule="auto"/>
+              <w:ind w:firstLine="0"/>
+              <w:jc w:val="center"/>
+            </w:pPr>
+            <w:r>
+              <w:rPr>
+                <w:b w:val="0"/>
+                <w:sz w:val="21"/>
+              </w:rPr>
+              <w:t>0.5</w:t>
+            </w:r>
+          </w:p>
+        </w:tc>
+        <w:tc>
+          <w:tcPr>
+            <w:tcW w:type="dxa" w:w="1471"/>
+            <w:vAlign w:val="center"/>
+          </w:tcPr>
+          <w:p>
+            <w:pPr>
+              <w:keepNext/>
+              <w:spacing w:after="60" w:before="60" w:line="240" w:lineRule="auto"/>
+              <w:ind w:firstLine="0"/>
+              <w:jc w:val="center"/>
+            </w:pPr>
+            <w:r>
+              <w:rPr>
+                <w:b w:val="0"/>
+                <w:sz w:val="21"/>
+              </w:rPr>
+              <w:t>2.0e-05</w:t>
+            </w:r>
+          </w:p>
+        </w:tc>
+        <w:tc>
+          <w:tcPr>
+            <w:tcW w:type="dxa" w:w="1471"/>
+            <w:vAlign w:val="center"/>
+          </w:tcPr>
+          <w:p>
+            <w:pPr>
+              <w:keepNext/>
+              <w:spacing w:after="60" w:before="60" w:line="240" w:lineRule="auto"/>
+              <w:ind w:firstLine="0"/>
+              <w:jc w:val="center"/>
+            </w:pPr>
+            <w:r>
+              <w:rPr>
+                <w:b w:val="0"/>
+                <w:sz w:val="21"/>
+              </w:rPr>
+              <w:t>1.5e-04</w:t>
+            </w:r>
+          </w:p>
+        </w:tc>
+        <w:tc>
+          <w:tcPr>
+            <w:tcW w:type="dxa" w:w="647"/>
+            <w:vAlign w:val="center"/>
+          </w:tcPr>
+          <w:p>
+            <w:pPr>
+              <w:keepNext/>
+              <w:spacing w:after="60" w:before="60" w:line="240" w:lineRule="auto"/>
+              <w:ind w:firstLine="0"/>
+              <w:jc w:val="center"/>
+            </w:pPr>
+            <w:r>
+              <w:rPr>
+                <w:b w:val="0"/>
+                <w:sz w:val="21"/>
+              </w:rPr>
+              <w:t>2</w:t>
+            </w:r>
+          </w:p>
+        </w:tc>
+        <w:tc>
+          <w:tcPr>
+            <w:tcW w:type="dxa" w:w="1295"/>
+            <w:vAlign w:val="center"/>
+          </w:tcPr>
+          <w:p>
+            <w:pPr>
+              <w:keepNext/>
+              <w:spacing w:after="60" w:before="60" w:line="240" w:lineRule="auto"/>
+              <w:ind w:firstLine="0"/>
+              <w:jc w:val="center"/>
+            </w:pPr>
+            <w:r>
+              <w:rPr>
+                <w:b w:val="0"/>
+                <w:sz w:val="21"/>
+              </w:rPr>
+              <w:t>63.87</w:t>
+            </w:r>
+          </w:p>
+        </w:tc>
+        <w:tc>
+          <w:tcPr>
+            <w:tcW w:type="dxa" w:w="1648"/>
+            <w:vAlign w:val="center"/>
+          </w:tcPr>
+          <w:p>
+            <w:pPr>
+              <w:keepNext/>
+              <w:spacing w:after="60" w:before="60" w:line="240" w:lineRule="auto"/>
+              <w:ind w:firstLine="0"/>
+              <w:jc w:val="center"/>
+            </w:pPr>
+            <w:r>
+              <w:rPr>
+                <w:b w:val="0"/>
+                <w:sz w:val="21"/>
+              </w:rPr>
+              <w:t>0.6231</w:t>
+            </w:r>
+          </w:p>
+        </w:tc>
+        <w:tc>
+          <w:tcPr>
+            <w:tcW w:type="dxa" w:w="1353"/>
+            <w:vAlign w:val="center"/>
+          </w:tcPr>
+          <w:p>
+            <w:pPr>
+              <w:keepNext/>
+              <w:spacing w:after="60" w:before="60" w:line="240" w:lineRule="auto"/>
+              <w:ind w:firstLine="0"/>
+              <w:jc w:val="center"/>
+            </w:pPr>
+            <w:r>
+              <w:rPr>
+                <w:b w:val="0"/>
+                <w:sz w:val="21"/>
+              </w:rPr>
+              <w:t>0.5622</w:t>
+            </w:r>
+          </w:p>
+        </w:tc>
+      </w:tr>
+      <w:tr>
+        <w:trPr>
+          <w:cantSplit/>
+        </w:trPr>
+        <w:tc>
+          <w:tcPr>
+            <w:tcW w:type="dxa" w:w="706"/>
+            <w:vAlign w:val="center"/>
+          </w:tcPr>
+          <w:p>
+            <w:pPr>
+              <w:keepNext/>
+              <w:spacing w:after="60" w:before="60" w:line="240" w:lineRule="auto"/>
+              <w:ind w:firstLine="0"/>
+              <w:jc w:val="center"/>
+            </w:pPr>
+            <w:r>
+              <w:rPr>
+                <w:b w:val="0"/>
+                <w:sz w:val="21"/>
+              </w:rPr>
+              <w:t>B</w:t>
+            </w:r>
+          </w:p>
+        </w:tc>
+        <w:tc>
+          <w:tcPr>
+            <w:tcW w:type="dxa" w:w="706"/>
+            <w:vAlign w:val="center"/>
+          </w:tcPr>
+          <w:p>
+            <w:pPr>
+              <w:keepNext/>
+              <w:spacing w:after="60" w:before="60" w:line="240" w:lineRule="auto"/>
+              <w:ind w:firstLine="0"/>
+              <w:jc w:val="center"/>
+            </w:pPr>
+            <w:r>
+              <w:rPr>
+                <w:b w:val="0"/>
+                <w:sz w:val="21"/>
+              </w:rPr>
+              <w:t>1</w:t>
+            </w:r>
+          </w:p>
+        </w:tc>
+        <w:tc>
+          <w:tcPr>
+            <w:tcW w:type="dxa" w:w="1471"/>
+            <w:vAlign w:val="center"/>
+          </w:tcPr>
+          <w:p>
+            <w:pPr>
+              <w:keepNext/>
+              <w:spacing w:after="60" w:before="60" w:line="240" w:lineRule="auto"/>
+              <w:ind w:firstLine="0"/>
+              <w:jc w:val="center"/>
+            </w:pPr>
+            <w:r>
+              <w:rPr>
+                <w:b w:val="0"/>
+                <w:sz w:val="21"/>
+              </w:rPr>
+              <w:t>4.0e-05</w:t>
+            </w:r>
+          </w:p>
+        </w:tc>
+        <w:tc>
+          <w:tcPr>
+            <w:tcW w:type="dxa" w:w="1471"/>
+            <w:vAlign w:val="center"/>
+          </w:tcPr>
+          <w:p>
+            <w:pPr>
+              <w:keepNext/>
+              <w:spacing w:after="60" w:before="60" w:line="240" w:lineRule="auto"/>
+              <w:ind w:firstLine="0"/>
+              <w:jc w:val="center"/>
+            </w:pPr>
+            <w:r>
+              <w:rPr>
+                <w:b w:val="0"/>
+                <w:sz w:val="21"/>
+              </w:rPr>
+              <w:t>3.0e-04</w:t>
+            </w:r>
+          </w:p>
+        </w:tc>
+        <w:tc>
+          <w:tcPr>
+            <w:tcW w:type="dxa" w:w="647"/>
+            <w:vAlign w:val="center"/>
+          </w:tcPr>
+          <w:p>
+            <w:pPr>
+              <w:keepNext/>
+              <w:spacing w:after="60" w:before="60" w:line="240" w:lineRule="auto"/>
+              <w:ind w:firstLine="0"/>
+              <w:jc w:val="center"/>
+            </w:pPr>
+            <w:r>
+              <w:rPr>
+                <w:b w:val="0"/>
+                <w:sz w:val="21"/>
+              </w:rPr>
+              <w:t>8</w:t>
+            </w:r>
+          </w:p>
+        </w:tc>
+        <w:tc>
+          <w:tcPr>
+            <w:tcW w:type="dxa" w:w="1295"/>
+            <w:vAlign w:val="center"/>
+          </w:tcPr>
+          <w:p>
+            <w:pPr>
+              <w:keepNext/>
+              <w:spacing w:after="60" w:before="60" w:line="240" w:lineRule="auto"/>
+              <w:ind w:firstLine="0"/>
+              <w:jc w:val="center"/>
+            </w:pPr>
+            <w:r>
+              <w:rPr>
+                <w:b w:val="0"/>
+                <w:sz w:val="21"/>
+              </w:rPr>
+              <w:t>64.56</w:t>
+            </w:r>
+          </w:p>
+        </w:tc>
+        <w:tc>
+          <w:tcPr>
+            <w:tcW w:type="dxa" w:w="1648"/>
+            <w:vAlign w:val="center"/>
+          </w:tcPr>
+          <w:p>
+            <w:pPr>
+              <w:keepNext/>
+              <w:spacing w:after="60" w:before="60" w:line="240" w:lineRule="auto"/>
+              <w:ind w:firstLine="0"/>
+              <w:jc w:val="center"/>
+            </w:pPr>
+            <w:r>
+              <w:rPr>
+                <w:b w:val="0"/>
+                <w:sz w:val="21"/>
+              </w:rPr>
+              <w:t>0.6364</w:t>
+            </w:r>
+          </w:p>
+        </w:tc>
+        <w:tc>
+          <w:tcPr>
+            <w:tcW w:type="dxa" w:w="1353"/>
+            <w:vAlign w:val="center"/>
+          </w:tcPr>
+          <w:p>
+            <w:pPr>
+              <w:keepNext/>
+              <w:spacing w:after="60" w:before="60" w:line="240" w:lineRule="auto"/>
+              <w:ind w:firstLine="0"/>
+              <w:jc w:val="center"/>
+            </w:pPr>
+            <w:r>
+              <w:rPr>
+                <w:b w:val="0"/>
+                <w:sz w:val="21"/>
+              </w:rPr>
+              <w:t>0.5599</w:t>
+            </w:r>
+          </w:p>
+        </w:tc>
+      </w:tr>
+      <w:tr>
+        <w:trPr>
+          <w:cantSplit/>
+        </w:trPr>
+        <w:tc>
+          <w:tcPr>
+            <w:tcW w:type="dxa" w:w="706"/>
+            <w:vAlign w:val="center"/>
+          </w:tcPr>
+          <w:p>
+            <w:pPr>
+              <w:keepNext w:val="0"/>
+              <w:spacing w:after="60" w:before="60" w:line="240" w:lineRule="auto"/>
+              <w:ind w:firstLine="0"/>
+              <w:jc w:val="center"/>
+            </w:pPr>
+            <w:r>
+              <w:rPr>
+                <w:b w:val="0"/>
+                <w:sz w:val="21"/>
+              </w:rPr>
+              <w:t>B</w:t>
+            </w:r>
+          </w:p>
+        </w:tc>
+        <w:tc>
+          <w:tcPr>
+            <w:tcW w:type="dxa" w:w="706"/>
+            <w:vAlign w:val="center"/>
+          </w:tcPr>
+          <w:p>
+            <w:pPr>
+              <w:keepNext w:val="0"/>
+              <w:spacing w:after="60" w:before="60" w:line="240" w:lineRule="auto"/>
+              <w:ind w:firstLine="0"/>
+              <w:jc w:val="center"/>
+            </w:pPr>
+            <w:r>
+              <w:rPr>
+                <w:b w:val="0"/>
+                <w:sz w:val="21"/>
+              </w:rPr>
+              <w:t>2</w:t>
+            </w:r>
+          </w:p>
+        </w:tc>
+        <w:tc>
+          <w:tcPr>
+            <w:tcW w:type="dxa" w:w="1471"/>
+            <w:vAlign w:val="center"/>
+          </w:tcPr>
+          <w:p>
+            <w:pPr>
+              <w:keepNext w:val="0"/>
+              <w:spacing w:after="60" w:before="60" w:line="240" w:lineRule="auto"/>
+              <w:ind w:firstLine="0"/>
+              <w:jc w:val="center"/>
+            </w:pPr>
+            <w:r>
+              <w:rPr>
+                <w:b w:val="0"/>
+                <w:sz w:val="21"/>
+              </w:rPr>
+              <w:t>8.0e-05</w:t>
+            </w:r>
+          </w:p>
+        </w:tc>
+        <w:tc>
+          <w:tcPr>
+            <w:tcW w:type="dxa" w:w="1471"/>
+            <w:vAlign w:val="center"/>
+          </w:tcPr>
+          <w:p>
+            <w:pPr>
+              <w:keepNext w:val="0"/>
+              <w:spacing w:after="60" w:before="60" w:line="240" w:lineRule="auto"/>
+              <w:ind w:firstLine="0"/>
+              <w:jc w:val="center"/>
+            </w:pPr>
+            <w:r>
+              <w:rPr>
+                <w:b w:val="0"/>
+                <w:sz w:val="21"/>
+              </w:rPr>
+              <w:t>6.0e-04</w:t>
+            </w:r>
+          </w:p>
+        </w:tc>
+        <w:tc>
+          <w:tcPr>
+            <w:tcW w:type="dxa" w:w="647"/>
+            <w:vAlign w:val="center"/>
+          </w:tcPr>
+          <w:p>
+            <w:pPr>
+              <w:keepNext w:val="0"/>
+              <w:spacing w:after="60" w:before="60" w:line="240" w:lineRule="auto"/>
+              <w:ind w:firstLine="0"/>
+              <w:jc w:val="center"/>
+            </w:pPr>
+            <w:r>
+              <w:rPr>
+                <w:b w:val="0"/>
+                <w:sz w:val="21"/>
+              </w:rPr>
+              <w:t>14</w:t>
+            </w:r>
+          </w:p>
+        </w:tc>
+        <w:tc>
+          <w:tcPr>
+            <w:tcW w:type="dxa" w:w="1295"/>
+            <w:vAlign w:val="center"/>
+          </w:tcPr>
+          <w:p>
+            <w:pPr>
+              <w:keepNext w:val="0"/>
+              <w:spacing w:after="60" w:before="60" w:line="240" w:lineRule="auto"/>
+              <w:ind w:firstLine="0"/>
+              <w:jc w:val="center"/>
+            </w:pPr>
+            <w:r>
+              <w:rPr>
+                <w:b w:val="0"/>
+                <w:sz w:val="21"/>
+              </w:rPr>
+              <w:t>60.99</w:t>
+            </w:r>
+          </w:p>
+        </w:tc>
+        <w:tc>
+          <w:tcPr>
+            <w:tcW w:type="dxa" w:w="1648"/>
+            <w:vAlign w:val="center"/>
+          </w:tcPr>
+          <w:p>
+            <w:pPr>
+              <w:keepNext w:val="0"/>
+              <w:spacing w:after="60" w:before="60" w:line="240" w:lineRule="auto"/>
+              <w:ind w:firstLine="0"/>
+              <w:jc w:val="center"/>
+            </w:pPr>
+            <w:r>
+              <w:rPr>
+                <w:b w:val="0"/>
+                <w:sz w:val="21"/>
+              </w:rPr>
+              <w:t>0.6042</w:t>
+            </w:r>
+          </w:p>
+        </w:tc>
+        <w:tc>
+          <w:tcPr>
+            <w:tcW w:type="dxa" w:w="1353"/>
+            <w:vAlign w:val="center"/>
+          </w:tcPr>
+          <w:p>
+            <w:pPr>
+              <w:keepNext w:val="0"/>
+              <w:spacing w:after="60" w:before="60" w:line="240" w:lineRule="auto"/>
+              <w:ind w:firstLine="0"/>
+              <w:jc w:val="center"/>
+            </w:pPr>
+            <w:r>
+              <w:rPr>
+                <w:b w:val="0"/>
+                <w:sz w:val="21"/>
+              </w:rPr>
+              <w:t>0.5912</w:t>
+            </w:r>
+          </w:p>
+        </w:tc>
+      </w:tr>
+    </w:tbl>
+    <w:p>
+      <w:r>
+        <w:t>A组中，学习率减半或加倍均未改善参考配置的验证Macro-F1与MAE。B组的两组学习率从4×10</w:t>
+      </w:r>
+      <w:r>
+        <w:rPr>
+          <w:vertAlign w:val="superscript"/>
+        </w:rPr>
+        <w:t>-5</w:t>
+      </w:r>
+      <w:r>
+        <w:t>/3×10</w:t>
+      </w:r>
+      <w:r>
+        <w:rPr>
+          <w:vertAlign w:val="superscript"/>
+        </w:rPr>
+        <w:t>-4</w:t>
+      </w:r>
+      <w:r>
+        <w:t>同时加倍后，验证Macro-F1由0.6364降至0.6042，准确率由64.56%降至60.99%，MAE由0.5599增至0.5912，构成较明确的退化案例。该结果对应完整训练过程中的验证最优记录，并非从训练轨迹中抽取较差轮次；但它只能说明这组联合学习率设置不合适，不能分别归因于BERT或其他层的学习率。</w:t>
+      </w:r>
+    </w:p>
+    <w:p>
+      <w:r>
+        <w:t>B组参考配置的验证Macro-F1高于A组，但MAE较大，也说明分类与回归目标之间仍有取舍。图6同时展示全部22个固定种子候选，完整参数表随结果提供；其余宽搜索点同时改变了多个超参数，不用于推断某个单独参数的因果作用。本节不额外使用测试集或附件四挑选较弱参数，也不将缺少对应冻结测试记录的配置填入测试成绩。</w:t>
+      </w:r>
+    </w:p>
+    <w:p>
+      <w:pPr>
+        <w:keepNext/>
+        <w:ind w:firstLine="0"/>
+        <w:jc w:val="center"/>
+      </w:pPr>
+      <w:r>
+        <w:drawing>
+          <wp:inline xmlns:a="http://schemas.openxmlformats.org/drawingml/2006/main" xmlns:pic="http://schemas.openxmlformats.org/drawingml/2006/picture">
+            <wp:extent cx="5796000" cy="2141872"/>
+            <wp:docPr id="6" name="Picture 6"/>
+            <wp:cNvGraphicFramePr>
+              <a:graphicFrameLocks noChangeAspect="1"/>
+            </wp:cNvGraphicFramePr>
+            <a:graphic>
+              <a:graphicData uri="http://schemas.openxmlformats.org/drawingml/2006/picture">
+                <pic:pic>
+                  <pic:nvPicPr>
+                    <pic:cNvPr id="0" name="07_parameter_comparison.png"/>
+                    <pic:cNvPicPr/>
+                  </pic:nvPicPr>
+                  <pic:blipFill>
+                    <a:blip r:embed="rId15"/>
+                    <a:stretch>
+                      <a:fillRect/>
+                    </a:stretch>
+                  </pic:blipFill>
+                  <pic:spPr>
+                    <a:xfrm>
+                      <a:off x="0" y="0"/>
+                      <a:ext cx="5796000" cy="2141872"/>
+                    </a:xfrm>
+                    <a:prstGeom prst="rect"/>
+                  </pic:spPr>
+                </pic:pic>
+              </a:graphicData>
+            </a:graphic>
+          </wp:inline>
+        </w:drawing>
+      </w:r>
+    </w:p>
+    <w:p>
+      <w:pPr>
+        <w:pStyle w:val="Caption"/>
+        <w:keepNext w:val="0"/>
+      </w:pPr>
+      <w:r>
+        <w:t>图6　全部22个不确定性候选的验证性能与两组学习率对照。每点均使用本配置的验证Macro-F1最优轮次和策略；两组曲线连接的是成组参数试验，不是训练轮次。</w:t>
+      </w:r>
+    </w:p>
+    <w:p>
+      <w:pPr>
+        <w:pStyle w:val="Heading2"/>
+      </w:pPr>
+      <w:r>
+        <w:t>6.5 验证集错误归因</w:t>
       </w:r>
     </w:p>
     <w:p>
@@ -8465,7 +10666,7 @@
         <w:keepNext/>
       </w:pPr>
       <w:r>
-        <w:t>表8　验证集标签与观测分组的误差</w:t>
+        <w:t>表10　验证集标签与观测分组的误差</w:t>
       </w:r>
     </w:p>
     <w:tbl>
@@ -9177,7 +11378,7 @@
         <w:pStyle w:val="Heading2"/>
       </w:pPr>
       <w:r>
-        <w:t>6.4 解释完备性检验</w:t>
+        <w:t>6.6 解释完备性检验</w:t>
       </w:r>
     </w:p>
     <w:p>
@@ -9186,7 +11387,7 @@
         <w:keepNext/>
       </w:pPr>
       <w:r>
-        <w:t>表9　分类间隔与回归预激活的分解误差</w:t>
+        <w:t>表11　分类间隔与回归预激活的分解误差</w:t>
       </w:r>
     </w:p>
     <w:tbl>
@@ -9607,7 +11808,7 @@
         <w:keepNext/>
       </w:pPr>
       <w:r>
-        <w:t>表10　三模态净贡献占比的样本均值</w:t>
+        <w:t>表12　三模态净贡献占比的样本均值</w:t>
       </w:r>
     </w:p>
     <w:tbl>
@@ -10283,7 +12484,7 @@
         <w:drawing>
           <wp:inline xmlns:a="http://schemas.openxmlformats.org/drawingml/2006/main" xmlns:pic="http://schemas.openxmlformats.org/drawingml/2006/picture">
             <wp:extent cx="5796000" cy="1959741"/>
-            <wp:docPr id="6" name="Picture 6"/>
+            <wp:docPr id="7" name="Picture 7"/>
             <wp:cNvGraphicFramePr>
               <a:graphicFrameLocks noChangeAspect="1"/>
             </wp:cNvGraphicFramePr>
@@ -10295,7 +12496,7 @@
                     <pic:cNvPicPr/>
                   </pic:nvPicPr>
                   <pic:blipFill>
-                    <a:blip r:embed="rId15"/>
+                    <a:blip r:embed="rId16"/>
                     <a:stretch>
                       <a:fillRect/>
                     </a:stretch>
@@ -10320,7 +12521,7 @@
         <w:keepNext w:val="0"/>
       </w:pPr>
       <w:r>
-        <w:t>图6　分类贡献、回归贡献与可靠性权重的对照。三者解释不同对象，不能互换。</w:t>
+        <w:t>图7　分类贡献、回归贡献与可靠性权重的对照。三者解释不同对象，不能互换。</w:t>
       </w:r>
     </w:p>
     <w:p>
@@ -10351,7 +12552,7 @@
         <w:drawing>
           <wp:inline xmlns:a="http://schemas.openxmlformats.org/drawingml/2006/main" xmlns:pic="http://schemas.openxmlformats.org/drawingml/2006/picture">
             <wp:extent cx="5796000" cy="1685155"/>
-            <wp:docPr id="7" name="Picture 7"/>
+            <wp:docPr id="8" name="Picture 8"/>
             <wp:cNvGraphicFramePr>
               <a:graphicFrameLocks noChangeAspect="1"/>
             </wp:cNvGraphicFramePr>
@@ -10363,7 +12564,7 @@
                     <pic:cNvPicPr/>
                   </pic:nvPicPr>
                   <pic:blipFill>
-                    <a:blip r:embed="rId16"/>
+                    <a:blip r:embed="rId17"/>
                     <a:stretch>
                       <a:fillRect/>
                     </a:stretch>
@@ -10388,7 +12589,7 @@
         <w:keepNext w:val="0"/>
       </w:pPr>
       <w:r>
-        <w:t>图7　附件4样本16的主要参考模态内局部重要性。每行给出原BERT位置和对应原文，负值表示反对当前类别间隔；词的上下文由BERT编码。</w:t>
+        <w:t>图8　附件4样本16的主要参考模态内局部重要性。每行给出原BERT位置和对应原文，负值表示反对当前类别间隔；词的上下文由BERT编码。</w:t>
       </w:r>
     </w:p>
     <w:p>
@@ -10401,7 +12602,7 @@
         <w:drawing>
           <wp:inline xmlns:a="http://schemas.openxmlformats.org/drawingml/2006/main" xmlns:pic="http://schemas.openxmlformats.org/drawingml/2006/picture">
             <wp:extent cx="5796000" cy="1930056"/>
-            <wp:docPr id="8" name="Picture 8"/>
+            <wp:docPr id="9" name="Picture 9"/>
             <wp:cNvGraphicFramePr>
               <a:graphicFrameLocks noChangeAspect="1"/>
             </wp:cNvGraphicFramePr>
@@ -10413,7 +12614,7 @@
                     <pic:cNvPicPr/>
                   </pic:nvPicPr>
                   <pic:blipFill>
-                    <a:blip r:embed="rId17"/>
+                    <a:blip r:embed="rId18"/>
                     <a:stretch>
                       <a:fillRect/>
                     </a:stretch>
@@ -10438,7 +12639,7 @@
         <w:keepNext w:val="0"/>
       </w:pPr>
       <w:r>
-        <w:t>图8　附件4样本02的文本局部重要性。保留正负方向，绝对值大不等于支持当前预测。</w:t>
+        <w:t>图9　附件4样本02的文本局部重要性。保留正负方向，绝对值大不等于支持当前预测。</w:t>
       </w:r>
     </w:p>
     <w:p>
@@ -10469,7 +12670,7 @@
         <w:keepNext/>
       </w:pPr>
       <w:r>
-        <w:t>表11　附件四20条样本的预测与分类贡献汇总</w:t>
+        <w:t>表13　附件四20条样本的预测与分类贡献汇总</w:t>
       </w:r>
     </w:p>
     <w:tbl>
@@ -13597,7 +15798,7 @@
         <w:keepNext/>
       </w:pPr>
       <w:r>
-        <w:t>表12　附件四20条样本的主要证据定位索引</w:t>
+        <w:t>表14　附件四20条样本的主要证据定位索引</w:t>
       </w:r>
     </w:p>
     <w:tbl>
@@ -15453,7 +17654,7 @@
         <w:keepNext/>
       </w:pPr>
       <w:r>
-        <w:t>表13　样本02解释卡</w:t>
+        <w:t>表15　样本02解释卡</w:t>
       </w:r>
     </w:p>
     <w:tbl>
@@ -15945,7 +18146,7 @@
         <w:keepNext/>
       </w:pPr>
       <w:r>
-        <w:t>表14　样本13解释卡</w:t>
+        <w:t>表16　样本13解释卡</w:t>
       </w:r>
     </w:p>
     <w:tbl>
@@ -16437,7 +18638,7 @@
         <w:keepNext/>
       </w:pPr>
       <w:r>
-        <w:t>表15　样本14解释卡</w:t>
+        <w:t>表17　样本14解释卡</w:t>
       </w:r>
     </w:p>
     <w:tbl>
@@ -16929,7 +19130,7 @@
         <w:keepNext/>
       </w:pPr>
       <w:r>
-        <w:t>表16　样本16解释卡</w:t>
+        <w:t>表18　样本16解释卡</w:t>
       </w:r>
     </w:p>
     <w:tbl>
@@ -17451,7 +19652,7 @@
     </w:p>
     <w:p>
       <w:r>
-        <w:t>后续优先进行多随机种子重复与独立确认实验，检验不确定性缩放、成对项和辅助监督各自带来的增益；围绕中性边界采用嵌套验证控制策略选择偏差，分别考察分类、回归与校准质量。在解释层面，可增加保持训练数据分布的局部扰动实验、跨种子稳定性评价和人工证据核验，区分数值完备、预测忠实与人类可理解三个维度。上述内容为待验证方向，不计入本文已完成结果。</w:t>
+        <w:t>后续优先扩展本次单种子结构与学习率对照，进行多随机种子重复和独立确认实验，并进一步分离成对项、辅助监督等模块的作用；围绕中性边界采用嵌套验证控制策略选择偏差，分别考察分类、回归与校准质量。在解释层面，可增加保持训练数据分布的局部扰动实验、跨种子稳定性评价和人工证据核验，区分数值完备、预测忠实与人类可理解三个维度。上述扩展内容为待验证方向，不计入本文已完成结果。</w:t>
       </w:r>
     </w:p>
     <w:p>

</xml_diff>

<commit_message>
Add SELF-MM and TETFN parameter comparisons with frozen test evaluation
</commit_message>
<xml_diff>
--- a/问题三/paper/问题三_不确定性融合论文.docx
+++ b/问题三/paper/问题三_不确定性融合论文.docx
@@ -7855,7 +7855,7 @@
     </w:tbl>
     <w:p>
       <w:r>
-        <w:t>主模型验证Macro-F1并非三者最高：SELF-MM为0.6390，主模型为0.6323。附件2测试中，主模型比SELF-MM准确率高2.48个百分点、Macro-F1高约0.0104，而MAE稍高约0.0040；相比TETFN，测试准确率、Macro-F1和MAE均更优。选择主模型同时考虑其原生可核算解释，不能称其在所有指标上领先。当前为单随机种子的代表配置比较，未给出多种子方差或统计显著性。</w:t>
+        <w:t>主模型验证Macro-F1并非三者最高：SELF-MM为0.6390，主模型为0.6323。相对表中按验证Macro-F1选择的SELF-MM参考配置，主模型在附件2测试中准确率高2.48个百分点、Macro-F1高约0.0104，而MAE稍高约0.0040；相比表中TETFN参考配置，测试准确率、Macro-F1和MAE均更优。这一比较限定于表中配置；第6.5节进一步给出两类基线的其他参数结果。选择主模型同时考虑其原生可核算解释，不能称其在所有指标上领先。当前为单随机种子的代表配置比较，未给出多种子方差或统计显著性。</w:t>
       </w:r>
     </w:p>
     <w:p>
@@ -10652,7 +10652,2888 @@
         <w:pStyle w:val="Heading2"/>
       </w:pPr>
       <w:r>
-        <w:t>6.5 验证集错误归因</w:t>
+        <w:t>6.5 开源适配基线的参数对照</w:t>
+      </w:r>
+    </w:p>
+    <w:p>
+      <w:r>
+        <w:t>进一步考察开源方法在比赛适配后的参数敏感性。纳入同批实验中固定种子17的全部6组SELF-MM适配配置和2组源码TETFN适配配置，包含较弱设置及各自参考设置。它们均使用附件二对齐版、批量32、最多10轮、早停耐心4轮，各自按验证Macro-F1确定检查点和决策策略。本节重载已有权重，先核对728条验证输出，再固定策略计算727条测试结果，不重新训练或使用测试集调参。该批预算与前述20轮上限实验不同，不能把10轮配置描述为已完成20轮训练。</w:t>
+      </w:r>
+    </w:p>
+    <w:p>
+      <w:pPr>
+        <w:pStyle w:val="Caption"/>
+        <w:keepNext/>
+      </w:pPr>
+      <w:r>
+        <w:t>表10　开源适配基线的参数设置（训练上限均为10轮）</w:t>
+      </w:r>
+    </w:p>
+    <w:tbl>
+      <w:tblPr>
+        <w:tblW w:type="auto" w:w="0"/>
+        <w:jc w:val="center"/>
+        <w:tblLayout w:type="fixed"/>
+        <w:tblLook w:firstColumn="1" w:firstRow="1" w:lastColumn="0" w:lastRow="0" w:noHBand="0" w:noVBand="1" w:val="04A0"/>
+        <w:tblBorders>
+          <w:top w:val="single" w:sz="10" w:color="000000"/>
+          <w:left w:val="nil" w:sz="10" w:color="000000"/>
+          <w:bottom w:val="single" w:sz="10" w:color="000000"/>
+          <w:right w:val="nil" w:sz="10" w:color="000000"/>
+          <w:insideH w:val="nil" w:sz="10" w:color="000000"/>
+          <w:insideV w:val="nil" w:sz="10" w:color="000000"/>
+        </w:tblBorders>
+      </w:tblPr>
+      <w:tblGrid>
+        <w:gridCol w:w="664"/>
+        <w:gridCol w:w="1509"/>
+        <w:gridCol w:w="1509"/>
+        <w:gridCol w:w="1268"/>
+        <w:gridCol w:w="1389"/>
+        <w:gridCol w:w="1449"/>
+        <w:gridCol w:w="1509"/>
+      </w:tblGrid>
+      <w:tr>
+        <w:trPr>
+          <w:tblHeader/>
+          <w:cantSplit/>
+        </w:trPr>
+        <w:tc>
+          <w:tcPr>
+            <w:tcW w:type="dxa" w:w="664"/>
+            <w:vAlign w:val="center"/>
+            <w:tcBorders>
+              <w:bottom w:val="single" w:sz="6"/>
+            </w:tcBorders>
+          </w:tcPr>
+          <w:p>
+            <w:pPr>
+              <w:keepNext/>
+              <w:spacing w:after="60" w:before="60" w:line="240" w:lineRule="auto"/>
+              <w:ind w:firstLine="0"/>
+              <w:jc w:val="center"/>
+            </w:pPr>
+            <w:r>
+              <w:rPr>
+                <w:b/>
+                <w:sz w:val="21"/>
+              </w:rPr>
+              <w:t>代号</w:t>
+            </w:r>
+          </w:p>
+        </w:tc>
+        <w:tc>
+          <w:tcPr>
+            <w:tcW w:type="dxa" w:w="1509"/>
+            <w:vAlign w:val="center"/>
+            <w:tcBorders>
+              <w:bottom w:val="single" w:sz="6"/>
+            </w:tcBorders>
+          </w:tcPr>
+          <w:p>
+            <w:pPr>
+              <w:keepNext/>
+              <w:spacing w:after="60" w:before="60" w:line="240" w:lineRule="auto"/>
+              <w:ind w:firstLine="0"/>
+              <w:jc w:val="center"/>
+            </w:pPr>
+            <w:r>
+              <w:rPr>
+                <w:b/>
+                <w:sz w:val="21"/>
+              </w:rPr>
+              <w:t>模型</w:t>
+            </w:r>
+          </w:p>
+        </w:tc>
+        <w:tc>
+          <w:tcPr>
+            <w:tcW w:type="dxa" w:w="1509"/>
+            <w:vAlign w:val="center"/>
+            <w:tcBorders>
+              <w:bottom w:val="single" w:sz="6"/>
+            </w:tcBorders>
+          </w:tcPr>
+          <w:p>
+            <w:pPr>
+              <w:keepNext/>
+              <w:spacing w:after="60" w:before="60" w:line="240" w:lineRule="auto"/>
+              <w:ind w:firstLine="0"/>
+              <w:jc w:val="center"/>
+            </w:pPr>
+            <w:r>
+              <w:rPr>
+                <w:b/>
+                <w:sz w:val="21"/>
+              </w:rPr>
+              <w:t>BERT LR</w:t>
+            </w:r>
+          </w:p>
+        </w:tc>
+        <w:tc>
+          <w:tcPr>
+            <w:tcW w:type="dxa" w:w="1268"/>
+            <w:vAlign w:val="center"/>
+            <w:tcBorders>
+              <w:bottom w:val="single" w:sz="6"/>
+            </w:tcBorders>
+          </w:tcPr>
+          <w:p>
+            <w:pPr>
+              <w:keepNext/>
+              <w:spacing w:after="60" w:before="60" w:line="240" w:lineRule="auto"/>
+              <w:ind w:firstLine="0"/>
+              <w:jc w:val="center"/>
+            </w:pPr>
+            <w:r>
+              <w:rPr>
+                <w:b/>
+                <w:sz w:val="21"/>
+              </w:rPr>
+              <w:t>Dropout</w:t>
+            </w:r>
+          </w:p>
+        </w:tc>
+        <w:tc>
+          <w:tcPr>
+            <w:tcW w:type="dxa" w:w="1389"/>
+            <w:vAlign w:val="center"/>
+            <w:tcBorders>
+              <w:bottom w:val="single" w:sz="6"/>
+            </w:tcBorders>
+          </w:tcPr>
+          <w:p>
+            <w:pPr>
+              <w:keepNext/>
+              <w:spacing w:after="60" w:before="60" w:line="240" w:lineRule="auto"/>
+              <w:ind w:firstLine="0"/>
+              <w:jc w:val="center"/>
+            </w:pPr>
+            <w:r>
+              <w:rPr>
+                <w:b/>
+                <w:sz w:val="21"/>
+              </w:rPr>
+              <w:t>融合维数</w:t>
+            </w:r>
+          </w:p>
+        </w:tc>
+        <w:tc>
+          <w:tcPr>
+            <w:tcW w:type="dxa" w:w="1449"/>
+            <w:vAlign w:val="center"/>
+            <w:tcBorders>
+              <w:bottom w:val="single" w:sz="6"/>
+            </w:tcBorders>
+          </w:tcPr>
+          <w:p>
+            <w:pPr>
+              <w:keepNext/>
+              <w:spacing w:after="60" w:before="60" w:line="240" w:lineRule="auto"/>
+              <w:ind w:firstLine="0"/>
+              <w:jc w:val="center"/>
+            </w:pPr>
+            <w:r>
+              <w:rPr>
+                <w:b/>
+                <w:sz w:val="21"/>
+              </w:rPr>
+              <w:t>分类权重</w:t>
+            </w:r>
+          </w:p>
+        </w:tc>
+        <w:tc>
+          <w:tcPr>
+            <w:tcW w:type="dxa" w:w="1509"/>
+            <w:vAlign w:val="center"/>
+            <w:tcBorders>
+              <w:bottom w:val="single" w:sz="6"/>
+            </w:tcBorders>
+          </w:tcPr>
+          <w:p>
+            <w:pPr>
+              <w:keepNext/>
+              <w:spacing w:after="60" w:before="60" w:line="240" w:lineRule="auto"/>
+              <w:ind w:firstLine="0"/>
+              <w:jc w:val="center"/>
+            </w:pPr>
+            <w:r>
+              <w:rPr>
+                <w:b/>
+                <w:sz w:val="21"/>
+              </w:rPr>
+              <w:t>选中/实训</w:t>
+            </w:r>
+          </w:p>
+        </w:tc>
+      </w:tr>
+      <w:tr>
+        <w:trPr>
+          <w:cantSplit/>
+        </w:trPr>
+        <w:tc>
+          <w:tcPr>
+            <w:tcW w:type="dxa" w:w="664"/>
+            <w:vAlign w:val="center"/>
+          </w:tcPr>
+          <w:p>
+            <w:pPr>
+              <w:keepNext/>
+              <w:spacing w:after="60" w:before="60" w:line="240" w:lineRule="auto"/>
+              <w:ind w:firstLine="0"/>
+              <w:jc w:val="center"/>
+            </w:pPr>
+            <w:r>
+              <w:rPr>
+                <w:b w:val="0"/>
+                <w:sz w:val="21"/>
+              </w:rPr>
+              <w:t>S0</w:t>
+            </w:r>
+          </w:p>
+        </w:tc>
+        <w:tc>
+          <w:tcPr>
+            <w:tcW w:type="dxa" w:w="1509"/>
+            <w:vAlign w:val="center"/>
+          </w:tcPr>
+          <w:p>
+            <w:pPr>
+              <w:keepNext/>
+              <w:spacing w:after="60" w:before="60" w:line="240" w:lineRule="auto"/>
+              <w:ind w:firstLine="0"/>
+              <w:jc w:val="center"/>
+            </w:pPr>
+            <w:r>
+              <w:rPr>
+                <w:b w:val="0"/>
+                <w:sz w:val="21"/>
+              </w:rPr>
+              <w:t>SELF-MM</w:t>
+            </w:r>
+          </w:p>
+        </w:tc>
+        <w:tc>
+          <w:tcPr>
+            <w:tcW w:type="dxa" w:w="1509"/>
+            <w:vAlign w:val="center"/>
+          </w:tcPr>
+          <w:p>
+            <w:pPr>
+              <w:keepNext/>
+              <w:spacing w:after="60" w:before="60" w:line="240" w:lineRule="auto"/>
+              <w:ind w:firstLine="0"/>
+              <w:jc w:val="center"/>
+            </w:pPr>
+            <w:r>
+              <w:rPr>
+                <w:b w:val="0"/>
+                <w:sz w:val="21"/>
+              </w:rPr>
+              <w:t>1e-05</w:t>
+            </w:r>
+          </w:p>
+        </w:tc>
+        <w:tc>
+          <w:tcPr>
+            <w:tcW w:type="dxa" w:w="1268"/>
+            <w:vAlign w:val="center"/>
+          </w:tcPr>
+          <w:p>
+            <w:pPr>
+              <w:keepNext/>
+              <w:spacing w:after="60" w:before="60" w:line="240" w:lineRule="auto"/>
+              <w:ind w:firstLine="0"/>
+              <w:jc w:val="center"/>
+            </w:pPr>
+            <w:r>
+              <w:rPr>
+                <w:b w:val="0"/>
+                <w:sz w:val="21"/>
+              </w:rPr>
+              <w:t>0.1</w:t>
+            </w:r>
+          </w:p>
+        </w:tc>
+        <w:tc>
+          <w:tcPr>
+            <w:tcW w:type="dxa" w:w="1389"/>
+            <w:vAlign w:val="center"/>
+          </w:tcPr>
+          <w:p>
+            <w:pPr>
+              <w:keepNext/>
+              <w:spacing w:after="60" w:before="60" w:line="240" w:lineRule="auto"/>
+              <w:ind w:firstLine="0"/>
+              <w:jc w:val="center"/>
+            </w:pPr>
+            <w:r>
+              <w:rPr>
+                <w:b w:val="0"/>
+                <w:sz w:val="21"/>
+              </w:rPr>
+              <w:t>128</w:t>
+            </w:r>
+          </w:p>
+        </w:tc>
+        <w:tc>
+          <w:tcPr>
+            <w:tcW w:type="dxa" w:w="1449"/>
+            <w:vAlign w:val="center"/>
+          </w:tcPr>
+          <w:p>
+            <w:pPr>
+              <w:keepNext/>
+              <w:spacing w:after="60" w:before="60" w:line="240" w:lineRule="auto"/>
+              <w:ind w:firstLine="0"/>
+              <w:jc w:val="center"/>
+            </w:pPr>
+            <w:r>
+              <w:rPr>
+                <w:b w:val="0"/>
+                <w:sz w:val="21"/>
+              </w:rPr>
+              <w:t>0.0</w:t>
+            </w:r>
+          </w:p>
+        </w:tc>
+        <w:tc>
+          <w:tcPr>
+            <w:tcW w:type="dxa" w:w="1509"/>
+            <w:vAlign w:val="center"/>
+          </w:tcPr>
+          <w:p>
+            <w:pPr>
+              <w:keepNext/>
+              <w:spacing w:after="60" w:before="60" w:line="240" w:lineRule="auto"/>
+              <w:ind w:firstLine="0"/>
+              <w:jc w:val="center"/>
+            </w:pPr>
+            <w:r>
+              <w:rPr>
+                <w:b w:val="0"/>
+                <w:sz w:val="21"/>
+              </w:rPr>
+              <w:t>3/7</w:t>
+            </w:r>
+          </w:p>
+        </w:tc>
+      </w:tr>
+      <w:tr>
+        <w:trPr>
+          <w:cantSplit/>
+        </w:trPr>
+        <w:tc>
+          <w:tcPr>
+            <w:tcW w:type="dxa" w:w="664"/>
+            <w:vAlign w:val="center"/>
+          </w:tcPr>
+          <w:p>
+            <w:pPr>
+              <w:keepNext/>
+              <w:spacing w:after="60" w:before="60" w:line="240" w:lineRule="auto"/>
+              <w:ind w:firstLine="0"/>
+              <w:jc w:val="center"/>
+            </w:pPr>
+            <w:r>
+              <w:rPr>
+                <w:b w:val="0"/>
+                <w:sz w:val="21"/>
+              </w:rPr>
+              <w:t>S1</w:t>
+            </w:r>
+          </w:p>
+        </w:tc>
+        <w:tc>
+          <w:tcPr>
+            <w:tcW w:type="dxa" w:w="1509"/>
+            <w:vAlign w:val="center"/>
+          </w:tcPr>
+          <w:p>
+            <w:pPr>
+              <w:keepNext/>
+              <w:spacing w:after="60" w:before="60" w:line="240" w:lineRule="auto"/>
+              <w:ind w:firstLine="0"/>
+              <w:jc w:val="center"/>
+            </w:pPr>
+            <w:r>
+              <w:rPr>
+                <w:b w:val="0"/>
+                <w:sz w:val="21"/>
+              </w:rPr>
+              <w:t>SELF-MM</w:t>
+            </w:r>
+          </w:p>
+        </w:tc>
+        <w:tc>
+          <w:tcPr>
+            <w:tcW w:type="dxa" w:w="1509"/>
+            <w:vAlign w:val="center"/>
+          </w:tcPr>
+          <w:p>
+            <w:pPr>
+              <w:keepNext/>
+              <w:spacing w:after="60" w:before="60" w:line="240" w:lineRule="auto"/>
+              <w:ind w:firstLine="0"/>
+              <w:jc w:val="center"/>
+            </w:pPr>
+            <w:r>
+              <w:rPr>
+                <w:b w:val="0"/>
+                <w:sz w:val="21"/>
+              </w:rPr>
+              <w:t>2e-05</w:t>
+            </w:r>
+          </w:p>
+        </w:tc>
+        <w:tc>
+          <w:tcPr>
+            <w:tcW w:type="dxa" w:w="1268"/>
+            <w:vAlign w:val="center"/>
+          </w:tcPr>
+          <w:p>
+            <w:pPr>
+              <w:keepNext/>
+              <w:spacing w:after="60" w:before="60" w:line="240" w:lineRule="auto"/>
+              <w:ind w:firstLine="0"/>
+              <w:jc w:val="center"/>
+            </w:pPr>
+            <w:r>
+              <w:rPr>
+                <w:b w:val="0"/>
+                <w:sz w:val="21"/>
+              </w:rPr>
+              <w:t>0.1</w:t>
+            </w:r>
+          </w:p>
+        </w:tc>
+        <w:tc>
+          <w:tcPr>
+            <w:tcW w:type="dxa" w:w="1389"/>
+            <w:vAlign w:val="center"/>
+          </w:tcPr>
+          <w:p>
+            <w:pPr>
+              <w:keepNext/>
+              <w:spacing w:after="60" w:before="60" w:line="240" w:lineRule="auto"/>
+              <w:ind w:firstLine="0"/>
+              <w:jc w:val="center"/>
+            </w:pPr>
+            <w:r>
+              <w:rPr>
+                <w:b w:val="0"/>
+                <w:sz w:val="21"/>
+              </w:rPr>
+              <w:t>128</w:t>
+            </w:r>
+          </w:p>
+        </w:tc>
+        <w:tc>
+          <w:tcPr>
+            <w:tcW w:type="dxa" w:w="1449"/>
+            <w:vAlign w:val="center"/>
+          </w:tcPr>
+          <w:p>
+            <w:pPr>
+              <w:keepNext/>
+              <w:spacing w:after="60" w:before="60" w:line="240" w:lineRule="auto"/>
+              <w:ind w:firstLine="0"/>
+              <w:jc w:val="center"/>
+            </w:pPr>
+            <w:r>
+              <w:rPr>
+                <w:b w:val="0"/>
+                <w:sz w:val="21"/>
+              </w:rPr>
+              <w:t>0.35</w:t>
+            </w:r>
+          </w:p>
+        </w:tc>
+        <w:tc>
+          <w:tcPr>
+            <w:tcW w:type="dxa" w:w="1509"/>
+            <w:vAlign w:val="center"/>
+          </w:tcPr>
+          <w:p>
+            <w:pPr>
+              <w:keepNext/>
+              <w:spacing w:after="60" w:before="60" w:line="240" w:lineRule="auto"/>
+              <w:ind w:firstLine="0"/>
+              <w:jc w:val="center"/>
+            </w:pPr>
+            <w:r>
+              <w:rPr>
+                <w:b w:val="0"/>
+                <w:sz w:val="21"/>
+              </w:rPr>
+              <w:t>1/10</w:t>
+            </w:r>
+          </w:p>
+        </w:tc>
+      </w:tr>
+      <w:tr>
+        <w:trPr>
+          <w:cantSplit/>
+        </w:trPr>
+        <w:tc>
+          <w:tcPr>
+            <w:tcW w:type="dxa" w:w="664"/>
+            <w:vAlign w:val="center"/>
+          </w:tcPr>
+          <w:p>
+            <w:pPr>
+              <w:keepNext/>
+              <w:spacing w:after="60" w:before="60" w:line="240" w:lineRule="auto"/>
+              <w:ind w:firstLine="0"/>
+              <w:jc w:val="center"/>
+            </w:pPr>
+            <w:r>
+              <w:rPr>
+                <w:b w:val="0"/>
+                <w:sz w:val="21"/>
+              </w:rPr>
+              <w:t>S2</w:t>
+            </w:r>
+          </w:p>
+        </w:tc>
+        <w:tc>
+          <w:tcPr>
+            <w:tcW w:type="dxa" w:w="1509"/>
+            <w:vAlign w:val="center"/>
+          </w:tcPr>
+          <w:p>
+            <w:pPr>
+              <w:keepNext/>
+              <w:spacing w:after="60" w:before="60" w:line="240" w:lineRule="auto"/>
+              <w:ind w:firstLine="0"/>
+              <w:jc w:val="center"/>
+            </w:pPr>
+            <w:r>
+              <w:rPr>
+                <w:b w:val="0"/>
+                <w:sz w:val="21"/>
+              </w:rPr>
+              <w:t>SELF-MM</w:t>
+            </w:r>
+          </w:p>
+        </w:tc>
+        <w:tc>
+          <w:tcPr>
+            <w:tcW w:type="dxa" w:w="1509"/>
+            <w:vAlign w:val="center"/>
+          </w:tcPr>
+          <w:p>
+            <w:pPr>
+              <w:keepNext/>
+              <w:spacing w:after="60" w:before="60" w:line="240" w:lineRule="auto"/>
+              <w:ind w:firstLine="0"/>
+              <w:jc w:val="center"/>
+            </w:pPr>
+            <w:r>
+              <w:rPr>
+                <w:b w:val="0"/>
+                <w:sz w:val="21"/>
+              </w:rPr>
+              <w:t>1e-05</w:t>
+            </w:r>
+          </w:p>
+        </w:tc>
+        <w:tc>
+          <w:tcPr>
+            <w:tcW w:type="dxa" w:w="1268"/>
+            <w:vAlign w:val="center"/>
+          </w:tcPr>
+          <w:p>
+            <w:pPr>
+              <w:keepNext/>
+              <w:spacing w:after="60" w:before="60" w:line="240" w:lineRule="auto"/>
+              <w:ind w:firstLine="0"/>
+              <w:jc w:val="center"/>
+            </w:pPr>
+            <w:r>
+              <w:rPr>
+                <w:b w:val="0"/>
+                <w:sz w:val="21"/>
+              </w:rPr>
+              <w:t>0.15</w:t>
+            </w:r>
+          </w:p>
+        </w:tc>
+        <w:tc>
+          <w:tcPr>
+            <w:tcW w:type="dxa" w:w="1389"/>
+            <w:vAlign w:val="center"/>
+          </w:tcPr>
+          <w:p>
+            <w:pPr>
+              <w:keepNext/>
+              <w:spacing w:after="60" w:before="60" w:line="240" w:lineRule="auto"/>
+              <w:ind w:firstLine="0"/>
+              <w:jc w:val="center"/>
+            </w:pPr>
+            <w:r>
+              <w:rPr>
+                <w:b w:val="0"/>
+                <w:sz w:val="21"/>
+              </w:rPr>
+              <w:t>128</w:t>
+            </w:r>
+          </w:p>
+        </w:tc>
+        <w:tc>
+          <w:tcPr>
+            <w:tcW w:type="dxa" w:w="1449"/>
+            <w:vAlign w:val="center"/>
+          </w:tcPr>
+          <w:p>
+            <w:pPr>
+              <w:keepNext/>
+              <w:spacing w:after="60" w:before="60" w:line="240" w:lineRule="auto"/>
+              <w:ind w:firstLine="0"/>
+              <w:jc w:val="center"/>
+            </w:pPr>
+            <w:r>
+              <w:rPr>
+                <w:b w:val="0"/>
+                <w:sz w:val="21"/>
+              </w:rPr>
+              <w:t>0.2</w:t>
+            </w:r>
+          </w:p>
+        </w:tc>
+        <w:tc>
+          <w:tcPr>
+            <w:tcW w:type="dxa" w:w="1509"/>
+            <w:vAlign w:val="center"/>
+          </w:tcPr>
+          <w:p>
+            <w:pPr>
+              <w:keepNext/>
+              <w:spacing w:after="60" w:before="60" w:line="240" w:lineRule="auto"/>
+              <w:ind w:firstLine="0"/>
+              <w:jc w:val="center"/>
+            </w:pPr>
+            <w:r>
+              <w:rPr>
+                <w:b w:val="0"/>
+                <w:sz w:val="21"/>
+              </w:rPr>
+              <w:t>5/9</w:t>
+            </w:r>
+          </w:p>
+        </w:tc>
+      </w:tr>
+      <w:tr>
+        <w:trPr>
+          <w:cantSplit/>
+        </w:trPr>
+        <w:tc>
+          <w:tcPr>
+            <w:tcW w:type="dxa" w:w="664"/>
+            <w:vAlign w:val="center"/>
+          </w:tcPr>
+          <w:p>
+            <w:pPr>
+              <w:keepNext/>
+              <w:spacing w:after="60" w:before="60" w:line="240" w:lineRule="auto"/>
+              <w:ind w:firstLine="0"/>
+              <w:jc w:val="center"/>
+            </w:pPr>
+            <w:r>
+              <w:rPr>
+                <w:b w:val="0"/>
+                <w:sz w:val="21"/>
+              </w:rPr>
+              <w:t>S3</w:t>
+            </w:r>
+          </w:p>
+        </w:tc>
+        <w:tc>
+          <w:tcPr>
+            <w:tcW w:type="dxa" w:w="1509"/>
+            <w:vAlign w:val="center"/>
+          </w:tcPr>
+          <w:p>
+            <w:pPr>
+              <w:keepNext/>
+              <w:spacing w:after="60" w:before="60" w:line="240" w:lineRule="auto"/>
+              <w:ind w:firstLine="0"/>
+              <w:jc w:val="center"/>
+            </w:pPr>
+            <w:r>
+              <w:rPr>
+                <w:b w:val="0"/>
+                <w:sz w:val="21"/>
+              </w:rPr>
+              <w:t>SELF-MM</w:t>
+            </w:r>
+          </w:p>
+        </w:tc>
+        <w:tc>
+          <w:tcPr>
+            <w:tcW w:type="dxa" w:w="1509"/>
+            <w:vAlign w:val="center"/>
+          </w:tcPr>
+          <w:p>
+            <w:pPr>
+              <w:keepNext/>
+              <w:spacing w:after="60" w:before="60" w:line="240" w:lineRule="auto"/>
+              <w:ind w:firstLine="0"/>
+              <w:jc w:val="center"/>
+            </w:pPr>
+            <w:r>
+              <w:rPr>
+                <w:b w:val="0"/>
+                <w:sz w:val="21"/>
+              </w:rPr>
+              <w:t>1e-05</w:t>
+            </w:r>
+          </w:p>
+        </w:tc>
+        <w:tc>
+          <w:tcPr>
+            <w:tcW w:type="dxa" w:w="1268"/>
+            <w:vAlign w:val="center"/>
+          </w:tcPr>
+          <w:p>
+            <w:pPr>
+              <w:keepNext/>
+              <w:spacing w:after="60" w:before="60" w:line="240" w:lineRule="auto"/>
+              <w:ind w:firstLine="0"/>
+              <w:jc w:val="center"/>
+            </w:pPr>
+            <w:r>
+              <w:rPr>
+                <w:b w:val="0"/>
+                <w:sz w:val="21"/>
+              </w:rPr>
+              <w:t>0.1</w:t>
+            </w:r>
+          </w:p>
+        </w:tc>
+        <w:tc>
+          <w:tcPr>
+            <w:tcW w:type="dxa" w:w="1389"/>
+            <w:vAlign w:val="center"/>
+          </w:tcPr>
+          <w:p>
+            <w:pPr>
+              <w:keepNext/>
+              <w:spacing w:after="60" w:before="60" w:line="240" w:lineRule="auto"/>
+              <w:ind w:firstLine="0"/>
+              <w:jc w:val="center"/>
+            </w:pPr>
+            <w:r>
+              <w:rPr>
+                <w:b w:val="0"/>
+                <w:sz w:val="21"/>
+              </w:rPr>
+              <w:t>192</w:t>
+            </w:r>
+          </w:p>
+        </w:tc>
+        <w:tc>
+          <w:tcPr>
+            <w:tcW w:type="dxa" w:w="1449"/>
+            <w:vAlign w:val="center"/>
+          </w:tcPr>
+          <w:p>
+            <w:pPr>
+              <w:keepNext/>
+              <w:spacing w:after="60" w:before="60" w:line="240" w:lineRule="auto"/>
+              <w:ind w:firstLine="0"/>
+              <w:jc w:val="center"/>
+            </w:pPr>
+            <w:r>
+              <w:rPr>
+                <w:b w:val="0"/>
+                <w:sz w:val="21"/>
+              </w:rPr>
+              <w:t>0.35</w:t>
+            </w:r>
+          </w:p>
+        </w:tc>
+        <w:tc>
+          <w:tcPr>
+            <w:tcW w:type="dxa" w:w="1509"/>
+            <w:vAlign w:val="center"/>
+          </w:tcPr>
+          <w:p>
+            <w:pPr>
+              <w:keepNext/>
+              <w:spacing w:after="60" w:before="60" w:line="240" w:lineRule="auto"/>
+              <w:ind w:firstLine="0"/>
+              <w:jc w:val="center"/>
+            </w:pPr>
+            <w:r>
+              <w:rPr>
+                <w:b w:val="0"/>
+                <w:sz w:val="21"/>
+              </w:rPr>
+              <w:t>2/7</w:t>
+            </w:r>
+          </w:p>
+        </w:tc>
+      </w:tr>
+      <w:tr>
+        <w:trPr>
+          <w:cantSplit/>
+        </w:trPr>
+        <w:tc>
+          <w:tcPr>
+            <w:tcW w:type="dxa" w:w="664"/>
+            <w:vAlign w:val="center"/>
+          </w:tcPr>
+          <w:p>
+            <w:pPr>
+              <w:keepNext/>
+              <w:spacing w:after="60" w:before="60" w:line="240" w:lineRule="auto"/>
+              <w:ind w:firstLine="0"/>
+              <w:jc w:val="center"/>
+            </w:pPr>
+            <w:r>
+              <w:rPr>
+                <w:b w:val="0"/>
+                <w:sz w:val="21"/>
+              </w:rPr>
+              <w:t>S4</w:t>
+            </w:r>
+          </w:p>
+        </w:tc>
+        <w:tc>
+          <w:tcPr>
+            <w:tcW w:type="dxa" w:w="1509"/>
+            <w:vAlign w:val="center"/>
+          </w:tcPr>
+          <w:p>
+            <w:pPr>
+              <w:keepNext/>
+              <w:spacing w:after="60" w:before="60" w:line="240" w:lineRule="auto"/>
+              <w:ind w:firstLine="0"/>
+              <w:jc w:val="center"/>
+            </w:pPr>
+            <w:r>
+              <w:rPr>
+                <w:b w:val="0"/>
+                <w:sz w:val="21"/>
+              </w:rPr>
+              <w:t>SELF-MM</w:t>
+            </w:r>
+          </w:p>
+        </w:tc>
+        <w:tc>
+          <w:tcPr>
+            <w:tcW w:type="dxa" w:w="1509"/>
+            <w:vAlign w:val="center"/>
+          </w:tcPr>
+          <w:p>
+            <w:pPr>
+              <w:keepNext/>
+              <w:spacing w:after="60" w:before="60" w:line="240" w:lineRule="auto"/>
+              <w:ind w:firstLine="0"/>
+              <w:jc w:val="center"/>
+            </w:pPr>
+            <w:r>
+              <w:rPr>
+                <w:b w:val="0"/>
+                <w:sz w:val="21"/>
+              </w:rPr>
+              <w:t>2e-05</w:t>
+            </w:r>
+          </w:p>
+        </w:tc>
+        <w:tc>
+          <w:tcPr>
+            <w:tcW w:type="dxa" w:w="1268"/>
+            <w:vAlign w:val="center"/>
+          </w:tcPr>
+          <w:p>
+            <w:pPr>
+              <w:keepNext/>
+              <w:spacing w:after="60" w:before="60" w:line="240" w:lineRule="auto"/>
+              <w:ind w:firstLine="0"/>
+              <w:jc w:val="center"/>
+            </w:pPr>
+            <w:r>
+              <w:rPr>
+                <w:b w:val="0"/>
+                <w:sz w:val="21"/>
+              </w:rPr>
+              <w:t>0.25</w:t>
+            </w:r>
+          </w:p>
+        </w:tc>
+        <w:tc>
+          <w:tcPr>
+            <w:tcW w:type="dxa" w:w="1389"/>
+            <w:vAlign w:val="center"/>
+          </w:tcPr>
+          <w:p>
+            <w:pPr>
+              <w:keepNext/>
+              <w:spacing w:after="60" w:before="60" w:line="240" w:lineRule="auto"/>
+              <w:ind w:firstLine="0"/>
+              <w:jc w:val="center"/>
+            </w:pPr>
+            <w:r>
+              <w:rPr>
+                <w:b w:val="0"/>
+                <w:sz w:val="21"/>
+              </w:rPr>
+              <w:t>128</w:t>
+            </w:r>
+          </w:p>
+        </w:tc>
+        <w:tc>
+          <w:tcPr>
+            <w:tcW w:type="dxa" w:w="1449"/>
+            <w:vAlign w:val="center"/>
+          </w:tcPr>
+          <w:p>
+            <w:pPr>
+              <w:keepNext/>
+              <w:spacing w:after="60" w:before="60" w:line="240" w:lineRule="auto"/>
+              <w:ind w:firstLine="0"/>
+              <w:jc w:val="center"/>
+            </w:pPr>
+            <w:r>
+              <w:rPr>
+                <w:b w:val="0"/>
+                <w:sz w:val="21"/>
+              </w:rPr>
+              <w:t>0.5</w:t>
+            </w:r>
+          </w:p>
+        </w:tc>
+        <w:tc>
+          <w:tcPr>
+            <w:tcW w:type="dxa" w:w="1509"/>
+            <w:vAlign w:val="center"/>
+          </w:tcPr>
+          <w:p>
+            <w:pPr>
+              <w:keepNext/>
+              <w:spacing w:after="60" w:before="60" w:line="240" w:lineRule="auto"/>
+              <w:ind w:firstLine="0"/>
+              <w:jc w:val="center"/>
+            </w:pPr>
+            <w:r>
+              <w:rPr>
+                <w:b w:val="0"/>
+                <w:sz w:val="21"/>
+              </w:rPr>
+              <w:t>4/8</w:t>
+            </w:r>
+          </w:p>
+        </w:tc>
+      </w:tr>
+      <w:tr>
+        <w:trPr>
+          <w:cantSplit/>
+        </w:trPr>
+        <w:tc>
+          <w:tcPr>
+            <w:tcW w:type="dxa" w:w="664"/>
+            <w:vAlign w:val="center"/>
+          </w:tcPr>
+          <w:p>
+            <w:pPr>
+              <w:keepNext/>
+              <w:spacing w:after="60" w:before="60" w:line="240" w:lineRule="auto"/>
+              <w:ind w:firstLine="0"/>
+              <w:jc w:val="center"/>
+            </w:pPr>
+            <w:r>
+              <w:rPr>
+                <w:b w:val="0"/>
+                <w:sz w:val="21"/>
+              </w:rPr>
+              <w:t>S5</w:t>
+            </w:r>
+          </w:p>
+        </w:tc>
+        <w:tc>
+          <w:tcPr>
+            <w:tcW w:type="dxa" w:w="1509"/>
+            <w:vAlign w:val="center"/>
+          </w:tcPr>
+          <w:p>
+            <w:pPr>
+              <w:keepNext/>
+              <w:spacing w:after="60" w:before="60" w:line="240" w:lineRule="auto"/>
+              <w:ind w:firstLine="0"/>
+              <w:jc w:val="center"/>
+            </w:pPr>
+            <w:r>
+              <w:rPr>
+                <w:b w:val="0"/>
+                <w:sz w:val="21"/>
+              </w:rPr>
+              <w:t>SELF-MM</w:t>
+            </w:r>
+          </w:p>
+        </w:tc>
+        <w:tc>
+          <w:tcPr>
+            <w:tcW w:type="dxa" w:w="1509"/>
+            <w:vAlign w:val="center"/>
+          </w:tcPr>
+          <w:p>
+            <w:pPr>
+              <w:keepNext/>
+              <w:spacing w:after="60" w:before="60" w:line="240" w:lineRule="auto"/>
+              <w:ind w:firstLine="0"/>
+              <w:jc w:val="center"/>
+            </w:pPr>
+            <w:r>
+              <w:rPr>
+                <w:b w:val="0"/>
+                <w:sz w:val="21"/>
+              </w:rPr>
+              <w:t>2e-05</w:t>
+            </w:r>
+          </w:p>
+        </w:tc>
+        <w:tc>
+          <w:tcPr>
+            <w:tcW w:type="dxa" w:w="1268"/>
+            <w:vAlign w:val="center"/>
+          </w:tcPr>
+          <w:p>
+            <w:pPr>
+              <w:keepNext/>
+              <w:spacing w:after="60" w:before="60" w:line="240" w:lineRule="auto"/>
+              <w:ind w:firstLine="0"/>
+              <w:jc w:val="center"/>
+            </w:pPr>
+            <w:r>
+              <w:rPr>
+                <w:b w:val="0"/>
+                <w:sz w:val="21"/>
+              </w:rPr>
+              <w:t>0.25</w:t>
+            </w:r>
+          </w:p>
+        </w:tc>
+        <w:tc>
+          <w:tcPr>
+            <w:tcW w:type="dxa" w:w="1389"/>
+            <w:vAlign w:val="center"/>
+          </w:tcPr>
+          <w:p>
+            <w:pPr>
+              <w:keepNext/>
+              <w:spacing w:after="60" w:before="60" w:line="240" w:lineRule="auto"/>
+              <w:ind w:firstLine="0"/>
+              <w:jc w:val="center"/>
+            </w:pPr>
+            <w:r>
+              <w:rPr>
+                <w:b w:val="0"/>
+                <w:sz w:val="21"/>
+              </w:rPr>
+              <w:t>128</w:t>
+            </w:r>
+          </w:p>
+        </w:tc>
+        <w:tc>
+          <w:tcPr>
+            <w:tcW w:type="dxa" w:w="1449"/>
+            <w:vAlign w:val="center"/>
+          </w:tcPr>
+          <w:p>
+            <w:pPr>
+              <w:keepNext/>
+              <w:spacing w:after="60" w:before="60" w:line="240" w:lineRule="auto"/>
+              <w:ind w:firstLine="0"/>
+              <w:jc w:val="center"/>
+            </w:pPr>
+            <w:r>
+              <w:rPr>
+                <w:b w:val="0"/>
+                <w:sz w:val="21"/>
+              </w:rPr>
+              <w:t>0.5</w:t>
+            </w:r>
+          </w:p>
+        </w:tc>
+        <w:tc>
+          <w:tcPr>
+            <w:tcW w:type="dxa" w:w="1509"/>
+            <w:vAlign w:val="center"/>
+          </w:tcPr>
+          <w:p>
+            <w:pPr>
+              <w:keepNext/>
+              <w:spacing w:after="60" w:before="60" w:line="240" w:lineRule="auto"/>
+              <w:ind w:firstLine="0"/>
+              <w:jc w:val="center"/>
+            </w:pPr>
+            <w:r>
+              <w:rPr>
+                <w:b w:val="0"/>
+                <w:sz w:val="21"/>
+              </w:rPr>
+              <w:t>3/7</w:t>
+            </w:r>
+          </w:p>
+        </w:tc>
+      </w:tr>
+      <w:tr>
+        <w:trPr>
+          <w:cantSplit/>
+        </w:trPr>
+        <w:tc>
+          <w:tcPr>
+            <w:tcW w:type="dxa" w:w="664"/>
+            <w:vAlign w:val="center"/>
+          </w:tcPr>
+          <w:p>
+            <w:pPr>
+              <w:keepNext/>
+              <w:spacing w:after="60" w:before="60" w:line="240" w:lineRule="auto"/>
+              <w:ind w:firstLine="0"/>
+              <w:jc w:val="center"/>
+            </w:pPr>
+            <w:r>
+              <w:rPr>
+                <w:b w:val="0"/>
+                <w:sz w:val="21"/>
+              </w:rPr>
+              <w:t>T0</w:t>
+            </w:r>
+          </w:p>
+        </w:tc>
+        <w:tc>
+          <w:tcPr>
+            <w:tcW w:type="dxa" w:w="1509"/>
+            <w:vAlign w:val="center"/>
+          </w:tcPr>
+          <w:p>
+            <w:pPr>
+              <w:keepNext/>
+              <w:spacing w:after="60" w:before="60" w:line="240" w:lineRule="auto"/>
+              <w:ind w:firstLine="0"/>
+              <w:jc w:val="center"/>
+            </w:pPr>
+            <w:r>
+              <w:rPr>
+                <w:b w:val="0"/>
+                <w:sz w:val="21"/>
+              </w:rPr>
+              <w:t>TETFN</w:t>
+            </w:r>
+          </w:p>
+        </w:tc>
+        <w:tc>
+          <w:tcPr>
+            <w:tcW w:type="dxa" w:w="1509"/>
+            <w:vAlign w:val="center"/>
+          </w:tcPr>
+          <w:p>
+            <w:pPr>
+              <w:keepNext/>
+              <w:spacing w:after="60" w:before="60" w:line="240" w:lineRule="auto"/>
+              <w:ind w:firstLine="0"/>
+              <w:jc w:val="center"/>
+            </w:pPr>
+            <w:r>
+              <w:rPr>
+                <w:b w:val="0"/>
+                <w:sz w:val="21"/>
+              </w:rPr>
+              <w:t>1e-05</w:t>
+            </w:r>
+          </w:p>
+        </w:tc>
+        <w:tc>
+          <w:tcPr>
+            <w:tcW w:type="dxa" w:w="1268"/>
+            <w:vAlign w:val="center"/>
+          </w:tcPr>
+          <w:p>
+            <w:pPr>
+              <w:keepNext/>
+              <w:spacing w:after="60" w:before="60" w:line="240" w:lineRule="auto"/>
+              <w:ind w:firstLine="0"/>
+              <w:jc w:val="center"/>
+            </w:pPr>
+            <w:r>
+              <w:rPr>
+                <w:b w:val="0"/>
+                <w:sz w:val="21"/>
+              </w:rPr>
+              <w:t>0.1</w:t>
+            </w:r>
+          </w:p>
+        </w:tc>
+        <w:tc>
+          <w:tcPr>
+            <w:tcW w:type="dxa" w:w="1389"/>
+            <w:vAlign w:val="center"/>
+          </w:tcPr>
+          <w:p>
+            <w:pPr>
+              <w:keepNext/>
+              <w:spacing w:after="60" w:before="60" w:line="240" w:lineRule="auto"/>
+              <w:ind w:firstLine="0"/>
+              <w:jc w:val="center"/>
+            </w:pPr>
+            <w:r>
+              <w:rPr>
+                <w:b w:val="0"/>
+                <w:sz w:val="21"/>
+              </w:rPr>
+              <w:t>64</w:t>
+            </w:r>
+          </w:p>
+        </w:tc>
+        <w:tc>
+          <w:tcPr>
+            <w:tcW w:type="dxa" w:w="1449"/>
+            <w:vAlign w:val="center"/>
+          </w:tcPr>
+          <w:p>
+            <w:pPr>
+              <w:keepNext/>
+              <w:spacing w:after="60" w:before="60" w:line="240" w:lineRule="auto"/>
+              <w:ind w:firstLine="0"/>
+              <w:jc w:val="center"/>
+            </w:pPr>
+            <w:r>
+              <w:rPr>
+                <w:b w:val="0"/>
+                <w:sz w:val="21"/>
+              </w:rPr>
+              <w:t>0.5</w:t>
+            </w:r>
+          </w:p>
+        </w:tc>
+        <w:tc>
+          <w:tcPr>
+            <w:tcW w:type="dxa" w:w="1509"/>
+            <w:vAlign w:val="center"/>
+          </w:tcPr>
+          <w:p>
+            <w:pPr>
+              <w:keepNext/>
+              <w:spacing w:after="60" w:before="60" w:line="240" w:lineRule="auto"/>
+              <w:ind w:firstLine="0"/>
+              <w:jc w:val="center"/>
+            </w:pPr>
+            <w:r>
+              <w:rPr>
+                <w:b w:val="0"/>
+                <w:sz w:val="21"/>
+              </w:rPr>
+              <w:t>2/7</w:t>
+            </w:r>
+          </w:p>
+        </w:tc>
+      </w:tr>
+      <w:tr>
+        <w:trPr>
+          <w:cantSplit/>
+        </w:trPr>
+        <w:tc>
+          <w:tcPr>
+            <w:tcW w:type="dxa" w:w="664"/>
+            <w:vAlign w:val="center"/>
+          </w:tcPr>
+          <w:p>
+            <w:pPr>
+              <w:keepNext w:val="0"/>
+              <w:spacing w:after="60" w:before="60" w:line="240" w:lineRule="auto"/>
+              <w:ind w:firstLine="0"/>
+              <w:jc w:val="center"/>
+            </w:pPr>
+            <w:r>
+              <w:rPr>
+                <w:b w:val="0"/>
+                <w:sz w:val="21"/>
+              </w:rPr>
+              <w:t>T1</w:t>
+            </w:r>
+          </w:p>
+        </w:tc>
+        <w:tc>
+          <w:tcPr>
+            <w:tcW w:type="dxa" w:w="1509"/>
+            <w:vAlign w:val="center"/>
+          </w:tcPr>
+          <w:p>
+            <w:pPr>
+              <w:keepNext w:val="0"/>
+              <w:spacing w:after="60" w:before="60" w:line="240" w:lineRule="auto"/>
+              <w:ind w:firstLine="0"/>
+              <w:jc w:val="center"/>
+            </w:pPr>
+            <w:r>
+              <w:rPr>
+                <w:b w:val="0"/>
+                <w:sz w:val="21"/>
+              </w:rPr>
+              <w:t>TETFN</w:t>
+            </w:r>
+          </w:p>
+        </w:tc>
+        <w:tc>
+          <w:tcPr>
+            <w:tcW w:type="dxa" w:w="1509"/>
+            <w:vAlign w:val="center"/>
+          </w:tcPr>
+          <w:p>
+            <w:pPr>
+              <w:keepNext w:val="0"/>
+              <w:spacing w:after="60" w:before="60" w:line="240" w:lineRule="auto"/>
+              <w:ind w:firstLine="0"/>
+              <w:jc w:val="center"/>
+            </w:pPr>
+            <w:r>
+              <w:rPr>
+                <w:b w:val="0"/>
+                <w:sz w:val="21"/>
+              </w:rPr>
+              <w:t>2e-05</w:t>
+            </w:r>
+          </w:p>
+        </w:tc>
+        <w:tc>
+          <w:tcPr>
+            <w:tcW w:type="dxa" w:w="1268"/>
+            <w:vAlign w:val="center"/>
+          </w:tcPr>
+          <w:p>
+            <w:pPr>
+              <w:keepNext w:val="0"/>
+              <w:spacing w:after="60" w:before="60" w:line="240" w:lineRule="auto"/>
+              <w:ind w:firstLine="0"/>
+              <w:jc w:val="center"/>
+            </w:pPr>
+            <w:r>
+              <w:rPr>
+                <w:b w:val="0"/>
+                <w:sz w:val="21"/>
+              </w:rPr>
+              <w:t>0.2</w:t>
+            </w:r>
+          </w:p>
+        </w:tc>
+        <w:tc>
+          <w:tcPr>
+            <w:tcW w:type="dxa" w:w="1389"/>
+            <w:vAlign w:val="center"/>
+          </w:tcPr>
+          <w:p>
+            <w:pPr>
+              <w:keepNext w:val="0"/>
+              <w:spacing w:after="60" w:before="60" w:line="240" w:lineRule="auto"/>
+              <w:ind w:firstLine="0"/>
+              <w:jc w:val="center"/>
+            </w:pPr>
+            <w:r>
+              <w:rPr>
+                <w:b w:val="0"/>
+                <w:sz w:val="21"/>
+              </w:rPr>
+              <w:t>64</w:t>
+            </w:r>
+          </w:p>
+        </w:tc>
+        <w:tc>
+          <w:tcPr>
+            <w:tcW w:type="dxa" w:w="1449"/>
+            <w:vAlign w:val="center"/>
+          </w:tcPr>
+          <w:p>
+            <w:pPr>
+              <w:keepNext w:val="0"/>
+              <w:spacing w:after="60" w:before="60" w:line="240" w:lineRule="auto"/>
+              <w:ind w:firstLine="0"/>
+              <w:jc w:val="center"/>
+            </w:pPr>
+            <w:r>
+              <w:rPr>
+                <w:b w:val="0"/>
+                <w:sz w:val="21"/>
+              </w:rPr>
+              <w:t>0.5</w:t>
+            </w:r>
+          </w:p>
+        </w:tc>
+        <w:tc>
+          <w:tcPr>
+            <w:tcW w:type="dxa" w:w="1509"/>
+            <w:vAlign w:val="center"/>
+          </w:tcPr>
+          <w:p>
+            <w:pPr>
+              <w:keepNext w:val="0"/>
+              <w:spacing w:after="60" w:before="60" w:line="240" w:lineRule="auto"/>
+              <w:ind w:firstLine="0"/>
+              <w:jc w:val="center"/>
+            </w:pPr>
+            <w:r>
+              <w:rPr>
+                <w:b w:val="0"/>
+                <w:sz w:val="21"/>
+              </w:rPr>
+              <w:t>1/9</w:t>
+            </w:r>
+          </w:p>
+        </w:tc>
+      </w:tr>
+    </w:tbl>
+    <w:p>
+      <w:r>
+        <w:t>S0为无额外分类头的回归控制，S1为辅助分类监督，S2为温和辅助监督，S3为较宽融合层，S4为较强丢弃设置，S5为分组优化参考；T0、T1为两组源码TETFN配置。SELF-MM的Dropout作用于融合分支，TETFN该参数同时映射到多个网络丢弃位置，含义不能直接等同。S0、S5的音频/视觉/其他非BERT学习率分别为0.005、0.0001、0.001，BERT权重衰减为0.001、音视为0；S1、S3、S4非BERT学习率均为0.0003，S2为0.0002，其配置权重衰减为0.01。T0、T1非BERT学习率均为0.0003。完整配置与冻结策略见随附结果。</w:t>
+      </w:r>
+    </w:p>
+    <w:p>
+      <w:pPr>
+        <w:pStyle w:val="Caption"/>
+        <w:keepNext/>
+      </w:pPr>
+      <w:r>
+        <w:t>表11　各参数配置的验证与测试结果（F1均为Macro-F1）</w:t>
+      </w:r>
+    </w:p>
+    <w:tbl>
+      <w:tblPr>
+        <w:tblW w:type="auto" w:w="0"/>
+        <w:jc w:val="center"/>
+        <w:tblLayout w:type="fixed"/>
+        <w:tblLook w:firstColumn="1" w:firstRow="1" w:lastColumn="0" w:lastRow="0" w:noHBand="0" w:noVBand="1" w:val="04A0"/>
+        <w:tblBorders>
+          <w:top w:val="single" w:sz="10" w:color="000000"/>
+          <w:left w:val="nil" w:sz="10" w:color="000000"/>
+          <w:bottom w:val="single" w:sz="10" w:color="000000"/>
+          <w:right w:val="nil" w:sz="10" w:color="000000"/>
+          <w:insideH w:val="nil" w:sz="10" w:color="000000"/>
+          <w:insideV w:val="nil" w:sz="10" w:color="000000"/>
+        </w:tblBorders>
+      </w:tblPr>
+      <w:tblGrid>
+        <w:gridCol w:w="861"/>
+        <w:gridCol w:w="1521"/>
+        <w:gridCol w:w="1377"/>
+        <w:gridCol w:w="1320"/>
+        <w:gridCol w:w="1521"/>
+        <w:gridCol w:w="1377"/>
+        <w:gridCol w:w="1320"/>
+      </w:tblGrid>
+      <w:tr>
+        <w:trPr>
+          <w:tblHeader/>
+          <w:cantSplit/>
+        </w:trPr>
+        <w:tc>
+          <w:tcPr>
+            <w:tcW w:type="dxa" w:w="861"/>
+            <w:vAlign w:val="center"/>
+            <w:tcBorders>
+              <w:bottom w:val="single" w:sz="6"/>
+            </w:tcBorders>
+          </w:tcPr>
+          <w:p>
+            <w:pPr>
+              <w:keepNext/>
+              <w:spacing w:after="60" w:before="60" w:line="240" w:lineRule="auto"/>
+              <w:ind w:firstLine="0"/>
+              <w:jc w:val="center"/>
+            </w:pPr>
+            <w:r>
+              <w:rPr>
+                <w:b/>
+                <w:sz w:val="21"/>
+              </w:rPr>
+              <w:t>代号</w:t>
+            </w:r>
+          </w:p>
+        </w:tc>
+        <w:tc>
+          <w:tcPr>
+            <w:tcW w:type="dxa" w:w="1521"/>
+            <w:vAlign w:val="center"/>
+            <w:tcBorders>
+              <w:bottom w:val="single" w:sz="6"/>
+            </w:tcBorders>
+          </w:tcPr>
+          <w:p>
+            <w:pPr>
+              <w:keepNext/>
+              <w:spacing w:after="60" w:before="60" w:line="240" w:lineRule="auto"/>
+              <w:ind w:firstLine="0"/>
+              <w:jc w:val="center"/>
+            </w:pPr>
+            <w:r>
+              <w:rPr>
+                <w:b/>
+                <w:sz w:val="21"/>
+              </w:rPr>
+              <w:t>验证Acc(%)</w:t>
+            </w:r>
+          </w:p>
+        </w:tc>
+        <w:tc>
+          <w:tcPr>
+            <w:tcW w:type="dxa" w:w="1377"/>
+            <w:vAlign w:val="center"/>
+            <w:tcBorders>
+              <w:bottom w:val="single" w:sz="6"/>
+            </w:tcBorders>
+          </w:tcPr>
+          <w:p>
+            <w:pPr>
+              <w:keepNext/>
+              <w:spacing w:after="60" w:before="60" w:line="240" w:lineRule="auto"/>
+              <w:ind w:firstLine="0"/>
+              <w:jc w:val="center"/>
+            </w:pPr>
+            <w:r>
+              <w:rPr>
+                <w:b/>
+                <w:sz w:val="21"/>
+              </w:rPr>
+              <w:t>验证F1</w:t>
+            </w:r>
+          </w:p>
+        </w:tc>
+        <w:tc>
+          <w:tcPr>
+            <w:tcW w:type="dxa" w:w="1320"/>
+            <w:vAlign w:val="center"/>
+            <w:tcBorders>
+              <w:bottom w:val="single" w:sz="6"/>
+            </w:tcBorders>
+          </w:tcPr>
+          <w:p>
+            <w:pPr>
+              <w:keepNext/>
+              <w:spacing w:after="60" w:before="60" w:line="240" w:lineRule="auto"/>
+              <w:ind w:firstLine="0"/>
+              <w:jc w:val="center"/>
+            </w:pPr>
+            <w:r>
+              <w:rPr>
+                <w:b/>
+                <w:sz w:val="21"/>
+              </w:rPr>
+              <w:t>验证MAE</w:t>
+            </w:r>
+          </w:p>
+        </w:tc>
+        <w:tc>
+          <w:tcPr>
+            <w:tcW w:type="dxa" w:w="1521"/>
+            <w:vAlign w:val="center"/>
+            <w:tcBorders>
+              <w:bottom w:val="single" w:sz="6"/>
+            </w:tcBorders>
+          </w:tcPr>
+          <w:p>
+            <w:pPr>
+              <w:keepNext/>
+              <w:spacing w:after="60" w:before="60" w:line="240" w:lineRule="auto"/>
+              <w:ind w:firstLine="0"/>
+              <w:jc w:val="center"/>
+            </w:pPr>
+            <w:r>
+              <w:rPr>
+                <w:b/>
+                <w:sz w:val="21"/>
+              </w:rPr>
+              <w:t>测试Acc(%)</w:t>
+            </w:r>
+          </w:p>
+        </w:tc>
+        <w:tc>
+          <w:tcPr>
+            <w:tcW w:type="dxa" w:w="1377"/>
+            <w:vAlign w:val="center"/>
+            <w:tcBorders>
+              <w:bottom w:val="single" w:sz="6"/>
+            </w:tcBorders>
+          </w:tcPr>
+          <w:p>
+            <w:pPr>
+              <w:keepNext/>
+              <w:spacing w:after="60" w:before="60" w:line="240" w:lineRule="auto"/>
+              <w:ind w:firstLine="0"/>
+              <w:jc w:val="center"/>
+            </w:pPr>
+            <w:r>
+              <w:rPr>
+                <w:b/>
+                <w:sz w:val="21"/>
+              </w:rPr>
+              <w:t>测试F1</w:t>
+            </w:r>
+          </w:p>
+        </w:tc>
+        <w:tc>
+          <w:tcPr>
+            <w:tcW w:type="dxa" w:w="1320"/>
+            <w:vAlign w:val="center"/>
+            <w:tcBorders>
+              <w:bottom w:val="single" w:sz="6"/>
+            </w:tcBorders>
+          </w:tcPr>
+          <w:p>
+            <w:pPr>
+              <w:keepNext/>
+              <w:spacing w:after="60" w:before="60" w:line="240" w:lineRule="auto"/>
+              <w:ind w:firstLine="0"/>
+              <w:jc w:val="center"/>
+            </w:pPr>
+            <w:r>
+              <w:rPr>
+                <w:b/>
+                <w:sz w:val="21"/>
+              </w:rPr>
+              <w:t>测试MAE</w:t>
+            </w:r>
+          </w:p>
+        </w:tc>
+      </w:tr>
+      <w:tr>
+        <w:trPr>
+          <w:cantSplit/>
+        </w:trPr>
+        <w:tc>
+          <w:tcPr>
+            <w:tcW w:type="dxa" w:w="861"/>
+            <w:vAlign w:val="center"/>
+          </w:tcPr>
+          <w:p>
+            <w:pPr>
+              <w:keepNext/>
+              <w:spacing w:after="60" w:before="60" w:line="240" w:lineRule="auto"/>
+              <w:ind w:firstLine="0"/>
+              <w:jc w:val="center"/>
+            </w:pPr>
+            <w:r>
+              <w:rPr>
+                <w:b w:val="0"/>
+                <w:sz w:val="21"/>
+              </w:rPr>
+              <w:t>S0</w:t>
+            </w:r>
+          </w:p>
+        </w:tc>
+        <w:tc>
+          <w:tcPr>
+            <w:tcW w:type="dxa" w:w="1521"/>
+            <w:vAlign w:val="center"/>
+          </w:tcPr>
+          <w:p>
+            <w:pPr>
+              <w:keepNext/>
+              <w:spacing w:after="60" w:before="60" w:line="240" w:lineRule="auto"/>
+              <w:ind w:firstLine="0"/>
+              <w:jc w:val="center"/>
+            </w:pPr>
+            <w:r>
+              <w:rPr>
+                <w:b w:val="0"/>
+                <w:sz w:val="21"/>
+              </w:rPr>
+              <w:t>63.87</w:t>
+            </w:r>
+          </w:p>
+        </w:tc>
+        <w:tc>
+          <w:tcPr>
+            <w:tcW w:type="dxa" w:w="1377"/>
+            <w:vAlign w:val="center"/>
+          </w:tcPr>
+          <w:p>
+            <w:pPr>
+              <w:keepNext/>
+              <w:spacing w:after="60" w:before="60" w:line="240" w:lineRule="auto"/>
+              <w:ind w:firstLine="0"/>
+              <w:jc w:val="center"/>
+            </w:pPr>
+            <w:r>
+              <w:rPr>
+                <w:b w:val="0"/>
+                <w:sz w:val="21"/>
+              </w:rPr>
+              <w:t>0.6250</w:t>
+            </w:r>
+          </w:p>
+        </w:tc>
+        <w:tc>
+          <w:tcPr>
+            <w:tcW w:type="dxa" w:w="1320"/>
+            <w:vAlign w:val="center"/>
+          </w:tcPr>
+          <w:p>
+            <w:pPr>
+              <w:keepNext/>
+              <w:spacing w:after="60" w:before="60" w:line="240" w:lineRule="auto"/>
+              <w:ind w:firstLine="0"/>
+              <w:jc w:val="center"/>
+            </w:pPr>
+            <w:r>
+              <w:rPr>
+                <w:b w:val="0"/>
+                <w:sz w:val="21"/>
+              </w:rPr>
+              <w:t>0.5528</w:t>
+            </w:r>
+          </w:p>
+        </w:tc>
+        <w:tc>
+          <w:tcPr>
+            <w:tcW w:type="dxa" w:w="1521"/>
+            <w:vAlign w:val="center"/>
+          </w:tcPr>
+          <w:p>
+            <w:pPr>
+              <w:keepNext/>
+              <w:spacing w:after="60" w:before="60" w:line="240" w:lineRule="auto"/>
+              <w:ind w:firstLine="0"/>
+              <w:jc w:val="center"/>
+            </w:pPr>
+            <w:r>
+              <w:rPr>
+                <w:b w:val="0"/>
+                <w:sz w:val="21"/>
+              </w:rPr>
+              <w:t>65.89</w:t>
+            </w:r>
+          </w:p>
+        </w:tc>
+        <w:tc>
+          <w:tcPr>
+            <w:tcW w:type="dxa" w:w="1377"/>
+            <w:vAlign w:val="center"/>
+          </w:tcPr>
+          <w:p>
+            <w:pPr>
+              <w:keepNext/>
+              <w:spacing w:after="60" w:before="60" w:line="240" w:lineRule="auto"/>
+              <w:ind w:firstLine="0"/>
+              <w:jc w:val="center"/>
+            </w:pPr>
+            <w:r>
+              <w:rPr>
+                <w:b w:val="0"/>
+                <w:sz w:val="21"/>
+              </w:rPr>
+              <w:t>0.6300</w:t>
+            </w:r>
+          </w:p>
+        </w:tc>
+        <w:tc>
+          <w:tcPr>
+            <w:tcW w:type="dxa" w:w="1320"/>
+            <w:vAlign w:val="center"/>
+          </w:tcPr>
+          <w:p>
+            <w:pPr>
+              <w:keepNext/>
+              <w:spacing w:after="60" w:before="60" w:line="240" w:lineRule="auto"/>
+              <w:ind w:firstLine="0"/>
+              <w:jc w:val="center"/>
+            </w:pPr>
+            <w:r>
+              <w:rPr>
+                <w:b w:val="0"/>
+                <w:sz w:val="21"/>
+              </w:rPr>
+              <w:t>0.6029</w:t>
+            </w:r>
+          </w:p>
+        </w:tc>
+      </w:tr>
+      <w:tr>
+        <w:trPr>
+          <w:cantSplit/>
+        </w:trPr>
+        <w:tc>
+          <w:tcPr>
+            <w:tcW w:type="dxa" w:w="861"/>
+            <w:vAlign w:val="center"/>
+          </w:tcPr>
+          <w:p>
+            <w:pPr>
+              <w:keepNext/>
+              <w:spacing w:after="60" w:before="60" w:line="240" w:lineRule="auto"/>
+              <w:ind w:firstLine="0"/>
+              <w:jc w:val="center"/>
+            </w:pPr>
+            <w:r>
+              <w:rPr>
+                <w:b w:val="0"/>
+                <w:sz w:val="21"/>
+              </w:rPr>
+              <w:t>S1</w:t>
+            </w:r>
+          </w:p>
+        </w:tc>
+        <w:tc>
+          <w:tcPr>
+            <w:tcW w:type="dxa" w:w="1521"/>
+            <w:vAlign w:val="center"/>
+          </w:tcPr>
+          <w:p>
+            <w:pPr>
+              <w:keepNext/>
+              <w:spacing w:after="60" w:before="60" w:line="240" w:lineRule="auto"/>
+              <w:ind w:firstLine="0"/>
+              <w:jc w:val="center"/>
+            </w:pPr>
+            <w:r>
+              <w:rPr>
+                <w:b w:val="0"/>
+                <w:sz w:val="21"/>
+              </w:rPr>
+              <w:t>64.01</w:t>
+            </w:r>
+          </w:p>
+        </w:tc>
+        <w:tc>
+          <w:tcPr>
+            <w:tcW w:type="dxa" w:w="1377"/>
+            <w:vAlign w:val="center"/>
+          </w:tcPr>
+          <w:p>
+            <w:pPr>
+              <w:keepNext/>
+              <w:spacing w:after="60" w:before="60" w:line="240" w:lineRule="auto"/>
+              <w:ind w:firstLine="0"/>
+              <w:jc w:val="center"/>
+            </w:pPr>
+            <w:r>
+              <w:rPr>
+                <w:b w:val="0"/>
+                <w:sz w:val="21"/>
+              </w:rPr>
+              <w:t>0.6262</w:t>
+            </w:r>
+          </w:p>
+        </w:tc>
+        <w:tc>
+          <w:tcPr>
+            <w:tcW w:type="dxa" w:w="1320"/>
+            <w:vAlign w:val="center"/>
+          </w:tcPr>
+          <w:p>
+            <w:pPr>
+              <w:keepNext/>
+              <w:spacing w:after="60" w:before="60" w:line="240" w:lineRule="auto"/>
+              <w:ind w:firstLine="0"/>
+              <w:jc w:val="center"/>
+            </w:pPr>
+            <w:r>
+              <w:rPr>
+                <w:b w:val="0"/>
+                <w:sz w:val="21"/>
+              </w:rPr>
+              <w:t>0.5527</w:t>
+            </w:r>
+          </w:p>
+        </w:tc>
+        <w:tc>
+          <w:tcPr>
+            <w:tcW w:type="dxa" w:w="1521"/>
+            <w:vAlign w:val="center"/>
+          </w:tcPr>
+          <w:p>
+            <w:pPr>
+              <w:keepNext/>
+              <w:spacing w:after="60" w:before="60" w:line="240" w:lineRule="auto"/>
+              <w:ind w:firstLine="0"/>
+              <w:jc w:val="center"/>
+            </w:pPr>
+            <w:r>
+              <w:rPr>
+                <w:b w:val="0"/>
+                <w:sz w:val="21"/>
+              </w:rPr>
+              <w:t>66.16</w:t>
+            </w:r>
+          </w:p>
+        </w:tc>
+        <w:tc>
+          <w:tcPr>
+            <w:tcW w:type="dxa" w:w="1377"/>
+            <w:vAlign w:val="center"/>
+          </w:tcPr>
+          <w:p>
+            <w:pPr>
+              <w:keepNext/>
+              <w:spacing w:after="60" w:before="60" w:line="240" w:lineRule="auto"/>
+              <w:ind w:firstLine="0"/>
+              <w:jc w:val="center"/>
+            </w:pPr>
+            <w:r>
+              <w:rPr>
+                <w:b w:val="0"/>
+                <w:sz w:val="21"/>
+              </w:rPr>
+              <w:t>0.6331</w:t>
+            </w:r>
+          </w:p>
+        </w:tc>
+        <w:tc>
+          <w:tcPr>
+            <w:tcW w:type="dxa" w:w="1320"/>
+            <w:vAlign w:val="center"/>
+          </w:tcPr>
+          <w:p>
+            <w:pPr>
+              <w:keepNext/>
+              <w:spacing w:after="60" w:before="60" w:line="240" w:lineRule="auto"/>
+              <w:ind w:firstLine="0"/>
+              <w:jc w:val="center"/>
+            </w:pPr>
+            <w:r>
+              <w:rPr>
+                <w:b w:val="0"/>
+                <w:sz w:val="21"/>
+              </w:rPr>
+              <w:t>0.6104</w:t>
+            </w:r>
+          </w:p>
+        </w:tc>
+      </w:tr>
+      <w:tr>
+        <w:trPr>
+          <w:cantSplit/>
+        </w:trPr>
+        <w:tc>
+          <w:tcPr>
+            <w:tcW w:type="dxa" w:w="861"/>
+            <w:vAlign w:val="center"/>
+          </w:tcPr>
+          <w:p>
+            <w:pPr>
+              <w:keepNext/>
+              <w:spacing w:after="60" w:before="60" w:line="240" w:lineRule="auto"/>
+              <w:ind w:firstLine="0"/>
+              <w:jc w:val="center"/>
+            </w:pPr>
+            <w:r>
+              <w:rPr>
+                <w:b w:val="0"/>
+                <w:sz w:val="21"/>
+              </w:rPr>
+              <w:t>S2</w:t>
+            </w:r>
+          </w:p>
+        </w:tc>
+        <w:tc>
+          <w:tcPr>
+            <w:tcW w:type="dxa" w:w="1521"/>
+            <w:vAlign w:val="center"/>
+          </w:tcPr>
+          <w:p>
+            <w:pPr>
+              <w:keepNext/>
+              <w:spacing w:after="60" w:before="60" w:line="240" w:lineRule="auto"/>
+              <w:ind w:firstLine="0"/>
+              <w:jc w:val="center"/>
+            </w:pPr>
+            <w:r>
+              <w:rPr>
+                <w:b w:val="0"/>
+                <w:sz w:val="21"/>
+              </w:rPr>
+              <w:t>65.25</w:t>
+            </w:r>
+          </w:p>
+        </w:tc>
+        <w:tc>
+          <w:tcPr>
+            <w:tcW w:type="dxa" w:w="1377"/>
+            <w:vAlign w:val="center"/>
+          </w:tcPr>
+          <w:p>
+            <w:pPr>
+              <w:keepNext/>
+              <w:spacing w:after="60" w:before="60" w:line="240" w:lineRule="auto"/>
+              <w:ind w:firstLine="0"/>
+              <w:jc w:val="center"/>
+            </w:pPr>
+            <w:r>
+              <w:rPr>
+                <w:b w:val="0"/>
+                <w:sz w:val="21"/>
+              </w:rPr>
+              <w:t>0.6354</w:t>
+            </w:r>
+          </w:p>
+        </w:tc>
+        <w:tc>
+          <w:tcPr>
+            <w:tcW w:type="dxa" w:w="1320"/>
+            <w:vAlign w:val="center"/>
+          </w:tcPr>
+          <w:p>
+            <w:pPr>
+              <w:keepNext/>
+              <w:spacing w:after="60" w:before="60" w:line="240" w:lineRule="auto"/>
+              <w:ind w:firstLine="0"/>
+              <w:jc w:val="center"/>
+            </w:pPr>
+            <w:r>
+              <w:rPr>
+                <w:b w:val="0"/>
+                <w:sz w:val="21"/>
+              </w:rPr>
+              <w:t>0.5742</w:t>
+            </w:r>
+          </w:p>
+        </w:tc>
+        <w:tc>
+          <w:tcPr>
+            <w:tcW w:type="dxa" w:w="1521"/>
+            <w:vAlign w:val="center"/>
+          </w:tcPr>
+          <w:p>
+            <w:pPr>
+              <w:keepNext/>
+              <w:spacing w:after="60" w:before="60" w:line="240" w:lineRule="auto"/>
+              <w:ind w:firstLine="0"/>
+              <w:jc w:val="center"/>
+            </w:pPr>
+            <w:r>
+              <w:rPr>
+                <w:b w:val="0"/>
+                <w:sz w:val="21"/>
+              </w:rPr>
+              <w:t>69.60</w:t>
+            </w:r>
+          </w:p>
+        </w:tc>
+        <w:tc>
+          <w:tcPr>
+            <w:tcW w:type="dxa" w:w="1377"/>
+            <w:vAlign w:val="center"/>
+          </w:tcPr>
+          <w:p>
+            <w:pPr>
+              <w:keepNext/>
+              <w:spacing w:after="60" w:before="60" w:line="240" w:lineRule="auto"/>
+              <w:ind w:firstLine="0"/>
+              <w:jc w:val="center"/>
+            </w:pPr>
+            <w:r>
+              <w:rPr>
+                <w:b w:val="0"/>
+                <w:sz w:val="21"/>
+              </w:rPr>
+              <w:t>0.6515</w:t>
+            </w:r>
+          </w:p>
+        </w:tc>
+        <w:tc>
+          <w:tcPr>
+            <w:tcW w:type="dxa" w:w="1320"/>
+            <w:vAlign w:val="center"/>
+          </w:tcPr>
+          <w:p>
+            <w:pPr>
+              <w:keepNext/>
+              <w:spacing w:after="60" w:before="60" w:line="240" w:lineRule="auto"/>
+              <w:ind w:firstLine="0"/>
+              <w:jc w:val="center"/>
+            </w:pPr>
+            <w:r>
+              <w:rPr>
+                <w:b w:val="0"/>
+                <w:sz w:val="21"/>
+              </w:rPr>
+              <w:t>0.6016</w:t>
+            </w:r>
+          </w:p>
+        </w:tc>
+      </w:tr>
+      <w:tr>
+        <w:trPr>
+          <w:cantSplit/>
+        </w:trPr>
+        <w:tc>
+          <w:tcPr>
+            <w:tcW w:type="dxa" w:w="861"/>
+            <w:vAlign w:val="center"/>
+          </w:tcPr>
+          <w:p>
+            <w:pPr>
+              <w:keepNext/>
+              <w:spacing w:after="60" w:before="60" w:line="240" w:lineRule="auto"/>
+              <w:ind w:firstLine="0"/>
+              <w:jc w:val="center"/>
+            </w:pPr>
+            <w:r>
+              <w:rPr>
+                <w:b w:val="0"/>
+                <w:sz w:val="21"/>
+              </w:rPr>
+              <w:t>S3</w:t>
+            </w:r>
+          </w:p>
+        </w:tc>
+        <w:tc>
+          <w:tcPr>
+            <w:tcW w:type="dxa" w:w="1521"/>
+            <w:vAlign w:val="center"/>
+          </w:tcPr>
+          <w:p>
+            <w:pPr>
+              <w:keepNext/>
+              <w:spacing w:after="60" w:before="60" w:line="240" w:lineRule="auto"/>
+              <w:ind w:firstLine="0"/>
+              <w:jc w:val="center"/>
+            </w:pPr>
+            <w:r>
+              <w:rPr>
+                <w:b w:val="0"/>
+                <w:sz w:val="21"/>
+              </w:rPr>
+              <w:t>63.74</w:t>
+            </w:r>
+          </w:p>
+        </w:tc>
+        <w:tc>
+          <w:tcPr>
+            <w:tcW w:type="dxa" w:w="1377"/>
+            <w:vAlign w:val="center"/>
+          </w:tcPr>
+          <w:p>
+            <w:pPr>
+              <w:keepNext/>
+              <w:spacing w:after="60" w:before="60" w:line="240" w:lineRule="auto"/>
+              <w:ind w:firstLine="0"/>
+              <w:jc w:val="center"/>
+            </w:pPr>
+            <w:r>
+              <w:rPr>
+                <w:b w:val="0"/>
+                <w:sz w:val="21"/>
+              </w:rPr>
+              <w:t>0.6227</w:t>
+            </w:r>
+          </w:p>
+        </w:tc>
+        <w:tc>
+          <w:tcPr>
+            <w:tcW w:type="dxa" w:w="1320"/>
+            <w:vAlign w:val="center"/>
+          </w:tcPr>
+          <w:p>
+            <w:pPr>
+              <w:keepNext/>
+              <w:spacing w:after="60" w:before="60" w:line="240" w:lineRule="auto"/>
+              <w:ind w:firstLine="0"/>
+              <w:jc w:val="center"/>
+            </w:pPr>
+            <w:r>
+              <w:rPr>
+                <w:b w:val="0"/>
+                <w:sz w:val="21"/>
+              </w:rPr>
+              <w:t>0.5780</w:t>
+            </w:r>
+          </w:p>
+        </w:tc>
+        <w:tc>
+          <w:tcPr>
+            <w:tcW w:type="dxa" w:w="1521"/>
+            <w:vAlign w:val="center"/>
+          </w:tcPr>
+          <w:p>
+            <w:pPr>
+              <w:keepNext/>
+              <w:spacing w:after="60" w:before="60" w:line="240" w:lineRule="auto"/>
+              <w:ind w:firstLine="0"/>
+              <w:jc w:val="center"/>
+            </w:pPr>
+            <w:r>
+              <w:rPr>
+                <w:b w:val="0"/>
+                <w:sz w:val="21"/>
+              </w:rPr>
+              <w:t>65.61</w:t>
+            </w:r>
+          </w:p>
+        </w:tc>
+        <w:tc>
+          <w:tcPr>
+            <w:tcW w:type="dxa" w:w="1377"/>
+            <w:vAlign w:val="center"/>
+          </w:tcPr>
+          <w:p>
+            <w:pPr>
+              <w:keepNext/>
+              <w:spacing w:after="60" w:before="60" w:line="240" w:lineRule="auto"/>
+              <w:ind w:firstLine="0"/>
+              <w:jc w:val="center"/>
+            </w:pPr>
+            <w:r>
+              <w:rPr>
+                <w:b w:val="0"/>
+                <w:sz w:val="21"/>
+              </w:rPr>
+              <w:t>0.6187</w:t>
+            </w:r>
+          </w:p>
+        </w:tc>
+        <w:tc>
+          <w:tcPr>
+            <w:tcW w:type="dxa" w:w="1320"/>
+            <w:vAlign w:val="center"/>
+          </w:tcPr>
+          <w:p>
+            <w:pPr>
+              <w:keepNext/>
+              <w:spacing w:after="60" w:before="60" w:line="240" w:lineRule="auto"/>
+              <w:ind w:firstLine="0"/>
+              <w:jc w:val="center"/>
+            </w:pPr>
+            <w:r>
+              <w:rPr>
+                <w:b w:val="0"/>
+                <w:sz w:val="21"/>
+              </w:rPr>
+              <w:t>0.6252</w:t>
+            </w:r>
+          </w:p>
+        </w:tc>
+      </w:tr>
+      <w:tr>
+        <w:trPr>
+          <w:cantSplit/>
+        </w:trPr>
+        <w:tc>
+          <w:tcPr>
+            <w:tcW w:type="dxa" w:w="861"/>
+            <w:vAlign w:val="center"/>
+          </w:tcPr>
+          <w:p>
+            <w:pPr>
+              <w:keepNext/>
+              <w:spacing w:after="60" w:before="60" w:line="240" w:lineRule="auto"/>
+              <w:ind w:firstLine="0"/>
+              <w:jc w:val="center"/>
+            </w:pPr>
+            <w:r>
+              <w:rPr>
+                <w:b w:val="0"/>
+                <w:sz w:val="21"/>
+              </w:rPr>
+              <w:t>S4</w:t>
+            </w:r>
+          </w:p>
+        </w:tc>
+        <w:tc>
+          <w:tcPr>
+            <w:tcW w:type="dxa" w:w="1521"/>
+            <w:vAlign w:val="center"/>
+          </w:tcPr>
+          <w:p>
+            <w:pPr>
+              <w:keepNext/>
+              <w:spacing w:after="60" w:before="60" w:line="240" w:lineRule="auto"/>
+              <w:ind w:firstLine="0"/>
+              <w:jc w:val="center"/>
+            </w:pPr>
+            <w:r>
+              <w:rPr>
+                <w:b w:val="0"/>
+                <w:sz w:val="21"/>
+              </w:rPr>
+              <w:t>63.32</w:t>
+            </w:r>
+          </w:p>
+        </w:tc>
+        <w:tc>
+          <w:tcPr>
+            <w:tcW w:type="dxa" w:w="1377"/>
+            <w:vAlign w:val="center"/>
+          </w:tcPr>
+          <w:p>
+            <w:pPr>
+              <w:keepNext/>
+              <w:spacing w:after="60" w:before="60" w:line="240" w:lineRule="auto"/>
+              <w:ind w:firstLine="0"/>
+              <w:jc w:val="center"/>
+            </w:pPr>
+            <w:r>
+              <w:rPr>
+                <w:b w:val="0"/>
+                <w:sz w:val="21"/>
+              </w:rPr>
+              <w:t>0.6267</w:t>
+            </w:r>
+          </w:p>
+        </w:tc>
+        <w:tc>
+          <w:tcPr>
+            <w:tcW w:type="dxa" w:w="1320"/>
+            <w:vAlign w:val="center"/>
+          </w:tcPr>
+          <w:p>
+            <w:pPr>
+              <w:keepNext/>
+              <w:spacing w:after="60" w:before="60" w:line="240" w:lineRule="auto"/>
+              <w:ind w:firstLine="0"/>
+              <w:jc w:val="center"/>
+            </w:pPr>
+            <w:r>
+              <w:rPr>
+                <w:b w:val="0"/>
+                <w:sz w:val="21"/>
+              </w:rPr>
+              <w:t>0.5675</w:t>
+            </w:r>
+          </w:p>
+        </w:tc>
+        <w:tc>
+          <w:tcPr>
+            <w:tcW w:type="dxa" w:w="1521"/>
+            <w:vAlign w:val="center"/>
+          </w:tcPr>
+          <w:p>
+            <w:pPr>
+              <w:keepNext/>
+              <w:spacing w:after="60" w:before="60" w:line="240" w:lineRule="auto"/>
+              <w:ind w:firstLine="0"/>
+              <w:jc w:val="center"/>
+            </w:pPr>
+            <w:r>
+              <w:rPr>
+                <w:b w:val="0"/>
+                <w:sz w:val="21"/>
+              </w:rPr>
+              <w:t>65.20</w:t>
+            </w:r>
+          </w:p>
+        </w:tc>
+        <w:tc>
+          <w:tcPr>
+            <w:tcW w:type="dxa" w:w="1377"/>
+            <w:vAlign w:val="center"/>
+          </w:tcPr>
+          <w:p>
+            <w:pPr>
+              <w:keepNext/>
+              <w:spacing w:after="60" w:before="60" w:line="240" w:lineRule="auto"/>
+              <w:ind w:firstLine="0"/>
+              <w:jc w:val="center"/>
+            </w:pPr>
+            <w:r>
+              <w:rPr>
+                <w:b w:val="0"/>
+                <w:sz w:val="21"/>
+              </w:rPr>
+              <w:t>0.6298</w:t>
+            </w:r>
+          </w:p>
+        </w:tc>
+        <w:tc>
+          <w:tcPr>
+            <w:tcW w:type="dxa" w:w="1320"/>
+            <w:vAlign w:val="center"/>
+          </w:tcPr>
+          <w:p>
+            <w:pPr>
+              <w:keepNext/>
+              <w:spacing w:after="60" w:before="60" w:line="240" w:lineRule="auto"/>
+              <w:ind w:firstLine="0"/>
+              <w:jc w:val="center"/>
+            </w:pPr>
+            <w:r>
+              <w:rPr>
+                <w:b w:val="0"/>
+                <w:sz w:val="21"/>
+              </w:rPr>
+              <w:t>0.6100</w:t>
+            </w:r>
+          </w:p>
+        </w:tc>
+      </w:tr>
+      <w:tr>
+        <w:trPr>
+          <w:cantSplit/>
+        </w:trPr>
+        <w:tc>
+          <w:tcPr>
+            <w:tcW w:type="dxa" w:w="861"/>
+            <w:vAlign w:val="center"/>
+          </w:tcPr>
+          <w:p>
+            <w:pPr>
+              <w:keepNext/>
+              <w:spacing w:after="60" w:before="60" w:line="240" w:lineRule="auto"/>
+              <w:ind w:firstLine="0"/>
+              <w:jc w:val="center"/>
+            </w:pPr>
+            <w:r>
+              <w:rPr>
+                <w:b w:val="0"/>
+                <w:sz w:val="21"/>
+              </w:rPr>
+              <w:t>S5</w:t>
+            </w:r>
+          </w:p>
+        </w:tc>
+        <w:tc>
+          <w:tcPr>
+            <w:tcW w:type="dxa" w:w="1521"/>
+            <w:vAlign w:val="center"/>
+          </w:tcPr>
+          <w:p>
+            <w:pPr>
+              <w:keepNext/>
+              <w:spacing w:after="60" w:before="60" w:line="240" w:lineRule="auto"/>
+              <w:ind w:firstLine="0"/>
+              <w:jc w:val="center"/>
+            </w:pPr>
+            <w:r>
+              <w:rPr>
+                <w:b w:val="0"/>
+                <w:sz w:val="21"/>
+              </w:rPr>
+              <w:t>64.56</w:t>
+            </w:r>
+          </w:p>
+        </w:tc>
+        <w:tc>
+          <w:tcPr>
+            <w:tcW w:type="dxa" w:w="1377"/>
+            <w:vAlign w:val="center"/>
+          </w:tcPr>
+          <w:p>
+            <w:pPr>
+              <w:keepNext/>
+              <w:spacing w:after="60" w:before="60" w:line="240" w:lineRule="auto"/>
+              <w:ind w:firstLine="0"/>
+              <w:jc w:val="center"/>
+            </w:pPr>
+            <w:r>
+              <w:rPr>
+                <w:b w:val="0"/>
+                <w:sz w:val="21"/>
+              </w:rPr>
+              <w:t>0.6390</w:t>
+            </w:r>
+          </w:p>
+        </w:tc>
+        <w:tc>
+          <w:tcPr>
+            <w:tcW w:type="dxa" w:w="1320"/>
+            <w:vAlign w:val="center"/>
+          </w:tcPr>
+          <w:p>
+            <w:pPr>
+              <w:keepNext/>
+              <w:spacing w:after="60" w:before="60" w:line="240" w:lineRule="auto"/>
+              <w:ind w:firstLine="0"/>
+              <w:jc w:val="center"/>
+            </w:pPr>
+            <w:r>
+              <w:rPr>
+                <w:b w:val="0"/>
+                <w:sz w:val="21"/>
+              </w:rPr>
+              <w:t>0.5491</w:t>
+            </w:r>
+          </w:p>
+        </w:tc>
+        <w:tc>
+          <w:tcPr>
+            <w:tcW w:type="dxa" w:w="1521"/>
+            <w:vAlign w:val="center"/>
+          </w:tcPr>
+          <w:p>
+            <w:pPr>
+              <w:keepNext/>
+              <w:spacing w:after="60" w:before="60" w:line="240" w:lineRule="auto"/>
+              <w:ind w:firstLine="0"/>
+              <w:jc w:val="center"/>
+            </w:pPr>
+            <w:r>
+              <w:rPr>
+                <w:b w:val="0"/>
+                <w:sz w:val="21"/>
+              </w:rPr>
+              <w:t>66.16</w:t>
+            </w:r>
+          </w:p>
+        </w:tc>
+        <w:tc>
+          <w:tcPr>
+            <w:tcW w:type="dxa" w:w="1377"/>
+            <w:vAlign w:val="center"/>
+          </w:tcPr>
+          <w:p>
+            <w:pPr>
+              <w:keepNext/>
+              <w:spacing w:after="60" w:before="60" w:line="240" w:lineRule="auto"/>
+              <w:ind w:firstLine="0"/>
+              <w:jc w:val="center"/>
+            </w:pPr>
+            <w:r>
+              <w:rPr>
+                <w:b w:val="0"/>
+                <w:sz w:val="21"/>
+              </w:rPr>
+              <w:t>0.6389</w:t>
+            </w:r>
+          </w:p>
+        </w:tc>
+        <w:tc>
+          <w:tcPr>
+            <w:tcW w:type="dxa" w:w="1320"/>
+            <w:vAlign w:val="center"/>
+          </w:tcPr>
+          <w:p>
+            <w:pPr>
+              <w:keepNext/>
+              <w:spacing w:after="60" w:before="60" w:line="240" w:lineRule="auto"/>
+              <w:ind w:firstLine="0"/>
+              <w:jc w:val="center"/>
+            </w:pPr>
+            <w:r>
+              <w:rPr>
+                <w:b w:val="0"/>
+                <w:sz w:val="21"/>
+              </w:rPr>
+              <w:t>0.5966</w:t>
+            </w:r>
+          </w:p>
+        </w:tc>
+      </w:tr>
+      <w:tr>
+        <w:trPr>
+          <w:cantSplit/>
+        </w:trPr>
+        <w:tc>
+          <w:tcPr>
+            <w:tcW w:type="dxa" w:w="861"/>
+            <w:vAlign w:val="center"/>
+          </w:tcPr>
+          <w:p>
+            <w:pPr>
+              <w:keepNext/>
+              <w:spacing w:after="60" w:before="60" w:line="240" w:lineRule="auto"/>
+              <w:ind w:firstLine="0"/>
+              <w:jc w:val="center"/>
+            </w:pPr>
+            <w:r>
+              <w:rPr>
+                <w:b w:val="0"/>
+                <w:sz w:val="21"/>
+              </w:rPr>
+              <w:t>T0</w:t>
+            </w:r>
+          </w:p>
+        </w:tc>
+        <w:tc>
+          <w:tcPr>
+            <w:tcW w:type="dxa" w:w="1521"/>
+            <w:vAlign w:val="center"/>
+          </w:tcPr>
+          <w:p>
+            <w:pPr>
+              <w:keepNext/>
+              <w:spacing w:after="60" w:before="60" w:line="240" w:lineRule="auto"/>
+              <w:ind w:firstLine="0"/>
+              <w:jc w:val="center"/>
+            </w:pPr>
+            <w:r>
+              <w:rPr>
+                <w:b w:val="0"/>
+                <w:sz w:val="21"/>
+              </w:rPr>
+              <w:t>63.05</w:t>
+            </w:r>
+          </w:p>
+        </w:tc>
+        <w:tc>
+          <w:tcPr>
+            <w:tcW w:type="dxa" w:w="1377"/>
+            <w:vAlign w:val="center"/>
+          </w:tcPr>
+          <w:p>
+            <w:pPr>
+              <w:keepNext/>
+              <w:spacing w:after="60" w:before="60" w:line="240" w:lineRule="auto"/>
+              <w:ind w:firstLine="0"/>
+              <w:jc w:val="center"/>
+            </w:pPr>
+            <w:r>
+              <w:rPr>
+                <w:b w:val="0"/>
+                <w:sz w:val="21"/>
+              </w:rPr>
+              <w:t>0.6262</w:t>
+            </w:r>
+          </w:p>
+        </w:tc>
+        <w:tc>
+          <w:tcPr>
+            <w:tcW w:type="dxa" w:w="1320"/>
+            <w:vAlign w:val="center"/>
+          </w:tcPr>
+          <w:p>
+            <w:pPr>
+              <w:keepNext/>
+              <w:spacing w:after="60" w:before="60" w:line="240" w:lineRule="auto"/>
+              <w:ind w:firstLine="0"/>
+              <w:jc w:val="center"/>
+            </w:pPr>
+            <w:r>
+              <w:rPr>
+                <w:b w:val="0"/>
+                <w:sz w:val="21"/>
+              </w:rPr>
+              <w:t>0.5822</w:t>
+            </w:r>
+          </w:p>
+        </w:tc>
+        <w:tc>
+          <w:tcPr>
+            <w:tcW w:type="dxa" w:w="1521"/>
+            <w:vAlign w:val="center"/>
+          </w:tcPr>
+          <w:p>
+            <w:pPr>
+              <w:keepNext/>
+              <w:spacing w:after="60" w:before="60" w:line="240" w:lineRule="auto"/>
+              <w:ind w:firstLine="0"/>
+              <w:jc w:val="center"/>
+            </w:pPr>
+            <w:r>
+              <w:rPr>
+                <w:b w:val="0"/>
+                <w:sz w:val="21"/>
+              </w:rPr>
+              <w:t>66.85</w:t>
+            </w:r>
+          </w:p>
+        </w:tc>
+        <w:tc>
+          <w:tcPr>
+            <w:tcW w:type="dxa" w:w="1377"/>
+            <w:vAlign w:val="center"/>
+          </w:tcPr>
+          <w:p>
+            <w:pPr>
+              <w:keepNext/>
+              <w:spacing w:after="60" w:before="60" w:line="240" w:lineRule="auto"/>
+              <w:ind w:firstLine="0"/>
+              <w:jc w:val="center"/>
+            </w:pPr>
+            <w:r>
+              <w:rPr>
+                <w:b w:val="0"/>
+                <w:sz w:val="21"/>
+              </w:rPr>
+              <w:t>0.6513</w:t>
+            </w:r>
+          </w:p>
+        </w:tc>
+        <w:tc>
+          <w:tcPr>
+            <w:tcW w:type="dxa" w:w="1320"/>
+            <w:vAlign w:val="center"/>
+          </w:tcPr>
+          <w:p>
+            <w:pPr>
+              <w:keepNext/>
+              <w:spacing w:after="60" w:before="60" w:line="240" w:lineRule="auto"/>
+              <w:ind w:firstLine="0"/>
+              <w:jc w:val="center"/>
+            </w:pPr>
+            <w:r>
+              <w:rPr>
+                <w:b w:val="0"/>
+                <w:sz w:val="21"/>
+              </w:rPr>
+              <w:t>0.6010</w:t>
+            </w:r>
+          </w:p>
+        </w:tc>
+      </w:tr>
+      <w:tr>
+        <w:trPr>
+          <w:cantSplit/>
+        </w:trPr>
+        <w:tc>
+          <w:tcPr>
+            <w:tcW w:type="dxa" w:w="861"/>
+            <w:vAlign w:val="center"/>
+          </w:tcPr>
+          <w:p>
+            <w:pPr>
+              <w:keepNext w:val="0"/>
+              <w:spacing w:after="60" w:before="60" w:line="240" w:lineRule="auto"/>
+              <w:ind w:firstLine="0"/>
+              <w:jc w:val="center"/>
+            </w:pPr>
+            <w:r>
+              <w:rPr>
+                <w:b w:val="0"/>
+                <w:sz w:val="21"/>
+              </w:rPr>
+              <w:t>T1</w:t>
+            </w:r>
+          </w:p>
+        </w:tc>
+        <w:tc>
+          <w:tcPr>
+            <w:tcW w:type="dxa" w:w="1521"/>
+            <w:vAlign w:val="center"/>
+          </w:tcPr>
+          <w:p>
+            <w:pPr>
+              <w:keepNext w:val="0"/>
+              <w:spacing w:after="60" w:before="60" w:line="240" w:lineRule="auto"/>
+              <w:ind w:firstLine="0"/>
+              <w:jc w:val="center"/>
+            </w:pPr>
+            <w:r>
+              <w:rPr>
+                <w:b w:val="0"/>
+                <w:sz w:val="21"/>
+              </w:rPr>
+              <w:t>64.01</w:t>
+            </w:r>
+          </w:p>
+        </w:tc>
+        <w:tc>
+          <w:tcPr>
+            <w:tcW w:type="dxa" w:w="1377"/>
+            <w:vAlign w:val="center"/>
+          </w:tcPr>
+          <w:p>
+            <w:pPr>
+              <w:keepNext w:val="0"/>
+              <w:spacing w:after="60" w:before="60" w:line="240" w:lineRule="auto"/>
+              <w:ind w:firstLine="0"/>
+              <w:jc w:val="center"/>
+            </w:pPr>
+            <w:r>
+              <w:rPr>
+                <w:b w:val="0"/>
+                <w:sz w:val="21"/>
+              </w:rPr>
+              <w:t>0.6321</w:t>
+            </w:r>
+          </w:p>
+        </w:tc>
+        <w:tc>
+          <w:tcPr>
+            <w:tcW w:type="dxa" w:w="1320"/>
+            <w:vAlign w:val="center"/>
+          </w:tcPr>
+          <w:p>
+            <w:pPr>
+              <w:keepNext w:val="0"/>
+              <w:spacing w:after="60" w:before="60" w:line="240" w:lineRule="auto"/>
+              <w:ind w:firstLine="0"/>
+              <w:jc w:val="center"/>
+            </w:pPr>
+            <w:r>
+              <w:rPr>
+                <w:b w:val="0"/>
+                <w:sz w:val="21"/>
+              </w:rPr>
+              <w:t>0.5730</w:t>
+            </w:r>
+          </w:p>
+        </w:tc>
+        <w:tc>
+          <w:tcPr>
+            <w:tcW w:type="dxa" w:w="1521"/>
+            <w:vAlign w:val="center"/>
+          </w:tcPr>
+          <w:p>
+            <w:pPr>
+              <w:keepNext w:val="0"/>
+              <w:spacing w:after="60" w:before="60" w:line="240" w:lineRule="auto"/>
+              <w:ind w:firstLine="0"/>
+              <w:jc w:val="center"/>
+            </w:pPr>
+            <w:r>
+              <w:rPr>
+                <w:b w:val="0"/>
+                <w:sz w:val="21"/>
+              </w:rPr>
+              <w:t>65.61</w:t>
+            </w:r>
+          </w:p>
+        </w:tc>
+        <w:tc>
+          <w:tcPr>
+            <w:tcW w:type="dxa" w:w="1377"/>
+            <w:vAlign w:val="center"/>
+          </w:tcPr>
+          <w:p>
+            <w:pPr>
+              <w:keepNext w:val="0"/>
+              <w:spacing w:after="60" w:before="60" w:line="240" w:lineRule="auto"/>
+              <w:ind w:firstLine="0"/>
+              <w:jc w:val="center"/>
+            </w:pPr>
+            <w:r>
+              <w:rPr>
+                <w:b w:val="0"/>
+                <w:sz w:val="21"/>
+              </w:rPr>
+              <w:t>0.6285</w:t>
+            </w:r>
+          </w:p>
+        </w:tc>
+        <w:tc>
+          <w:tcPr>
+            <w:tcW w:type="dxa" w:w="1320"/>
+            <w:vAlign w:val="center"/>
+          </w:tcPr>
+          <w:p>
+            <w:pPr>
+              <w:keepNext w:val="0"/>
+              <w:spacing w:after="60" w:before="60" w:line="240" w:lineRule="auto"/>
+              <w:ind w:firstLine="0"/>
+              <w:jc w:val="center"/>
+            </w:pPr>
+            <w:r>
+              <w:rPr>
+                <w:b w:val="0"/>
+                <w:sz w:val="21"/>
+              </w:rPr>
+              <w:t>0.6226</w:t>
+            </w:r>
+          </w:p>
+        </w:tc>
+      </w:tr>
+    </w:tbl>
+    <w:p>
+      <w:r>
+        <w:t>SELF-MM较弱参数的影响较明确：S3的验证Macro-F1为0.6227、测试Macro-F1为0.6187，测试MAE为0.6252；S5参考配置对应为0.6390、0.6389和0.5966。S0、S1、S4的测试Macro-F1分别为0.6300、0.6331、0.6298，亦低于S5。S4与S5的网络和BERT学习率相同，但非BERT分组学习率及权重衰减不同，因而这一比较体现的是优化配置的共同影响；S3还同时改变融合维数和BERT学习率，不能将其退化全部归因于“网络更宽”。</w:t>
+      </w:r>
+    </w:p>
+    <w:p>
+      <w:r>
+        <w:t>完整对照也显示验证排序未必在测试中保持。S2的验证Macro-F1为0.6354，低于S5，但测试准确率69.60%、Macro-F1为0.6515，分别高于主模型的68.64%和0.6493；其测试MAE为0.6016，与主模型0.6006接近。T0的验证Macro-F1为0.6262，低于T1的0.6321，但测试Macro-F1反而为0.6513，高于T1的0.6285，测试MAE也更低。因此，T0只能称为验证指标较弱的设置，不能据此认定其测试性能较弱。</w:t>
+      </w:r>
+    </w:p>
+    <w:p>
+      <w:r>
+        <w:t>S5与T1的验证、测试指标与第6.2节所列20轮上限参考实验一致，表明这两个参考设置在已有延长预算实验中未改变所选结果；其余设置仍受原10轮上限约束。本节结果支持参数选择和分类—回归之间存在取舍，也限制了“主模型全面优于开源基线”的说法。主模型的选用依据仍包括原生证据分解和题目解释要求；补充对照未据测试结果重新选择权重或修改模型。各行均为本比赛适配实验，不代表上游论文原始成绩。</w:t>
+      </w:r>
+    </w:p>
+    <w:p>
+      <w:pPr>
+        <w:pStyle w:val="Heading2"/>
+      </w:pPr>
+      <w:r>
+        <w:t>6.6 验证集错误归因</w:t>
       </w:r>
     </w:p>
     <w:p>
@@ -10666,7 +13547,7 @@
         <w:keepNext/>
       </w:pPr>
       <w:r>
-        <w:t>表10　验证集标签与观测分组的误差</w:t>
+        <w:t>表12　验证集标签与观测分组的误差</w:t>
       </w:r>
     </w:p>
     <w:tbl>
@@ -11378,7 +14259,7 @@
         <w:pStyle w:val="Heading2"/>
       </w:pPr>
       <w:r>
-        <w:t>6.6 解释完备性检验</w:t>
+        <w:t>6.7 解释完备性检验</w:t>
       </w:r>
     </w:p>
     <w:p>
@@ -11387,7 +14268,7 @@
         <w:keepNext/>
       </w:pPr>
       <w:r>
-        <w:t>表11　分类间隔与回归预激活的分解误差</w:t>
+        <w:t>表13　分类间隔与回归预激活的分解误差</w:t>
       </w:r>
     </w:p>
     <w:tbl>
@@ -11808,7 +14689,7 @@
         <w:keepNext/>
       </w:pPr>
       <w:r>
-        <w:t>表12　三模态净贡献占比的样本均值</w:t>
+        <w:t>表14　三模态净贡献占比的样本均值</w:t>
       </w:r>
     </w:p>
     <w:tbl>
@@ -12670,7 +15551,7 @@
         <w:keepNext/>
       </w:pPr>
       <w:r>
-        <w:t>表13　附件四20条样本的预测与分类贡献汇总</w:t>
+        <w:t>表15　附件四20条样本的预测与分类贡献汇总</w:t>
       </w:r>
     </w:p>
     <w:tbl>
@@ -15798,7 +18679,7 @@
         <w:keepNext/>
       </w:pPr>
       <w:r>
-        <w:t>表14　附件四20条样本的主要证据定位索引</w:t>
+        <w:t>表16　附件四20条样本的主要证据定位索引</w:t>
       </w:r>
     </w:p>
     <w:tbl>
@@ -17654,7 +20535,7 @@
         <w:keepNext/>
       </w:pPr>
       <w:r>
-        <w:t>表15　样本02解释卡</w:t>
+        <w:t>表17　样本02解释卡</w:t>
       </w:r>
     </w:p>
     <w:tbl>
@@ -18146,7 +21027,7 @@
         <w:keepNext/>
       </w:pPr>
       <w:r>
-        <w:t>表16　样本13解释卡</w:t>
+        <w:t>表18　样本13解释卡</w:t>
       </w:r>
     </w:p>
     <w:tbl>
@@ -18638,7 +21519,7 @@
         <w:keepNext/>
       </w:pPr>
       <w:r>
-        <w:t>表17　样本14解释卡</w:t>
+        <w:t>表19　样本14解释卡</w:t>
       </w:r>
     </w:p>
     <w:tbl>
@@ -19130,7 +22011,7 @@
         <w:keepNext/>
       </w:pPr>
       <w:r>
-        <w:t>表18　样本16解释卡</w:t>
+        <w:t>表20　样本16解释卡</w:t>
       </w:r>
     </w:p>
     <w:tbl>

</xml_diff>

<commit_message>
feat(q3): connect model explanations to checked media evidence
Add independent speech recognition, dual-context alignment and original-frame navigation for attachment-four explanations. Preserve feature attribution, missing-visual states and unresolved localization independently.

Refresh all 20 explanation cards, result CSV, figures and usage documentation. Validation: five evidence-navigation tests passed.
</commit_message>
<xml_diff>
--- a/问题三/paper/问题三_不确定性融合论文.docx
+++ b/问题三/paper/问题三_不确定性融合论文.docx
@@ -5674,7 +5674,7 @@
       <w:r>
         <w:drawing>
           <wp:inline xmlns:a="http://schemas.openxmlformats.org/drawingml/2006/main" xmlns:pic="http://schemas.openxmlformats.org/drawingml/2006/picture">
-            <wp:extent cx="5796000" cy="1990634"/>
+            <wp:extent cx="5796000" cy="2001244"/>
             <wp:docPr id="3" name="Picture 3"/>
             <wp:cNvGraphicFramePr>
               <a:graphicFrameLocks noChangeAspect="1"/>
@@ -5695,7 +5695,7 @@
                   <pic:spPr>
                     <a:xfrm>
                       <a:off x="0" y="0"/>
-                      <a:ext cx="5796000" cy="1990634"/>
+                      <a:ext cx="5796000" cy="2001244"/>
                     </a:xfrm>
                     <a:prstGeom prst="rect"/>
                   </pic:spPr>
@@ -7867,7 +7867,7 @@
       <w:r>
         <w:drawing>
           <wp:inline xmlns:a="http://schemas.openxmlformats.org/drawingml/2006/main" xmlns:pic="http://schemas.openxmlformats.org/drawingml/2006/picture">
-            <wp:extent cx="5796000" cy="2685153"/>
+            <wp:extent cx="5796000" cy="2700450"/>
             <wp:docPr id="4" name="Picture 4"/>
             <wp:cNvGraphicFramePr>
               <a:graphicFrameLocks noChangeAspect="1"/>
@@ -7888,7 +7888,7 @@
                   <pic:spPr>
                     <a:xfrm>
                       <a:off x="0" y="0"/>
-                      <a:ext cx="5796000" cy="2685153"/>
+                      <a:ext cx="5796000" cy="2700450"/>
                     </a:xfrm>
                     <a:prstGeom prst="rect"/>
                   </pic:spPr>
@@ -8405,7 +8405,7 @@
       <w:r>
         <w:drawing>
           <wp:inline xmlns:a="http://schemas.openxmlformats.org/drawingml/2006/main" xmlns:pic="http://schemas.openxmlformats.org/drawingml/2006/picture">
-            <wp:extent cx="5796000" cy="2341884"/>
+            <wp:extent cx="5796000" cy="2356151"/>
             <wp:docPr id="5" name="Picture 5"/>
             <wp:cNvGraphicFramePr>
               <a:graphicFrameLocks noChangeAspect="1"/>
@@ -8426,7 +8426,7 @@
                   <pic:spPr>
                     <a:xfrm>
                       <a:off x="0" y="0"/>
-                      <a:ext cx="5796000" cy="2341884"/>
+                      <a:ext cx="5796000" cy="2356151"/>
                     </a:xfrm>
                     <a:prstGeom prst="rect"/>
                   </pic:spPr>
@@ -10606,7 +10606,7 @@
       <w:r>
         <w:drawing>
           <wp:inline xmlns:a="http://schemas.openxmlformats.org/drawingml/2006/main" xmlns:pic="http://schemas.openxmlformats.org/drawingml/2006/picture">
-            <wp:extent cx="5796000" cy="2141872"/>
+            <wp:extent cx="5796000" cy="2154058"/>
             <wp:docPr id="6" name="Picture 6"/>
             <wp:cNvGraphicFramePr>
               <a:graphicFrameLocks noChangeAspect="1"/>
@@ -10627,7 +10627,7 @@
                   <pic:spPr>
                     <a:xfrm>
                       <a:off x="0" y="0"/>
-                      <a:ext cx="5796000" cy="2141872"/>
+                      <a:ext cx="5796000" cy="2154058"/>
                     </a:xfrm>
                     <a:prstGeom prst="rect"/>
                   </pic:spPr>
@@ -15364,7 +15364,7 @@
       <w:r>
         <w:drawing>
           <wp:inline xmlns:a="http://schemas.openxmlformats.org/drawingml/2006/main" xmlns:pic="http://schemas.openxmlformats.org/drawingml/2006/picture">
-            <wp:extent cx="5796000" cy="1959741"/>
+            <wp:extent cx="5796000" cy="1958759"/>
             <wp:docPr id="7" name="Picture 7"/>
             <wp:cNvGraphicFramePr>
               <a:graphicFrameLocks noChangeAspect="1"/>
@@ -15385,7 +15385,7 @@
                   <pic:spPr>
                     <a:xfrm>
                       <a:off x="0" y="0"/>
-                      <a:ext cx="5796000" cy="1959741"/>
+                      <a:ext cx="5796000" cy="1958759"/>
                     </a:xfrm>
                     <a:prstGeom prst="rect"/>
                   </pic:spPr>
@@ -15432,7 +15432,7 @@
       <w:r>
         <w:drawing>
           <wp:inline xmlns:a="http://schemas.openxmlformats.org/drawingml/2006/main" xmlns:pic="http://schemas.openxmlformats.org/drawingml/2006/picture">
-            <wp:extent cx="5796000" cy="1685155"/>
+            <wp:extent cx="5796000" cy="1712455"/>
             <wp:docPr id="8" name="Picture 8"/>
             <wp:cNvGraphicFramePr>
               <a:graphicFrameLocks noChangeAspect="1"/>
@@ -15453,7 +15453,7 @@
                   <pic:spPr>
                     <a:xfrm>
                       <a:off x="0" y="0"/>
-                      <a:ext cx="5796000" cy="1685155"/>
+                      <a:ext cx="5796000" cy="1712455"/>
                     </a:xfrm>
                     <a:prstGeom prst="rect"/>
                   </pic:spPr>
@@ -15482,7 +15482,7 @@
       <w:r>
         <w:drawing>
           <wp:inline xmlns:a="http://schemas.openxmlformats.org/drawingml/2006/main" xmlns:pic="http://schemas.openxmlformats.org/drawingml/2006/picture">
-            <wp:extent cx="5796000" cy="1930056"/>
+            <wp:extent cx="5796000" cy="1958345"/>
             <wp:docPr id="9" name="Picture 9"/>
             <wp:cNvGraphicFramePr>
               <a:graphicFrameLocks noChangeAspect="1"/>
@@ -15503,7 +15503,7 @@
                   <pic:spPr>
                     <a:xfrm>
                       <a:off x="0" y="0"/>
-                      <a:ext cx="5796000" cy="1930056"/>
+                      <a:ext cx="5796000" cy="1958345"/>
                     </a:xfrm>
                     <a:prstGeom prst="rect"/>
                   </pic:spPr>
@@ -18670,7 +18670,32 @@
     </w:p>
     <w:p>
       <w:r>
-        <w:t>对每条样本，按局部贡献绝对值选取关键项，同时保留其支持或反对的方向。表中列主要参考模态内最显著的局部词元及原序列索引；完整结果文件同时给出三模态关键证据、原文本字符区间及估计时间。表内的语音时间来自MMS强制对齐[8]，仅用于媒体回查；同位置视觉时间为粗略检索区间，不视为原视觉特征的精确帧时间。</w:t>
+        <w:t>对每条样本，按局部贡献绝对值选取关键项，保留原特征索引、有符号分数及原文字符区间。20条样本的原文、BERT编号与字符映射均与原始输入逐项核对，原视频通过文件摘要确认。沿用问题一的独立语音识别与局部声学交叉支持规则，对附件四重新定位。完整音轨先由Whisper识别，识别过程只输入音频；原文随后与识别结果进行唯一词序匹配，每段至少含两个不同的信息锚点。对候选段分别扩展0.5秒和1秒上下文，用MFA进行局部强制对齐。</w:t>
+      </w:r>
+    </w:p>
+    <w:p>
+      <w:r>
+        <w:t>词级候选以扩展0.5秒上下文的声学边界为基准，分别与扩展1秒上下文的结果、独立识别的结果比较，两组最大端点差异均须不超过0.2秒，同时满足原词顺序和区间相容性。内部词界支持不足而外边界一致时，从2—8词候选中选择词序与时间均不重叠、覆盖未确定词最多的短语范围；其余位置保留原文本与贡献，标记语音定位支持不足。标点和连接符保留各自读出，不分配邻词的语音时间。0.2秒为固定一致性门槛，不是实测定位误差。原MMS估计[8]仅保留作边界差异对照。</w:t>
+      </w:r>
+    </w:p>
+    <w:p>
+      <w:r>
+        <w:t>附件四共481个规范化原词，得到185个词级候选，另有44个短语覆盖123个词级未确定词。三模态共177个关键读出中，61项获得词级候选，43项获得短语回看范围，63项语音定位支持不足，10项为标点或符号。其中18条样本具有可回看的关键项，另2条保留原文和贡献索引。此处按读出项统计，同一原词可以被不同模态引用；覆盖率与模型一致性分别描述可回查程度和候选支持，定位准确率需要独立时间真值。</w:t>
+      </w:r>
+    </w:p>
+    <w:p>
+      <w:r>
+        <w:t>在61项具有旧时间的词级关键读出中，0项与旧估计的边界差异超过0.2秒。该比较仅涵盖取得词级交叉支持的部分；其余旧估计仍需区分内容支持与边界支持。模型一致性不能替代独立时间真值。</w:t>
+      </w:r>
+    </w:p>
+    <w:p>
+      <w:r>
+        <w:t>63项支持不足的关键读出中，14项未形成唯一精确的文字匹配，10项缺少足够的连续片段锚点，39项未通过局部声学边界检查。精确匹配会受专名、缩略语与识别差异影响；扩展上下文也可能带入候选段之外的语音，使局部强制对齐移动边界。因此，支持不足表示本组定位规则尚未给出充分依据，不能据此断言原词未发音或输入模态缺失。</w:t>
+      </w:r>
+    </w:p>
+    <w:p>
+      <w:r>
+        <w:t>对已定位关键项，从原视频实际帧时间戳中选取落在回看区间内、最接近区间中点的帧，记录帧序号、时间及图像摘要；重复帧合并保存。截图展示该时段的同步场景，图中人物与发声者的身份对应仍需单独验证。附件中的音视特征缺少原始采样时间，新定位用于媒体导航；模型贡献的归属继续由原特征索引确定。</w:t>
       </w:r>
     </w:p>
     <w:p>
@@ -18881,7 +18906,7 @@
                 <w:b w:val="0"/>
                 <w:sz w:val="21"/>
               </w:rPr>
-              <w:t>2.61—2.69</w:t>
+              <w:t>2.61—2.66（词级）</w:t>
             </w:r>
           </w:p>
         </w:tc>
@@ -18966,7 +18991,7 @@
                 <w:b w:val="0"/>
                 <w:sz w:val="21"/>
               </w:rPr>
-              <w:t>2.23—2.43</w:t>
+              <w:t>2.20—2.43（词级）</w:t>
             </w:r>
           </w:p>
         </w:tc>
@@ -19051,7 +19076,7 @@
                 <w:b w:val="0"/>
                 <w:sz w:val="21"/>
               </w:rPr>
-              <w:t>2.73—2.89</w:t>
+              <w:t>2.69—2.90（词级）</w:t>
             </w:r>
           </w:p>
         </w:tc>
@@ -19136,7 +19161,7 @@
                 <w:b w:val="0"/>
                 <w:sz w:val="21"/>
               </w:rPr>
-              <w:t>5.37—5.95</w:t>
+              <w:t>支持不足</w:t>
             </w:r>
           </w:p>
         </w:tc>
@@ -19221,7 +19246,7 @@
                 <w:b w:val="0"/>
                 <w:sz w:val="21"/>
               </w:rPr>
-              <w:t>未定位</w:t>
+              <w:t>标点/符号</w:t>
             </w:r>
           </w:p>
         </w:tc>
@@ -19306,7 +19331,7 @@
                 <w:b w:val="0"/>
                 <w:sz w:val="21"/>
               </w:rPr>
-              <w:t>6.82—7.14</w:t>
+              <w:t>6.71—7.33（短语）</w:t>
             </w:r>
           </w:p>
         </w:tc>
@@ -19391,7 +19416,7 @@
                 <w:b w:val="0"/>
                 <w:sz w:val="21"/>
               </w:rPr>
-              <w:t>5.96—7.02</w:t>
+              <w:t>支持不足</w:t>
             </w:r>
           </w:p>
         </w:tc>
@@ -19476,7 +19501,7 @@
                 <w:b w:val="0"/>
                 <w:sz w:val="21"/>
               </w:rPr>
-              <w:t>2.02—2.52</w:t>
+              <w:t>支持不足</w:t>
             </w:r>
           </w:p>
         </w:tc>
@@ -19561,7 +19586,7 @@
                 <w:b w:val="0"/>
                 <w:sz w:val="21"/>
               </w:rPr>
-              <w:t>3.72—3.82</w:t>
+              <w:t>支持不足</w:t>
             </w:r>
           </w:p>
         </w:tc>
@@ -19646,7 +19671,7 @@
                 <w:b w:val="0"/>
                 <w:sz w:val="21"/>
               </w:rPr>
-              <w:t>8.67—9.17</w:t>
+              <w:t>支持不足</w:t>
             </w:r>
           </w:p>
         </w:tc>
@@ -19731,7 +19756,7 @@
                 <w:b w:val="0"/>
                 <w:sz w:val="21"/>
               </w:rPr>
-              <w:t>0.88—1.38</w:t>
+              <w:t>0.87—3.34（短语）</w:t>
             </w:r>
           </w:p>
         </w:tc>
@@ -19816,7 +19841,7 @@
                 <w:b w:val="0"/>
                 <w:sz w:val="21"/>
               </w:rPr>
-              <w:t>12.03—12.29</w:t>
+              <w:t>支持不足</w:t>
             </w:r>
           </w:p>
         </w:tc>
@@ -19901,7 +19926,7 @@
                 <w:b w:val="0"/>
                 <w:sz w:val="21"/>
               </w:rPr>
-              <w:t>5.03—5.05</w:t>
+              <w:t>支持不足</w:t>
             </w:r>
           </w:p>
         </w:tc>
@@ -19986,7 +20011,7 @@
                 <w:b w:val="0"/>
                 <w:sz w:val="21"/>
               </w:rPr>
-              <w:t>2.14—2.48</w:t>
+              <w:t>支持不足</w:t>
             </w:r>
           </w:p>
         </w:tc>
@@ -20071,7 +20096,7 @@
                 <w:b w:val="0"/>
                 <w:sz w:val="21"/>
               </w:rPr>
-              <w:t>6.92—7.18</w:t>
+              <w:t>支持不足</w:t>
             </w:r>
           </w:p>
         </w:tc>
@@ -20156,7 +20181,7 @@
                 <w:b w:val="0"/>
                 <w:sz w:val="21"/>
               </w:rPr>
-              <w:t>0.79—1.21</w:t>
+              <w:t>0.76—1.60（短语）</w:t>
             </w:r>
           </w:p>
         </w:tc>
@@ -20241,7 +20266,7 @@
                 <w:b w:val="0"/>
                 <w:sz w:val="21"/>
               </w:rPr>
-              <w:t>6.80—6.94</w:t>
+              <w:t>3.04—6.90（短语）</w:t>
             </w:r>
           </w:p>
         </w:tc>
@@ -20326,7 +20351,7 @@
                 <w:b w:val="0"/>
                 <w:sz w:val="21"/>
               </w:rPr>
-              <w:t>6.33—6.89</w:t>
+              <w:t>支持不足</w:t>
             </w:r>
           </w:p>
         </w:tc>
@@ -20411,7 +20436,7 @@
                 <w:b w:val="0"/>
                 <w:sz w:val="21"/>
               </w:rPr>
-              <w:t>0.94—1.68</w:t>
+              <w:t>0.83—2.99（短语）</w:t>
             </w:r>
           </w:p>
         </w:tc>
@@ -20496,7 +20521,7 @@
                 <w:b w:val="0"/>
                 <w:sz w:val="21"/>
               </w:rPr>
-              <w:t>8.75—8.87</w:t>
+              <w:t>支持不足</w:t>
             </w:r>
           </w:p>
         </w:tc>
@@ -20505,6 +20530,16 @@
     <w:p>
       <w:r>
         <w:t>完整预测与解释以CSV汇总：一行对应一个样本，含类别、最终及原始强度、分类与回归净分数及比例、主要模态、三模态关键证据和可用状态。全部20条详细解释卡与该表使用同一批固定预测记录生成。</w:t>
+      </w:r>
+    </w:p>
+    <w:p>
+      <w:r>
+        <w:t>进一步将文本内容支持、特征可用性和媒体定位分别检查。附件四两套版本的原文与文本输入一致，视频逐条字节一致；13号在对齐版中视觉数组全零，未对齐版仍有17行非零视觉特征。本文按所选对齐版关闭其视觉贡献，该状态表示当前输入无有效视觉观测。</w:t>
+      </w:r>
+    </w:p>
+    <w:p>
+      <w:r>
+        <w:t>15号的完整音轨约7.314秒。Whisper与Wav2Vec2 CTC分别在不输入原文的情况下识别音轨，均主要识别出所给句子之前的内容，在末尾才衔接到当前句开头，提示配套媒体可能存在剪辑边界偏移。该样本保留基于给定特征的预测与贡献，媒体对应标为待确认，解释卡不赋予缺少支持的语音区间。两个识别模型的一致现象用于异常筛查，不作为人工真值或故意篡改的判断。</w:t>
       </w:r>
     </w:p>
     <w:p>
@@ -20951,6 +20986,100 @@
           </w:tcPr>
           <w:p>
             <w:pPr>
+              <w:keepNext/>
+              <w:spacing w:after="60" w:before="60" w:line="240" w:lineRule="auto"/>
+              <w:ind w:firstLine="0"/>
+              <w:jc w:val="left"/>
+            </w:pPr>
+            <w:r>
+              <w:rPr>
+                <w:b w:val="0"/>
+                <w:sz w:val="21"/>
+              </w:rPr>
+              <w:t>原文本</w:t>
+            </w:r>
+          </w:p>
+        </w:tc>
+        <w:tc>
+          <w:tcPr>
+            <w:tcW w:type="dxa" w:w="6973"/>
+            <w:vAlign w:val="center"/>
+          </w:tcPr>
+          <w:p>
+            <w:pPr>
+              <w:keepNext/>
+              <w:spacing w:after="60" w:before="60" w:line="240" w:lineRule="auto"/>
+              <w:ind w:firstLine="0"/>
+              <w:jc w:val="left"/>
+            </w:pPr>
+            <w:r>
+              <w:rPr>
+                <w:b w:val="0"/>
+                <w:sz w:val="21"/>
+              </w:rPr>
+              <w:t>We want to live by each other’s happiness - not by each other’s misery.</w:t>
+            </w:r>
+          </w:p>
+        </w:tc>
+      </w:tr>
+      <w:tr>
+        <w:trPr>
+          <w:cantSplit/>
+        </w:trPr>
+        <w:tc>
+          <w:tcPr>
+            <w:tcW w:type="dxa" w:w="2324"/>
+            <w:vAlign w:val="center"/>
+          </w:tcPr>
+          <w:p>
+            <w:pPr>
+              <w:keepNext/>
+              <w:spacing w:after="60" w:before="60" w:line="240" w:lineRule="auto"/>
+              <w:ind w:firstLine="0"/>
+              <w:jc w:val="left"/>
+            </w:pPr>
+            <w:r>
+              <w:rPr>
+                <w:b w:val="0"/>
+                <w:sz w:val="21"/>
+              </w:rPr>
+              <w:t>媒体对应状态</w:t>
+            </w:r>
+          </w:p>
+        </w:tc>
+        <w:tc>
+          <w:tcPr>
+            <w:tcW w:type="dxa" w:w="6973"/>
+            <w:vAlign w:val="center"/>
+          </w:tcPr>
+          <w:p>
+            <w:pPr>
+              <w:keepNext/>
+              <w:spacing w:after="60" w:before="60" w:line="240" w:lineRule="auto"/>
+              <w:ind w:firstLine="0"/>
+              <w:jc w:val="left"/>
+            </w:pPr>
+            <w:r>
+              <w:rPr>
+                <w:b w:val="0"/>
+                <w:sz w:val="21"/>
+              </w:rPr>
+              <w:t>未触发双模型低内容支持提示；候选时间按关键项分别标注</w:t>
+            </w:r>
+          </w:p>
+        </w:tc>
+      </w:tr>
+      <w:tr>
+        <w:trPr>
+          <w:cantSplit/>
+        </w:trPr>
+        <w:tc>
+          <w:tcPr>
+            <w:tcW w:type="dxa" w:w="2324"/>
+            <w:vAlign w:val="center"/>
+          </w:tcPr>
+          <w:p>
+            <w:pPr>
               <w:keepNext w:val="0"/>
               <w:spacing w:after="60" w:before="60" w:line="240" w:lineRule="auto"/>
               <w:ind w:firstLine="0"/>
@@ -20961,7 +21090,7 @@
                 <w:b w:val="0"/>
                 <w:sz w:val="21"/>
               </w:rPr>
-              <w:t>原文本</w:t>
+              <w:t>视觉特征可用性</w:t>
             </w:r>
           </w:p>
         </w:tc>
@@ -20982,7 +21111,7 @@
                 <w:b w:val="0"/>
                 <w:sz w:val="21"/>
               </w:rPr>
-              <w:t>We want to live by each other’s happiness - not by each other’s misery.</w:t>
+              <w:t>对齐版非零视觉行19；未对齐版非零视觉行50（分别按各自序列统计）</w:t>
             </w:r>
           </w:p>
         </w:tc>
@@ -20990,26 +21119,76 @@
     </w:tbl>
     <w:p>
       <w:r>
-        <w:t>T关键证据：位置[17]，s，字符[[62, 63]]，分数-0.1465；估计2.23—2.43s；</w:t>
+        <w:t>T关键证据：位置[17]，s，字符[[62, 63]]，分数-0.1465；词级候选 2.20—2.43s；同步画面2.300s；</w:t>
         <w:br/>
-        <w:t>位置[18]，misery，字符[[64, 70]]，分数-0.1352；估计2.47—2.75s；</w:t>
+        <w:t>位置[18]，misery，字符[[64, 70]]，分数-0.1352；语音定位支持不足（局部声学边界支持不足）；</w:t>
         <w:br/>
-        <w:t>位置[4]，live，字符[[11, 15]]，分数+0.1288；估计0.82—0.94s</w:t>
+        <w:t>位置[4]，live，字符[[11, 15]]，分数+0.1288；词级候选 0.78—0.94s；同步画面0.867s</w:t>
       </w:r>
     </w:p>
     <w:p>
       <w:r>
-        <w:t>A关键证据：位置[18]，misery，字符[[64, 70]]，分数-0.0120；估计2.47—2.75s</w:t>
+        <w:t>A关键证据：位置[18]，misery，字符[[64, 70]]，分数-0.0120；语音定位支持不足（局部声学边界支持不足）</w:t>
       </w:r>
     </w:p>
     <w:p>
       <w:r>
-        <w:t>V关键证据：位置[16]，’，字符[[61, 62]]，分数-0.0014；估计2.23—2.43s</w:t>
+        <w:t>V关键证据：位置[16]，’，字符[[61, 62]]，分数-0.0014；词级候选 2.20—2.43s；同步画面2.300s</w:t>
       </w:r>
     </w:p>
     <w:p>
       <w:r>
         <w:t>解读：分类主要参考文本，回归q主要参考视觉，两项任务的主要模态不同。原始强度为负而分类判为正，最终强度经一致性处理成为接近零的正值；这是当前双任务输出间的分歧，不应把最终微小正值写成强正向判断。文本中支持项与反对项同时存在，词面含义不能替代上下文化读出。</w:t>
+      </w:r>
+    </w:p>
+    <w:p>
+      <w:pPr>
+        <w:keepNext/>
+        <w:ind w:firstLine="0"/>
+        <w:jc w:val="center"/>
+      </w:pPr>
+      <w:r>
+        <w:drawing>
+          <wp:inline xmlns:a="http://schemas.openxmlformats.org/drawingml/2006/main" xmlns:pic="http://schemas.openxmlformats.org/drawingml/2006/picture">
+            <wp:extent cx="5796000" cy="4347000"/>
+            <wp:docPr id="10" name="Picture 10"/>
+            <wp:cNvGraphicFramePr>
+              <a:graphicFrameLocks noChangeAspect="1"/>
+            </wp:cNvGraphicFramePr>
+            <a:graphic>
+              <a:graphicData uri="http://schemas.openxmlformats.org/drawingml/2006/picture">
+                <pic:pic>
+                  <pic:nvPicPr>
+                    <pic:cNvPr id="0" name="02_00069.png"/>
+                    <pic:cNvPicPr/>
+                  </pic:nvPicPr>
+                  <pic:blipFill>
+                    <a:blip r:embed="rId19"/>
+                    <a:stretch>
+                      <a:fillRect/>
+                    </a:stretch>
+                  </pic:blipFill>
+                  <pic:spPr>
+                    <a:xfrm>
+                      <a:off x="0" y="0"/>
+                      <a:ext cx="5796000" cy="4347000"/>
+                    </a:xfrm>
+                    <a:prstGeom prst="rect"/>
+                  </pic:spPr>
+                </pic:pic>
+              </a:graphicData>
+            </a:graphic>
+          </wp:inline>
+        </w:drawing>
+      </w:r>
+    </w:p>
+    <w:p>
+      <w:pPr>
+        <w:pStyle w:val="Caption"/>
+        <w:keepNext w:val="0"/>
+      </w:pPr>
+      <w:r>
+        <w:t>图10　样本02同步场景，实际帧时间2.300秒。图像对应V关键位置[16]的回看范围；原特征贡献仍按序列位置解释。</w:t>
       </w:r>
     </w:p>
     <w:p>
@@ -21443,6 +21622,100 @@
           </w:tcPr>
           <w:p>
             <w:pPr>
+              <w:keepNext/>
+              <w:spacing w:after="60" w:before="60" w:line="240" w:lineRule="auto"/>
+              <w:ind w:firstLine="0"/>
+              <w:jc w:val="left"/>
+            </w:pPr>
+            <w:r>
+              <w:rPr>
+                <w:b w:val="0"/>
+                <w:sz w:val="21"/>
+              </w:rPr>
+              <w:t>原文本</w:t>
+            </w:r>
+          </w:p>
+        </w:tc>
+        <w:tc>
+          <w:tcPr>
+            <w:tcW w:type="dxa" w:w="6973"/>
+            <w:vAlign w:val="center"/>
+          </w:tcPr>
+          <w:p>
+            <w:pPr>
+              <w:keepNext/>
+              <w:spacing w:after="60" w:before="60" w:line="240" w:lineRule="auto"/>
+              <w:ind w:firstLine="0"/>
+              <w:jc w:val="left"/>
+            </w:pPr>
+            <w:r>
+              <w:rPr>
+                <w:b w:val="0"/>
+                <w:sz w:val="21"/>
+              </w:rPr>
+              <w:t>For example, I could take a set of data and from that data, I can find a relationship between any two of the given factors or more.</w:t>
+            </w:r>
+          </w:p>
+        </w:tc>
+      </w:tr>
+      <w:tr>
+        <w:trPr>
+          <w:cantSplit/>
+        </w:trPr>
+        <w:tc>
+          <w:tcPr>
+            <w:tcW w:type="dxa" w:w="2324"/>
+            <w:vAlign w:val="center"/>
+          </w:tcPr>
+          <w:p>
+            <w:pPr>
+              <w:keepNext/>
+              <w:spacing w:after="60" w:before="60" w:line="240" w:lineRule="auto"/>
+              <w:ind w:firstLine="0"/>
+              <w:jc w:val="left"/>
+            </w:pPr>
+            <w:r>
+              <w:rPr>
+                <w:b w:val="0"/>
+                <w:sz w:val="21"/>
+              </w:rPr>
+              <w:t>媒体对应状态</w:t>
+            </w:r>
+          </w:p>
+        </w:tc>
+        <w:tc>
+          <w:tcPr>
+            <w:tcW w:type="dxa" w:w="6973"/>
+            <w:vAlign w:val="center"/>
+          </w:tcPr>
+          <w:p>
+            <w:pPr>
+              <w:keepNext/>
+              <w:spacing w:after="60" w:before="60" w:line="240" w:lineRule="auto"/>
+              <w:ind w:firstLine="0"/>
+              <w:jc w:val="left"/>
+            </w:pPr>
+            <w:r>
+              <w:rPr>
+                <w:b w:val="0"/>
+                <w:sz w:val="21"/>
+              </w:rPr>
+              <w:t>未触发双模型低内容支持提示；候选时间按关键项分别标注</w:t>
+            </w:r>
+          </w:p>
+        </w:tc>
+      </w:tr>
+      <w:tr>
+        <w:trPr>
+          <w:cantSplit/>
+        </w:trPr>
+        <w:tc>
+          <w:tcPr>
+            <w:tcW w:type="dxa" w:w="2324"/>
+            <w:vAlign w:val="center"/>
+          </w:tcPr>
+          <w:p>
+            <w:pPr>
               <w:keepNext w:val="0"/>
               <w:spacing w:after="60" w:before="60" w:line="240" w:lineRule="auto"/>
               <w:ind w:firstLine="0"/>
@@ -21453,7 +21726,7 @@
                 <w:b w:val="0"/>
                 <w:sz w:val="21"/>
               </w:rPr>
-              <w:t>原文本</w:t>
+              <w:t>视觉特征可用性</w:t>
             </w:r>
           </w:p>
         </w:tc>
@@ -21474,7 +21747,7 @@
                 <w:b w:val="0"/>
                 <w:sz w:val="21"/>
               </w:rPr>
-              <w:t>For example, I could take a set of data and from that data, I can find a relationship between any two of the given factors or more.</w:t>
+              <w:t>对齐版非零视觉行0；未对齐版非零视觉行17（分别按各自序列统计）</w:t>
             </w:r>
           </w:p>
         </w:tc>
@@ -21482,26 +21755,76 @@
     </w:tbl>
     <w:p>
       <w:r>
-        <w:t>T关键证据：位置[19]，a，字符[[71, 72]]，分数+0.1115；估计5.03—5.05s；</w:t>
+        <w:t>T关键证据：位置[19]，a，字符[[71, 72]]，分数+0.1115；语音定位支持不足（局部声学边界支持不足）；</w:t>
         <w:br/>
-        <w:t>位置[21]，between，字符[[86, 93]]，分数+0.1050；估计5.75—6.09s；</w:t>
+        <w:t>位置[21]，between，字符[[86, 93]]，分数+0.1050；短语级回看 5.03—6.48s；同步画面5.767s；</w:t>
         <w:br/>
-        <w:t>位置[25]，the，字符[[105, 108]]，分数+0.0878；估计6.86—6.94s</w:t>
+        <w:t>位置[25]，the，字符[[105, 108]]，分数+0.0878；词级候选 6.86—6.92s；同步画面6.900s</w:t>
       </w:r>
     </w:p>
     <w:p>
       <w:r>
-        <w:t>A关键证据：位置[22]，any，字符[[94, 97]]，分数-0.0107；估计6.29—6.43s</w:t>
+        <w:t>A关键证据：位置[22]，any，字符[[94, 97]]，分数-0.0107；短语级回看 5.03—6.48s；同步画面5.767s</w:t>
       </w:r>
     </w:p>
     <w:p>
       <w:r>
-        <w:t>V关键证据：无有效视觉观测；不列视觉证据。</w:t>
+        <w:t>V关键证据：无有效视觉观测。</w:t>
       </w:r>
     </w:p>
     <w:p>
       <w:r>
         <w:t>解读：原视觉数组全零，视觉单项及关联交互关闭，视觉贡献为0。当前判断来自可观测的文本与语音，分类输出为中性。缺失是输入的观测事实，不能由这一案例推断若补充视觉就会改变类别。</w:t>
+      </w:r>
+    </w:p>
+    <w:p>
+      <w:pPr>
+        <w:keepNext/>
+        <w:ind w:firstLine="0"/>
+        <w:jc w:val="center"/>
+      </w:pPr>
+      <w:r>
+        <w:drawing>
+          <wp:inline xmlns:a="http://schemas.openxmlformats.org/drawingml/2006/main" xmlns:pic="http://schemas.openxmlformats.org/drawingml/2006/picture">
+            <wp:extent cx="5796000" cy="3260250"/>
+            <wp:docPr id="11" name="Picture 11"/>
+            <wp:cNvGraphicFramePr>
+              <a:graphicFrameLocks noChangeAspect="1"/>
+            </wp:cNvGraphicFramePr>
+            <a:graphic>
+              <a:graphicData uri="http://schemas.openxmlformats.org/drawingml/2006/picture">
+                <pic:pic>
+                  <pic:nvPicPr>
+                    <pic:cNvPr id="0" name="13_00173.png"/>
+                    <pic:cNvPicPr/>
+                  </pic:nvPicPr>
+                  <pic:blipFill>
+                    <a:blip r:embed="rId20"/>
+                    <a:stretch>
+                      <a:fillRect/>
+                    </a:stretch>
+                  </pic:blipFill>
+                  <pic:spPr>
+                    <a:xfrm>
+                      <a:off x="0" y="0"/>
+                      <a:ext cx="5796000" cy="3260250"/>
+                    </a:xfrm>
+                    <a:prstGeom prst="rect"/>
+                  </pic:spPr>
+                </pic:pic>
+              </a:graphicData>
+            </a:graphic>
+          </wp:inline>
+        </w:drawing>
+      </w:r>
+    </w:p>
+    <w:p>
+      <w:pPr>
+        <w:pStyle w:val="Caption"/>
+        <w:keepNext w:val="0"/>
+      </w:pPr>
+      <w:r>
+        <w:t>图11　样本13同步场景，实际帧时间5.767秒。图像对应T关键位置[21]的回看范围；原特征贡献仍按序列位置解释。</w:t>
       </w:r>
     </w:p>
     <w:p>
@@ -21935,6 +22258,100 @@
           </w:tcPr>
           <w:p>
             <w:pPr>
+              <w:keepNext/>
+              <w:spacing w:after="60" w:before="60" w:line="240" w:lineRule="auto"/>
+              <w:ind w:firstLine="0"/>
+              <w:jc w:val="left"/>
+            </w:pPr>
+            <w:r>
+              <w:rPr>
+                <w:b w:val="0"/>
+                <w:sz w:val="21"/>
+              </w:rPr>
+              <w:t>原文本</w:t>
+            </w:r>
+          </w:p>
+        </w:tc>
+        <w:tc>
+          <w:tcPr>
+            <w:tcW w:type="dxa" w:w="6973"/>
+            <w:vAlign w:val="center"/>
+          </w:tcPr>
+          <w:p>
+            <w:pPr>
+              <w:keepNext/>
+              <w:spacing w:after="60" w:before="60" w:line="240" w:lineRule="auto"/>
+              <w:ind w:firstLine="0"/>
+              <w:jc w:val="left"/>
+            </w:pPr>
+            <w:r>
+              <w:rPr>
+                <w:b w:val="0"/>
+                <w:sz w:val="21"/>
+              </w:rPr>
+              <w:t>He is the co-founder of Rossen and Vettese Limited and the former Executive Director of Uniform Final Examination (UFE) courses at Toronto's York University.</w:t>
+            </w:r>
+          </w:p>
+        </w:tc>
+      </w:tr>
+      <w:tr>
+        <w:trPr>
+          <w:cantSplit/>
+        </w:trPr>
+        <w:tc>
+          <w:tcPr>
+            <w:tcW w:type="dxa" w:w="2324"/>
+            <w:vAlign w:val="center"/>
+          </w:tcPr>
+          <w:p>
+            <w:pPr>
+              <w:keepNext/>
+              <w:spacing w:after="60" w:before="60" w:line="240" w:lineRule="auto"/>
+              <w:ind w:firstLine="0"/>
+              <w:jc w:val="left"/>
+            </w:pPr>
+            <w:r>
+              <w:rPr>
+                <w:b w:val="0"/>
+                <w:sz w:val="21"/>
+              </w:rPr>
+              <w:t>媒体对应状态</w:t>
+            </w:r>
+          </w:p>
+        </w:tc>
+        <w:tc>
+          <w:tcPr>
+            <w:tcW w:type="dxa" w:w="6973"/>
+            <w:vAlign w:val="center"/>
+          </w:tcPr>
+          <w:p>
+            <w:pPr>
+              <w:keepNext/>
+              <w:spacing w:after="60" w:before="60" w:line="240" w:lineRule="auto"/>
+              <w:ind w:firstLine="0"/>
+              <w:jc w:val="left"/>
+            </w:pPr>
+            <w:r>
+              <w:rPr>
+                <w:b w:val="0"/>
+                <w:sz w:val="21"/>
+              </w:rPr>
+              <w:t>未触发双模型低内容支持提示；候选时间按关键项分别标注</w:t>
+            </w:r>
+          </w:p>
+        </w:tc>
+      </w:tr>
+      <w:tr>
+        <w:trPr>
+          <w:cantSplit/>
+        </w:trPr>
+        <w:tc>
+          <w:tcPr>
+            <w:tcW w:type="dxa" w:w="2324"/>
+            <w:vAlign w:val="center"/>
+          </w:tcPr>
+          <w:p>
+            <w:pPr>
               <w:keepNext w:val="0"/>
               <w:spacing w:after="60" w:before="60" w:line="240" w:lineRule="auto"/>
               <w:ind w:firstLine="0"/>
@@ -21945,7 +22362,7 @@
                 <w:b w:val="0"/>
                 <w:sz w:val="21"/>
               </w:rPr>
-              <w:t>原文本</w:t>
+              <w:t>视觉特征可用性</w:t>
             </w:r>
           </w:p>
         </w:tc>
@@ -21966,7 +22383,7 @@
                 <w:b w:val="0"/>
                 <w:sz w:val="21"/>
               </w:rPr>
-              <w:t>He is the co-founder of Rossen and Vettese Limited and the former Executive Director of Uniform Final Examination (UFE) courses at Toronto's York University.</w:t>
+              <w:t>对齐版非零视觉行35；未对齐版非零视觉行153（分别按各自序列统计）</w:t>
             </w:r>
           </w:p>
         </w:tc>
@@ -21974,21 +22391,21 @@
     </w:tbl>
     <w:p>
       <w:r>
-        <w:t>T关键证据：位置[11]，Vet，字符[[35, 38]]，分数+0.1775；估计2.14—2.48s；</w:t>
+        <w:t>T关键证据：位置[11]，Vet，字符[[35, 38]]，分数+0.1775；语音定位支持不足（原文与识别结果未形成唯一精确匹配）；</w:t>
         <w:br/>
-        <w:t>位置[1]，He，字符[[0, 2]]，分数+0.1516；估计0.50—0.56s；</w:t>
+        <w:t>位置[1]，He，字符[[0, 2]]，分数+0.1516；语音定位支持不足（连续片段的信息锚点不足）；</w:t>
         <w:br/>
-        <w:t>位置[2]，is，字符[[3, 5]]，分数+0.1426；估计0.60—0.64s</w:t>
+        <w:t>位置[2]，is，字符[[3, 5]]，分数+0.1426；语音定位支持不足（连续片段的信息锚点不足）</w:t>
       </w:r>
     </w:p>
     <w:p>
       <w:r>
-        <w:t>A关键证据：位置[3]，the，字符[[6, 9]]，分数-0.0202；估计0.66—0.72s</w:t>
+        <w:t>A关键证据：位置[3]，the，字符[[6, 9]]，分数-0.0202；语音定位支持不足（连续片段的信息锚点不足）</w:t>
       </w:r>
     </w:p>
     <w:p>
       <w:r>
-        <w:t>V关键证据：位置[19]，Director，字符[[76, 84]]，分数-0.0350；估计4.26—4.66s</w:t>
+        <w:t>V关键证据：位置[19]，Director，字符[[76, 84]]，分数-0.0350；语音定位支持不足（局部声学边界支持不足）</w:t>
       </w:r>
     </w:p>
     <w:p>
@@ -22427,6 +22844,100 @@
           </w:tcPr>
           <w:p>
             <w:pPr>
+              <w:keepNext/>
+              <w:spacing w:after="60" w:before="60" w:line="240" w:lineRule="auto"/>
+              <w:ind w:firstLine="0"/>
+              <w:jc w:val="left"/>
+            </w:pPr>
+            <w:r>
+              <w:rPr>
+                <w:b w:val="0"/>
+                <w:sz w:val="21"/>
+              </w:rPr>
+              <w:t>原文本</w:t>
+            </w:r>
+          </w:p>
+        </w:tc>
+        <w:tc>
+          <w:tcPr>
+            <w:tcW w:type="dxa" w:w="6973"/>
+            <w:vAlign w:val="center"/>
+          </w:tcPr>
+          <w:p>
+            <w:pPr>
+              <w:keepNext/>
+              <w:spacing w:after="60" w:before="60" w:line="240" w:lineRule="auto"/>
+              <w:ind w:firstLine="0"/>
+              <w:jc w:val="left"/>
+            </w:pPr>
+            <w:r>
+              <w:rPr>
+                <w:b w:val="0"/>
+                <w:sz w:val="21"/>
+              </w:rPr>
+              <w:t>It's a terrible, this is a terrible movie</w:t>
+            </w:r>
+          </w:p>
+        </w:tc>
+      </w:tr>
+      <w:tr>
+        <w:trPr>
+          <w:cantSplit/>
+        </w:trPr>
+        <w:tc>
+          <w:tcPr>
+            <w:tcW w:type="dxa" w:w="2324"/>
+            <w:vAlign w:val="center"/>
+          </w:tcPr>
+          <w:p>
+            <w:pPr>
+              <w:keepNext/>
+              <w:spacing w:after="60" w:before="60" w:line="240" w:lineRule="auto"/>
+              <w:ind w:firstLine="0"/>
+              <w:jc w:val="left"/>
+            </w:pPr>
+            <w:r>
+              <w:rPr>
+                <w:b w:val="0"/>
+                <w:sz w:val="21"/>
+              </w:rPr>
+              <w:t>媒体对应状态</w:t>
+            </w:r>
+          </w:p>
+        </w:tc>
+        <w:tc>
+          <w:tcPr>
+            <w:tcW w:type="dxa" w:w="6973"/>
+            <w:vAlign w:val="center"/>
+          </w:tcPr>
+          <w:p>
+            <w:pPr>
+              <w:keepNext/>
+              <w:spacing w:after="60" w:before="60" w:line="240" w:lineRule="auto"/>
+              <w:ind w:firstLine="0"/>
+              <w:jc w:val="left"/>
+            </w:pPr>
+            <w:r>
+              <w:rPr>
+                <w:b w:val="0"/>
+                <w:sz w:val="21"/>
+              </w:rPr>
+              <w:t>未触发双模型低内容支持提示；候选时间按关键项分别标注</w:t>
+            </w:r>
+          </w:p>
+        </w:tc>
+      </w:tr>
+      <w:tr>
+        <w:trPr>
+          <w:cantSplit/>
+        </w:trPr>
+        <w:tc>
+          <w:tcPr>
+            <w:tcW w:type="dxa" w:w="2324"/>
+            <w:vAlign w:val="center"/>
+          </w:tcPr>
+          <w:p>
+            <w:pPr>
               <w:keepNext w:val="0"/>
               <w:spacing w:after="60" w:before="60" w:line="240" w:lineRule="auto"/>
               <w:ind w:firstLine="0"/>
@@ -22437,7 +22948,7 @@
                 <w:b w:val="0"/>
                 <w:sz w:val="21"/>
               </w:rPr>
-              <w:t>原文本</w:t>
+              <w:t>视觉特征可用性</w:t>
             </w:r>
           </w:p>
         </w:tc>
@@ -22458,7 +22969,7 @@
                 <w:b w:val="0"/>
                 <w:sz w:val="21"/>
               </w:rPr>
-              <w:t>It's a terrible, this is a terrible movie</w:t>
+              <w:t>对齐版非零视觉行11；未对齐版非零视觉行40（分别按各自序列统计）</w:t>
             </w:r>
           </w:p>
         </w:tc>
@@ -22466,26 +22977,76 @@
     </w:tbl>
     <w:p>
       <w:r>
-        <w:t>T关键证据：位置[5]，terrible，字符[[7, 15]]，分数+0.9867；估计0.79—1.21s；</w:t>
+        <w:t>T关键证据：位置[5]，terrible，字符[[7, 15]]，分数+0.9867；短语级回看 0.76—1.60s；同步画面1.167s；</w:t>
         <w:br/>
-        <w:t>位置[3]，s，字符[[3, 4]]，分数+0.9829；估计0.08—0.58s；</w:t>
+        <w:t>位置[3]，s，字符[[3, 4]]，分数+0.9829；语音定位支持不足（连续片段的信息锚点不足）；</w:t>
         <w:br/>
-        <w:t>位置[10]，terrible，字符[[27, 35]]，分数+0.9827；估计1.79—2.18s</w:t>
+        <w:t>位置[10]，terrible，字符[[27, 35]]，分数+0.9827；词级候选 1.72—2.14s；同步画面1.933s</w:t>
       </w:r>
     </w:p>
     <w:p>
       <w:r>
-        <w:t>A关键证据：位置[7]，this，字符[[17, 21]]，分数+0.0080；估计1.51—1.61s</w:t>
+        <w:t>A关键证据：位置[7]，this，字符[[17, 21]]，分数+0.0080；短语级回看 0.76—1.60s；同步画面1.167s</w:t>
       </w:r>
     </w:p>
     <w:p>
       <w:r>
-        <w:t>V关键证据：位置[7]，this，字符[[17, 21]]，分数-0.0160；估计1.51—1.61s</w:t>
+        <w:t>V关键证据：位置[7]，this，字符[[17, 21]]，分数-0.0160；短语级回看 0.76—1.60s；同步画面1.167s</w:t>
       </w:r>
     </w:p>
     <w:p>
       <w:r>
         <w:t>解读：预测为负向，最终强度为−2.6363。文本净贡献占99.04%，原句中两处terrible可在局部图中回查；这些读出已包含全句上下文，不能解释为词自身独立产生的因果效应。</w:t>
+      </w:r>
+    </w:p>
+    <w:p>
+      <w:pPr>
+        <w:keepNext/>
+        <w:ind w:firstLine="0"/>
+        <w:jc w:val="center"/>
+      </w:pPr>
+      <w:r>
+        <w:drawing>
+          <wp:inline xmlns:a="http://schemas.openxmlformats.org/drawingml/2006/main" xmlns:pic="http://schemas.openxmlformats.org/drawingml/2006/picture">
+            <wp:extent cx="5796000" cy="4347000"/>
+            <wp:docPr id="12" name="Picture 12"/>
+            <wp:cNvGraphicFramePr>
+              <a:graphicFrameLocks noChangeAspect="1"/>
+            </wp:cNvGraphicFramePr>
+            <a:graphic>
+              <a:graphicData uri="http://schemas.openxmlformats.org/drawingml/2006/picture">
+                <pic:pic>
+                  <pic:nvPicPr>
+                    <pic:cNvPr id="0" name="16_00035.png"/>
+                    <pic:cNvPicPr/>
+                  </pic:nvPicPr>
+                  <pic:blipFill>
+                    <a:blip r:embed="rId21"/>
+                    <a:stretch>
+                      <a:fillRect/>
+                    </a:stretch>
+                  </pic:blipFill>
+                  <pic:spPr>
+                    <a:xfrm>
+                      <a:off x="0" y="0"/>
+                      <a:ext cx="5796000" cy="4347000"/>
+                    </a:xfrm>
+                    <a:prstGeom prst="rect"/>
+                  </pic:spPr>
+                </pic:pic>
+              </a:graphicData>
+            </a:graphic>
+          </wp:inline>
+        </w:drawing>
+      </w:r>
+    </w:p>
+    <w:p>
+      <w:pPr>
+        <w:pStyle w:val="Caption"/>
+        <w:keepNext w:val="0"/>
+      </w:pPr>
+      <w:r>
+        <w:t>图12　样本16同步场景，实际帧时间1.167秒。图像对应V关键位置[7]的回看范围；原特征贡献仍按序列位置解释。</w:t>
       </w:r>
     </w:p>
     <w:p>

</xml_diff>